<commit_message>
A rectangular seal above the box, its line beneath, on the page and the card; Share always leaves a way through
The seal is now a rectangular rubber stamp set above the festive box, with the
tag's line right under it, and nothing overlapping. The shareable card carries
the same seal and line, above the box.

Share my result works where the browser allows it and shows its hand where it
does not: on a phone the native share sheet, on a desktop WhatsApp Web in a new
tab; when either is refused (a preview frame, a strict browser), the card and
its links are flashed and scrolled into view. Under the card sit Save image,
WhatsApp and Copy message, the last confirmed with a "Message copied" toast.

The copy deck lists the new strings.

Co-Authored-By: Claude Fable 5.1 <noreply@anthropic.com>
Claude-Session: https://claude.ai/code/session_012sQsmGULLFzjfa9SrQhDjc
</commit_message>
<xml_diff>
--- a/content/The-Sweet-Pick-Copy.docx
+++ b/content/The-Sweet-Pick-Copy.docx
@@ -8240,6 +8240,66 @@
                 <w:sz w:val="19"/>
                 <w:szCs w:val="19"/>
               </w:rPr>
+              <w:t xml:space="preserve">Line under the seal</w:t>
+            </w:r>
+          </w:p>
+        </w:tc>
+        <w:tc>
+          <w:tcPr>
+            <w:tcW w:type="dxa" w:w="6526"/>
+            <w:tcBorders>
+              <w:top w:val="single" w:color="F0C9A8" w:sz="4"/>
+              <w:left w:val="single" w:color="F0C9A8" w:sz="4"/>
+              <w:bottom w:val="single" w:color="F0C9A8" w:sz="4"/>
+              <w:right w:val="single" w:color="F0C9A8" w:sz="4"/>
+            </w:tcBorders>
+            <w:tcMar>
+              <w:top w:type="dxa" w:w="80"/>
+              <w:left w:type="dxa" w:w="110"/>
+              <w:bottom w:type="dxa" w:w="80"/>
+              <w:right w:type="dxa" w:w="110"/>
+            </w:tcMar>
+          </w:tcPr>
+          <w:p>
+            <w:r>
+              <w:rPr>
+                <w:b w:val="false"/>
+                <w:bCs w:val="false"/>
+                <w:color w:val="222222"/>
+                <w:sz w:val="19"/>
+                <w:szCs w:val="19"/>
+              </w:rPr>
+              <w:t xml:space="preserve">the tag’s line, see Result tags</w:t>
+            </w:r>
+          </w:p>
+        </w:tc>
+      </w:tr>
+      <w:tr>
+        <w:tc>
+          <w:tcPr>
+            <w:tcW w:type="dxa" w:w="2500"/>
+            <w:tcBorders>
+              <w:top w:val="single" w:color="F0C9A8" w:sz="4"/>
+              <w:left w:val="single" w:color="F0C9A8" w:sz="4"/>
+              <w:bottom w:val="single" w:color="F0C9A8" w:sz="4"/>
+              <w:right w:val="single" w:color="F0C9A8" w:sz="4"/>
+            </w:tcBorders>
+            <w:tcMar>
+              <w:top w:type="dxa" w:w="80"/>
+              <w:left w:type="dxa" w:w="110"/>
+              <w:bottom w:type="dxa" w:w="80"/>
+              <w:right w:type="dxa" w:w="110"/>
+            </w:tcMar>
+          </w:tcPr>
+          <w:p>
+            <w:r>
+              <w:rPr>
+                <w:b/>
+                <w:bCs/>
+                <w:color w:val="222222"/>
+                <w:sz w:val="19"/>
+                <w:szCs w:val="19"/>
+              </w:rPr>
               <w:t xml:space="preserve">Box caption</w:t>
             </w:r>
           </w:p>
@@ -8480,36 +8540,96 @@
                 <w:sz w:val="19"/>
                 <w:szCs w:val="19"/>
               </w:rPr>
-              <w:t xml:space="preserve">Save link (under the card)</w:t>
-            </w:r>
-          </w:p>
-        </w:tc>
-        <w:tc>
-          <w:tcPr>
-            <w:tcW w:type="dxa" w:w="6526"/>
-            <w:tcBorders>
-              <w:top w:val="single" w:color="F0C9A8" w:sz="4"/>
-              <w:left w:val="single" w:color="F0C9A8" w:sz="4"/>
-              <w:bottom w:val="single" w:color="F0C9A8" w:sz="4"/>
-              <w:right w:val="single" w:color="F0C9A8" w:sz="4"/>
-            </w:tcBorders>
-            <w:tcMar>
-              <w:top w:type="dxa" w:w="80"/>
-              <w:left w:type="dxa" w:w="110"/>
-              <w:bottom w:type="dxa" w:w="80"/>
-              <w:right w:type="dxa" w:w="110"/>
-            </w:tcMar>
-          </w:tcPr>
-          <w:p>
-            <w:r>
-              <w:rPr>
-                <w:b w:val="false"/>
-                <w:bCs w:val="false"/>
-                <w:color w:val="222222"/>
-                <w:sz w:val="19"/>
-                <w:szCs w:val="19"/>
-              </w:rPr>
-              <w:t xml:space="preserve">Save image</w:t>
+              <w:t xml:space="preserve">Links under the card</w:t>
+            </w:r>
+          </w:p>
+        </w:tc>
+        <w:tc>
+          <w:tcPr>
+            <w:tcW w:type="dxa" w:w="6526"/>
+            <w:tcBorders>
+              <w:top w:val="single" w:color="F0C9A8" w:sz="4"/>
+              <w:left w:val="single" w:color="F0C9A8" w:sz="4"/>
+              <w:bottom w:val="single" w:color="F0C9A8" w:sz="4"/>
+              <w:right w:val="single" w:color="F0C9A8" w:sz="4"/>
+            </w:tcBorders>
+            <w:tcMar>
+              <w:top w:type="dxa" w:w="80"/>
+              <w:left w:type="dxa" w:w="110"/>
+              <w:bottom w:type="dxa" w:w="80"/>
+              <w:right w:type="dxa" w:w="110"/>
+            </w:tcMar>
+          </w:tcPr>
+          <w:p>
+            <w:r>
+              <w:rPr>
+                <w:b w:val="false"/>
+                <w:bCs w:val="false"/>
+                <w:color w:val="222222"/>
+                <w:sz w:val="19"/>
+                <w:szCs w:val="19"/>
+              </w:rPr>
+              <w:t xml:space="preserve">Save image · WhatsApp · Copy message</w:t>
+            </w:r>
+          </w:p>
+        </w:tc>
+      </w:tr>
+      <w:tr>
+        <w:tc>
+          <w:tcPr>
+            <w:tcW w:type="dxa" w:w="2500"/>
+            <w:tcBorders>
+              <w:top w:val="single" w:color="F0C9A8" w:sz="4"/>
+              <w:left w:val="single" w:color="F0C9A8" w:sz="4"/>
+              <w:bottom w:val="single" w:color="F0C9A8" w:sz="4"/>
+              <w:right w:val="single" w:color="F0C9A8" w:sz="4"/>
+            </w:tcBorders>
+            <w:tcMar>
+              <w:top w:type="dxa" w:w="80"/>
+              <w:left w:type="dxa" w:w="110"/>
+              <w:bottom w:type="dxa" w:w="80"/>
+              <w:right w:type="dxa" w:w="110"/>
+            </w:tcMar>
+          </w:tcPr>
+          <w:p>
+            <w:r>
+              <w:rPr>
+                <w:b/>
+                <w:bCs/>
+                <w:color w:val="222222"/>
+                <w:sz w:val="19"/>
+                <w:szCs w:val="19"/>
+              </w:rPr>
+              <w:t xml:space="preserve">Toast after Copy message</w:t>
+            </w:r>
+          </w:p>
+        </w:tc>
+        <w:tc>
+          <w:tcPr>
+            <w:tcW w:type="dxa" w:w="6526"/>
+            <w:tcBorders>
+              <w:top w:val="single" w:color="F0C9A8" w:sz="4"/>
+              <w:left w:val="single" w:color="F0C9A8" w:sz="4"/>
+              <w:bottom w:val="single" w:color="F0C9A8" w:sz="4"/>
+              <w:right w:val="single" w:color="F0C9A8" w:sz="4"/>
+            </w:tcBorders>
+            <w:tcMar>
+              <w:top w:type="dxa" w:w="80"/>
+              <w:left w:type="dxa" w:w="110"/>
+              <w:bottom w:type="dxa" w:w="80"/>
+              <w:right w:type="dxa" w:w="110"/>
+            </w:tcMar>
+          </w:tcPr>
+          <w:p>
+            <w:r>
+              <w:rPr>
+                <w:b w:val="false"/>
+                <w:bCs w:val="false"/>
+                <w:color w:val="222222"/>
+                <w:sz w:val="19"/>
+                <w:szCs w:val="19"/>
+              </w:rPr>
+              <w:t xml:space="preserve">Message copied</w:t>
             </w:r>
           </w:p>
         </w:tc>
@@ -9446,96 +9566,96 @@
                 <w:sz w:val="19"/>
                 <w:szCs w:val="19"/>
               </w:rPr>
-              <w:t xml:space="preserve">Kicker</w:t>
-            </w:r>
-          </w:p>
-        </w:tc>
-        <w:tc>
-          <w:tcPr>
-            <w:tcW w:type="dxa" w:w="6526"/>
-            <w:tcBorders>
-              <w:top w:val="single" w:color="F0C9A8" w:sz="4"/>
-              <w:left w:val="single" w:color="F0C9A8" w:sz="4"/>
-              <w:bottom w:val="single" w:color="F0C9A8" w:sz="4"/>
-              <w:right w:val="single" w:color="F0C9A8" w:sz="4"/>
-            </w:tcBorders>
-            <w:tcMar>
-              <w:top w:type="dxa" w:w="80"/>
-              <w:left w:type="dxa" w:w="110"/>
-              <w:bottom w:type="dxa" w:w="80"/>
-              <w:right w:type="dxa" w:w="110"/>
-            </w:tcMar>
-          </w:tcPr>
-          <w:p>
-            <w:r>
-              <w:rPr>
-                <w:b w:val="false"/>
-                <w:bCs w:val="false"/>
-                <w:color w:val="222222"/>
-                <w:sz w:val="19"/>
-                <w:szCs w:val="19"/>
-              </w:rPr>
-              <w:t xml:space="preserve">THE SWEET PICK</w:t>
-            </w:r>
-          </w:p>
-        </w:tc>
-      </w:tr>
-      <w:tr>
-        <w:tc>
-          <w:tcPr>
-            <w:tcW w:type="dxa" w:w="2500"/>
-            <w:tcBorders>
-              <w:top w:val="single" w:color="F0C9A8" w:sz="4"/>
-              <w:left w:val="single" w:color="F0C9A8" w:sz="4"/>
-              <w:bottom w:val="single" w:color="F0C9A8" w:sz="4"/>
-              <w:right w:val="single" w:color="F0C9A8" w:sz="4"/>
-            </w:tcBorders>
-            <w:tcMar>
-              <w:top w:type="dxa" w:w="80"/>
-              <w:left w:type="dxa" w:w="110"/>
-              <w:bottom w:type="dxa" w:w="80"/>
-              <w:right w:type="dxa" w:w="110"/>
-            </w:tcMar>
-          </w:tcPr>
-          <w:p>
-            <w:r>
-              <w:rPr>
-                <w:b/>
-                <w:bCs/>
-                <w:color w:val="222222"/>
-                <w:sz w:val="19"/>
-                <w:szCs w:val="19"/>
-              </w:rPr>
-              <w:t xml:space="preserve">Title</w:t>
-            </w:r>
-          </w:p>
-        </w:tc>
-        <w:tc>
-          <w:tcPr>
-            <w:tcW w:type="dxa" w:w="6526"/>
-            <w:tcBorders>
-              <w:top w:val="single" w:color="F0C9A8" w:sz="4"/>
-              <w:left w:val="single" w:color="F0C9A8" w:sz="4"/>
-              <w:bottom w:val="single" w:color="F0C9A8" w:sz="4"/>
-              <w:right w:val="single" w:color="F0C9A8" w:sz="4"/>
-            </w:tcBorders>
-            <w:tcMar>
-              <w:top w:type="dxa" w:w="80"/>
-              <w:left w:type="dxa" w:w="110"/>
-              <w:bottom w:type="dxa" w:w="80"/>
-              <w:right w:type="dxa" w:w="110"/>
-            </w:tcMar>
-          </w:tcPr>
-          <w:p>
-            <w:r>
-              <w:rPr>
-                <w:b w:val="false"/>
-                <w:bCs w:val="false"/>
-                <w:color w:val="222222"/>
-                <w:sz w:val="19"/>
-                <w:szCs w:val="19"/>
-              </w:rPr>
-              <w:t xml:space="preserve">{Tag}</w:t>
+              <w:t xml:space="preserve">Seal</w:t>
+            </w:r>
+          </w:p>
+        </w:tc>
+        <w:tc>
+          <w:tcPr>
+            <w:tcW w:type="dxa" w:w="6526"/>
+            <w:tcBorders>
+              <w:top w:val="single" w:color="F0C9A8" w:sz="4"/>
+              <w:left w:val="single" w:color="F0C9A8" w:sz="4"/>
+              <w:bottom w:val="single" w:color="F0C9A8" w:sz="4"/>
+              <w:right w:val="single" w:color="F0C9A8" w:sz="4"/>
+            </w:tcBorders>
+            <w:tcMar>
+              <w:top w:type="dxa" w:w="80"/>
+              <w:left w:type="dxa" w:w="110"/>
+              <w:bottom w:type="dxa" w:w="80"/>
+              <w:right w:type="dxa" w:w="110"/>
+            </w:tcMar>
+          </w:tcPr>
+          <w:p>
+            <w:r>
+              <w:rPr>
+                <w:b w:val="false"/>
+                <w:bCs w:val="false"/>
+                <w:color w:val="222222"/>
+                <w:sz w:val="19"/>
+                <w:szCs w:val="19"/>
+              </w:rPr>
+              <w:t xml:space="preserve">THE SWEET PICK · {Tag} · THE ORANGE BOOK · VOL. 65</w:t>
+            </w:r>
+          </w:p>
+        </w:tc>
+      </w:tr>
+      <w:tr>
+        <w:tc>
+          <w:tcPr>
+            <w:tcW w:type="dxa" w:w="2500"/>
+            <w:tcBorders>
+              <w:top w:val="single" w:color="F0C9A8" w:sz="4"/>
+              <w:left w:val="single" w:color="F0C9A8" w:sz="4"/>
+              <w:bottom w:val="single" w:color="F0C9A8" w:sz="4"/>
+              <w:right w:val="single" w:color="F0C9A8" w:sz="4"/>
+            </w:tcBorders>
+            <w:tcMar>
+              <w:top w:type="dxa" w:w="80"/>
+              <w:left w:type="dxa" w:w="110"/>
+              <w:bottom w:type="dxa" w:w="80"/>
+              <w:right w:type="dxa" w:w="110"/>
+            </w:tcMar>
+          </w:tcPr>
+          <w:p>
+            <w:r>
+              <w:rPr>
+                <w:b/>
+                <w:bCs/>
+                <w:color w:val="222222"/>
+                <w:sz w:val="19"/>
+                <w:szCs w:val="19"/>
+              </w:rPr>
+              <w:t xml:space="preserve">Under the seal</w:t>
+            </w:r>
+          </w:p>
+        </w:tc>
+        <w:tc>
+          <w:tcPr>
+            <w:tcW w:type="dxa" w:w="6526"/>
+            <w:tcBorders>
+              <w:top w:val="single" w:color="F0C9A8" w:sz="4"/>
+              <w:left w:val="single" w:color="F0C9A8" w:sz="4"/>
+              <w:bottom w:val="single" w:color="F0C9A8" w:sz="4"/>
+              <w:right w:val="single" w:color="F0C9A8" w:sz="4"/>
+            </w:tcBorders>
+            <w:tcMar>
+              <w:top w:type="dxa" w:w="80"/>
+              <w:left w:type="dxa" w:w="110"/>
+              <w:bottom w:type="dxa" w:w="80"/>
+              <w:right w:type="dxa" w:w="110"/>
+            </w:tcMar>
+          </w:tcPr>
+          <w:p>
+            <w:r>
+              <w:rPr>
+                <w:b w:val="false"/>
+                <w:bCs w:val="false"/>
+                <w:color w:val="222222"/>
+                <w:sz w:val="19"/>
+                <w:szCs w:val="19"/>
+              </w:rPr>
+              <w:t xml:space="preserve">the tag’s line</w:t>
             </w:r>
           </w:p>
         </w:tc>

</xml_diff>

<commit_message>
A minimalist medallion, and the share panel back to two buttons
The seal is redrawn plain and modern: a cream disc with one gold rule and a
hairline, small tracked caps top and bottom, the tag set clean in navy capitals
(gold for a perfect run), a slight tilt on the lid. The card carries the same.

Under the card there is only Save image again; Share my result calls the
device's share sheet with the card attached, and when the sheet is refused the
card and Save image are brought into view. The copy deck follows.

Co-Authored-By: Claude Fable 5.1 <noreply@anthropic.com>
Claude-Session: https://claude.ai/code/session_012sQsmGULLFzjfa9SrQhDjc
</commit_message>
<xml_diff>
--- a/content/The-Sweet-Pick-Copy.docx
+++ b/content/The-Sweet-Pick-Copy.docx
@@ -8540,96 +8540,36 @@
                 <w:sz w:val="19"/>
                 <w:szCs w:val="19"/>
               </w:rPr>
-              <w:t xml:space="preserve">Links under the card</w:t>
-            </w:r>
-          </w:p>
-        </w:tc>
-        <w:tc>
-          <w:tcPr>
-            <w:tcW w:type="dxa" w:w="6526"/>
-            <w:tcBorders>
-              <w:top w:val="single" w:color="F0C9A8" w:sz="4"/>
-              <w:left w:val="single" w:color="F0C9A8" w:sz="4"/>
-              <w:bottom w:val="single" w:color="F0C9A8" w:sz="4"/>
-              <w:right w:val="single" w:color="F0C9A8" w:sz="4"/>
-            </w:tcBorders>
-            <w:tcMar>
-              <w:top w:type="dxa" w:w="80"/>
-              <w:left w:type="dxa" w:w="110"/>
-              <w:bottom w:type="dxa" w:w="80"/>
-              <w:right w:type="dxa" w:w="110"/>
-            </w:tcMar>
-          </w:tcPr>
-          <w:p>
-            <w:r>
-              <w:rPr>
-                <w:b w:val="false"/>
-                <w:bCs w:val="false"/>
-                <w:color w:val="222222"/>
-                <w:sz w:val="19"/>
-                <w:szCs w:val="19"/>
-              </w:rPr>
-              <w:t xml:space="preserve">Save image · WhatsApp · Copy message</w:t>
-            </w:r>
-          </w:p>
-        </w:tc>
-      </w:tr>
-      <w:tr>
-        <w:tc>
-          <w:tcPr>
-            <w:tcW w:type="dxa" w:w="2500"/>
-            <w:tcBorders>
-              <w:top w:val="single" w:color="F0C9A8" w:sz="4"/>
-              <w:left w:val="single" w:color="F0C9A8" w:sz="4"/>
-              <w:bottom w:val="single" w:color="F0C9A8" w:sz="4"/>
-              <w:right w:val="single" w:color="F0C9A8" w:sz="4"/>
-            </w:tcBorders>
-            <w:tcMar>
-              <w:top w:type="dxa" w:w="80"/>
-              <w:left w:type="dxa" w:w="110"/>
-              <w:bottom w:type="dxa" w:w="80"/>
-              <w:right w:type="dxa" w:w="110"/>
-            </w:tcMar>
-          </w:tcPr>
-          <w:p>
-            <w:r>
-              <w:rPr>
-                <w:b/>
-                <w:bCs/>
-                <w:color w:val="222222"/>
-                <w:sz w:val="19"/>
-                <w:szCs w:val="19"/>
-              </w:rPr>
-              <w:t xml:space="preserve">Toast after Copy message</w:t>
-            </w:r>
-          </w:p>
-        </w:tc>
-        <w:tc>
-          <w:tcPr>
-            <w:tcW w:type="dxa" w:w="6526"/>
-            <w:tcBorders>
-              <w:top w:val="single" w:color="F0C9A8" w:sz="4"/>
-              <w:left w:val="single" w:color="F0C9A8" w:sz="4"/>
-              <w:bottom w:val="single" w:color="F0C9A8" w:sz="4"/>
-              <w:right w:val="single" w:color="F0C9A8" w:sz="4"/>
-            </w:tcBorders>
-            <w:tcMar>
-              <w:top w:type="dxa" w:w="80"/>
-              <w:left w:type="dxa" w:w="110"/>
-              <w:bottom w:type="dxa" w:w="80"/>
-              <w:right w:type="dxa" w:w="110"/>
-            </w:tcMar>
-          </w:tcPr>
-          <w:p>
-            <w:r>
-              <w:rPr>
-                <w:b w:val="false"/>
-                <w:bCs w:val="false"/>
-                <w:color w:val="222222"/>
-                <w:sz w:val="19"/>
-                <w:szCs w:val="19"/>
-              </w:rPr>
-              <w:t xml:space="preserve">Message copied</w:t>
+              <w:t xml:space="preserve">Save link (under the card)</w:t>
+            </w:r>
+          </w:p>
+        </w:tc>
+        <w:tc>
+          <w:tcPr>
+            <w:tcW w:type="dxa" w:w="6526"/>
+            <w:tcBorders>
+              <w:top w:val="single" w:color="F0C9A8" w:sz="4"/>
+              <w:left w:val="single" w:color="F0C9A8" w:sz="4"/>
+              <w:bottom w:val="single" w:color="F0C9A8" w:sz="4"/>
+              <w:right w:val="single" w:color="F0C9A8" w:sz="4"/>
+            </w:tcBorders>
+            <w:tcMar>
+              <w:top w:type="dxa" w:w="80"/>
+              <w:left w:type="dxa" w:w="110"/>
+              <w:bottom w:type="dxa" w:w="80"/>
+              <w:right w:type="dxa" w:w="110"/>
+            </w:tcMar>
+          </w:tcPr>
+          <w:p>
+            <w:r>
+              <w:rPr>
+                <w:b w:val="false"/>
+                <w:bCs w:val="false"/>
+                <w:color w:val="222222"/>
+                <w:sz w:val="19"/>
+                <w:szCs w:val="19"/>
+              </w:rPr>
+              <w:t xml:space="preserve">Save image</w:t>
             </w:r>
           </w:p>
         </w:tc>

</xml_diff>

<commit_message>
Sweet Spotter for three or four picks, and a plainer Sweet Tooth line
The middle tag is now Sweet Spotter, its line unchanged: "You saw most of the
tricks coming." The Sweet Tooth line reads "The festive offers got the better
of you this time. They get most of us." The card folds a long line under the
box into two and moves the count down to make room. The copy deck follows.

Co-Authored-By: Claude Fable 5.1 <noreply@anthropic.com>
Claude-Session: https://claude.ai/code/session_012sQsmGULLFzjfa9SrQhDjc
</commit_message>
<xml_diff>
--- a/content/The-Sweet-Pick-Copy.docx
+++ b/content/The-Sweet-Pick-Copy.docx
@@ -9203,7 +9203,7 @@
                 <w:sz w:val="19"/>
                 <w:szCs w:val="19"/>
               </w:rPr>
-              <w:t xml:space="preserve">Sharp Shopper</w:t>
+              <w:t xml:space="preserve">Sweet Spotter</w:t>
             </w:r>
           </w:p>
         </w:tc>
@@ -9321,7 +9321,7 @@
                 <w:sz w:val="19"/>
                 <w:szCs w:val="19"/>
               </w:rPr>
-              <w:t xml:space="preserve">The season got you a little. It gets everyone.</w:t>
+              <w:t xml:space="preserve">The festive offers got the better of you this time. They get most of us.</w:t>
             </w:r>
           </w:p>
         </w:tc>

</xml_diff>

<commit_message>
The result card carries The Orange Book, and drops the hook line
"Can you spot the festive tricks?" goes from the card, where it read as a
question no one could answer from an image; it still travels in the share
message, where it can be read alongside the link.

In its place the publication signs the card: THE over ORANGE BOOK in the
cover's own setting, with "Vol. 65 · ICICI Bank" beneath it. The box and the
seal move up to leave the wordmark its room, and the tag's line and the count
follow them.

Co-Authored-By: Claude Opus 5 <noreply@anthropic.com>
Claude-Session: https://claude.ai/code/session_012sQsmGULLFzjfa9SrQhDjc
</commit_message>
<xml_diff>
--- a/content/The-Sweet-Pick-Copy.docx
+++ b/content/The-Sweet-Pick-Copy.docx
@@ -9686,96 +9686,96 @@
                 <w:sz w:val="19"/>
                 <w:szCs w:val="19"/>
               </w:rPr>
-              <w:t xml:space="preserve">Footer, line 1</w:t>
-            </w:r>
-          </w:p>
-        </w:tc>
-        <w:tc>
-          <w:tcPr>
-            <w:tcW w:type="dxa" w:w="6526"/>
-            <w:tcBorders>
-              <w:top w:val="single" w:color="F0C9A8" w:sz="4"/>
-              <w:left w:val="single" w:color="F0C9A8" w:sz="4"/>
-              <w:bottom w:val="single" w:color="F0C9A8" w:sz="4"/>
-              <w:right w:val="single" w:color="F0C9A8" w:sz="4"/>
-            </w:tcBorders>
-            <w:tcMar>
-              <w:top w:type="dxa" w:w="80"/>
-              <w:left w:type="dxa" w:w="110"/>
-              <w:bottom w:type="dxa" w:w="80"/>
-              <w:right w:type="dxa" w:w="110"/>
-            </w:tcMar>
-          </w:tcPr>
-          <w:p>
-            <w:r>
-              <w:rPr>
-                <w:b w:val="false"/>
-                <w:bCs w:val="false"/>
-                <w:color w:val="222222"/>
-                <w:sz w:val="19"/>
-                <w:szCs w:val="19"/>
-              </w:rPr>
-              <w:t xml:space="preserve">Can you spot the festive tricks?</w:t>
-            </w:r>
-          </w:p>
-        </w:tc>
-      </w:tr>
-      <w:tr>
-        <w:tc>
-          <w:tcPr>
-            <w:tcW w:type="dxa" w:w="2500"/>
-            <w:tcBorders>
-              <w:top w:val="single" w:color="F0C9A8" w:sz="4"/>
-              <w:left w:val="single" w:color="F0C9A8" w:sz="4"/>
-              <w:bottom w:val="single" w:color="F0C9A8" w:sz="4"/>
-              <w:right w:val="single" w:color="F0C9A8" w:sz="4"/>
-            </w:tcBorders>
-            <w:tcMar>
-              <w:top w:type="dxa" w:w="80"/>
-              <w:left w:type="dxa" w:w="110"/>
-              <w:bottom w:type="dxa" w:w="80"/>
-              <w:right w:type="dxa" w:w="110"/>
-            </w:tcMar>
-          </w:tcPr>
-          <w:p>
-            <w:r>
-              <w:rPr>
-                <w:b/>
-                <w:bCs/>
-                <w:color w:val="222222"/>
-                <w:sz w:val="19"/>
-                <w:szCs w:val="19"/>
-              </w:rPr>
-              <w:t xml:space="preserve">Footer, line 2</w:t>
-            </w:r>
-          </w:p>
-        </w:tc>
-        <w:tc>
-          <w:tcPr>
-            <w:tcW w:type="dxa" w:w="6526"/>
-            <w:tcBorders>
-              <w:top w:val="single" w:color="F0C9A8" w:sz="4"/>
-              <w:left w:val="single" w:color="F0C9A8" w:sz="4"/>
-              <w:bottom w:val="single" w:color="F0C9A8" w:sz="4"/>
-              <w:right w:val="single" w:color="F0C9A8" w:sz="4"/>
-            </w:tcBorders>
-            <w:tcMar>
-              <w:top w:type="dxa" w:w="80"/>
-              <w:left w:type="dxa" w:w="110"/>
-              <w:bottom w:type="dxa" w:w="80"/>
-              <w:right w:type="dxa" w:w="110"/>
-            </w:tcMar>
-          </w:tcPr>
-          <w:p>
-            <w:r>
-              <w:rPr>
-                <w:b w:val="false"/>
-                <w:bCs w:val="false"/>
-                <w:color w:val="222222"/>
-                <w:sz w:val="19"/>
-                <w:szCs w:val="19"/>
-              </w:rPr>
-              <w:t xml:space="preserve">The Orange Book · Vol. 65 · ICICI Bank</w:t>
+              <w:t xml:space="preserve">Footer, wordmark</w:t>
+            </w:r>
+          </w:p>
+        </w:tc>
+        <w:tc>
+          <w:tcPr>
+            <w:tcW w:type="dxa" w:w="6526"/>
+            <w:tcBorders>
+              <w:top w:val="single" w:color="F0C9A8" w:sz="4"/>
+              <w:left w:val="single" w:color="F0C9A8" w:sz="4"/>
+              <w:bottom w:val="single" w:color="F0C9A8" w:sz="4"/>
+              <w:right w:val="single" w:color="F0C9A8" w:sz="4"/>
+            </w:tcBorders>
+            <w:tcMar>
+              <w:top w:type="dxa" w:w="80"/>
+              <w:left w:type="dxa" w:w="110"/>
+              <w:bottom w:type="dxa" w:w="80"/>
+              <w:right w:type="dxa" w:w="110"/>
+            </w:tcMar>
+          </w:tcPr>
+          <w:p>
+            <w:r>
+              <w:rPr>
+                <w:b w:val="false"/>
+                <w:bCs w:val="false"/>
+                <w:color w:val="222222"/>
+                <w:sz w:val="19"/>
+                <w:szCs w:val="19"/>
+              </w:rPr>
+              <w:t xml:space="preserve">THE / ORANGE BOOK (set as on the cover)</w:t>
+            </w:r>
+          </w:p>
+        </w:tc>
+      </w:tr>
+      <w:tr>
+        <w:tc>
+          <w:tcPr>
+            <w:tcW w:type="dxa" w:w="2500"/>
+            <w:tcBorders>
+              <w:top w:val="single" w:color="F0C9A8" w:sz="4"/>
+              <w:left w:val="single" w:color="F0C9A8" w:sz="4"/>
+              <w:bottom w:val="single" w:color="F0C9A8" w:sz="4"/>
+              <w:right w:val="single" w:color="F0C9A8" w:sz="4"/>
+            </w:tcBorders>
+            <w:tcMar>
+              <w:top w:type="dxa" w:w="80"/>
+              <w:left w:type="dxa" w:w="110"/>
+              <w:bottom w:type="dxa" w:w="80"/>
+              <w:right w:type="dxa" w:w="110"/>
+            </w:tcMar>
+          </w:tcPr>
+          <w:p>
+            <w:r>
+              <w:rPr>
+                <w:b/>
+                <w:bCs/>
+                <w:color w:val="222222"/>
+                <w:sz w:val="19"/>
+                <w:szCs w:val="19"/>
+              </w:rPr>
+              <w:t xml:space="preserve">Footer, line under it</w:t>
+            </w:r>
+          </w:p>
+        </w:tc>
+        <w:tc>
+          <w:tcPr>
+            <w:tcW w:type="dxa" w:w="6526"/>
+            <w:tcBorders>
+              <w:top w:val="single" w:color="F0C9A8" w:sz="4"/>
+              <w:left w:val="single" w:color="F0C9A8" w:sz="4"/>
+              <w:bottom w:val="single" w:color="F0C9A8" w:sz="4"/>
+              <w:right w:val="single" w:color="F0C9A8" w:sz="4"/>
+            </w:tcBorders>
+            <w:tcMar>
+              <w:top w:type="dxa" w:w="80"/>
+              <w:left w:type="dxa" w:w="110"/>
+              <w:bottom w:type="dxa" w:w="80"/>
+              <w:right w:type="dxa" w:w="110"/>
+            </w:tcMar>
+          </w:tcPr>
+          <w:p>
+            <w:r>
+              <w:rPr>
+                <w:b w:val="false"/>
+                <w:bCs w:val="false"/>
+                <w:color w:val="222222"/>
+                <w:sz w:val="19"/>
+                <w:szCs w:val="19"/>
+              </w:rPr>
+              <w:t xml:space="preserve">Vol. 65 · ICICI Bank</w:t>
             </w:r>
           </w:p>
         </w:tc>

</xml_diff>

<commit_message>
The five briefs are rewritten as scenarios
Each pick now opens on a situation rather than a nudge: hosting at home,
visiting family, the team at work, an evening with friends, and stopping by on
the way to a celebration. The earlier briefs named a reason to prefer the very
box that round was testing, most plainly on the Decoy pick, where one box
having to go around the room argued for the large one the card then calls a
miss.

The copy deck carries the new briefs, and the check that flagged festival names
now allows Diwali, which these scenarios use deliberately.

Co-Authored-By: Claude Opus 5 <noreply@anthropic.com>
Claude-Session: https://claude.ai/code/session_012sQsmGULLFzjfa9SrQhDjc
</commit_message>
<xml_diff>
--- a/content/The-Sweet-Pick-Copy.docx
+++ b/content/The-Sweet-Pick-Copy.docx
@@ -2642,7 +2642,7 @@
                 <w:sz w:val="19"/>
                 <w:szCs w:val="19"/>
               </w:rPr>
-              <w:t xml:space="preserve">Festive week, and the neighbours have already sent a box over. Now it is your turn, and the shop has its sale board out.</w:t>
+              <w:t xml:space="preserve">You’re hosting a Diwali get-together at home and are picking up mithai for your guests.</w:t>
             </w:r>
           </w:p>
         </w:tc>
@@ -3731,7 +3731,7 @@
                 <w:sz w:val="19"/>
                 <w:szCs w:val="19"/>
               </w:rPr>
-              <w:t xml:space="preserve">The cousins are over for the celebrations. One box has to go around the whole room.</w:t>
+              <w:t xml:space="preserve">You’re visiting family during the festive season and decide to take some mithai along.</w:t>
             </w:r>
           </w:p>
         </w:tc>
@@ -4820,7 +4820,7 @@
                 <w:sz w:val="19"/>
                 <w:szCs w:val="19"/>
               </w:rPr>
-              <w:t xml:space="preserve">Your turn to bring the festive box for the office. Whatever you carry in will be noticed.</w:t>
+              <w:t xml:space="preserve">Your team is celebrating Diwali at work and you’ve been asked to bring mithai for everyone.</w:t>
             </w:r>
           </w:p>
         </w:tc>
@@ -5909,7 +5909,7 @@
                 <w:sz w:val="19"/>
                 <w:szCs w:val="19"/>
               </w:rPr>
-              <w:t xml:space="preserve">The evening before the big day. The shelves are thinning and the queue behind you is growing.</w:t>
+              <w:t xml:space="preserve">You’re meeting a few friends for a festive evening and want to pick up some mithai on the way.</w:t>
             </w:r>
           </w:p>
         </w:tc>
@@ -6998,7 +6998,7 @@
                 <w:sz w:val="19"/>
                 <w:szCs w:val="19"/>
               </w:rPr>
-              <w:t xml:space="preserve">A box for your parents. Your father has been told to watch his sugar, so this year you are reading labels.</w:t>
+              <w:t xml:space="preserve">You’re heading to a Diwali celebration and stop by a mithai shop before you go.</w:t>
             </w:r>
           </w:p>
         </w:tc>

</xml_diff>

<commit_message>
Three headlines stop doing the cards' work
The Bandwagon headline announced that everyone was picking one of these, which
pointed at the only card carrying a popularity tag. The FOMO headline told the
reader to hurry before the card said so. The Framing headline told them to read
the label, which is the winning move. All three now name what is on offer and
nothing more: traditional, fusion or dry fruit; three boxes, one to buy; two
boxes, two labels.

The pressure still reaches the player where it should, printed on the box: the
struck-out price, the office-favourite tag, the only-one-left tag and the
sugar-free claim. The contents menu takes its labels from these headlines, so
it follows automatically. The copy deck carries them too.

Co-Authored-By: Claude Opus 5 <noreply@anthropic.com>
Claude-Session: https://claude.ai/code/session_012sQsmGULLFzjfa9SrQhDjc
</commit_message>
<xml_diff>
--- a/content/The-Sweet-Pick-Copy.docx
+++ b/content/The-Sweet-Pick-Copy.docx
@@ -551,7 +551,7 @@
                 <w:sz w:val="19"/>
                 <w:szCs w:val="19"/>
               </w:rPr>
-              <w:t xml:space="preserve">Home · Which box would you pick? · Small, medium or large? · Everyone’s picking one of these. · Better hurry — one left. · Read the label again. · Feedback · Read all editions</w:t>
+              <w:t xml:space="preserve">Home · Which box would you pick? · Small, medium or large? · Traditional, fusion or dry fruit? · Three boxes, one to buy. · Two boxes, two labels. · Feedback · Read all editions</w:t>
             </w:r>
           </w:p>
         </w:tc>
@@ -4760,7 +4760,7 @@
                 <w:sz w:val="19"/>
                 <w:szCs w:val="19"/>
               </w:rPr>
-              <w:t xml:space="preserve">Everyone’s picking one of these.</w:t>
+              <w:t xml:space="preserve">Traditional, fusion or dry fruit?</w:t>
             </w:r>
           </w:p>
         </w:tc>
@@ -5849,7 +5849,7 @@
                 <w:sz w:val="19"/>
                 <w:szCs w:val="19"/>
               </w:rPr>
-              <w:t xml:space="preserve">Better hurry — one left.</w:t>
+              <w:t xml:space="preserve">Three boxes, one to buy.</w:t>
             </w:r>
           </w:p>
         </w:tc>
@@ -6938,7 +6938,7 @@
                 <w:sz w:val="19"/>
                 <w:szCs w:val="19"/>
               </w:rPr>
-              <w:t xml:space="preserve">Read the label again.</w:t>
+              <w:t xml:space="preserve">Two boxes, two labels.</w:t>
             </w:r>
           </w:p>
         </w:tc>

</xml_diff>

<commit_message>
The briefs drop Diwali, and the planned spend announces itself
Three briefs named Diwali; they now say festive get-together, this festive
season at work, and a celebration this festive season, so the edition names no
festival anywhere. The copy check that flags festival names is back on.

The planned spend was easy to skim past, so the stub now performs as the ticket
lands: the amount pops in, a sheen crosses the orange, and it beats twice before
settling. It does not loop, so it never competes with the cards, and
reduced-motion settings switch it off along with everything else.

Co-Authored-By: Claude Opus 5 <noreply@anthropic.com>
Claude-Session: https://claude.ai/code/session_012sQsmGULLFzjfa9SrQhDjc
</commit_message>
<xml_diff>
--- a/content/The-Sweet-Pick-Copy.docx
+++ b/content/The-Sweet-Pick-Copy.docx
@@ -2642,7 +2642,7 @@
                 <w:sz w:val="19"/>
                 <w:szCs w:val="19"/>
               </w:rPr>
-              <w:t xml:space="preserve">You’re hosting a Diwali get-together at home and are picking up mithai for your guests.</w:t>
+              <w:t xml:space="preserve">You’re hosting a festive get-together at home and are picking up mithai for your guests.</w:t>
             </w:r>
           </w:p>
         </w:tc>
@@ -4820,7 +4820,7 @@
                 <w:sz w:val="19"/>
                 <w:szCs w:val="19"/>
               </w:rPr>
-              <w:t xml:space="preserve">Your team is celebrating Diwali at work and you’ve been asked to bring mithai for everyone.</w:t>
+              <w:t xml:space="preserve">Your team is celebrating at work this festive season and you’ve been asked to bring mithai for everyone.</w:t>
             </w:r>
           </w:p>
         </w:tc>
@@ -6998,7 +6998,7 @@
                 <w:sz w:val="19"/>
                 <w:szCs w:val="19"/>
               </w:rPr>
-              <w:t xml:space="preserve">You’re heading to a Diwali celebration and stop by a mithai shop before you go.</w:t>
+              <w:t xml:space="preserve">You’re heading to a celebration this festive season and stop by a mithai shop before you go.</w:t>
             </w:r>
           </w:p>
         </w:tc>

</xml_diff>

<commit_message>
The task at hand leads the page, larger, with the briefs restored
The five briefs go back to the set before the genericising, as approved.
The per-pick headline leaves the playing page: it stays in the markup,
visually hidden, so the document still has a heading and the contents
menu still lists the picks by name, but the page now opens on the
ticket. The ticket takes the space that frees up — bigger body copy,
a bigger planned spend, more padding and a heavier rule — with the
stub trimmed below 380px so the brief keeps its width on small phones.

Co-Authored-By: Claude Opus 5 <noreply@anthropic.com>
Claude-Session: https://claude.ai/code/session_012sQsmGULLFzjfa9SrQhDjc
</commit_message>
<xml_diff>
--- a/content/The-Sweet-Pick-Copy.docx
+++ b/content/The-Sweet-Pick-Copy.docx
@@ -2642,7 +2642,7 @@
                 <w:sz w:val="19"/>
                 <w:szCs w:val="19"/>
               </w:rPr>
-              <w:t xml:space="preserve">You’re hosting a festive get-together at home and are picking up mithai for your guests.</w:t>
+              <w:t xml:space="preserve">You’re hosting a Diwali get-together at home and are picking up mithai for your guests.</w:t>
             </w:r>
           </w:p>
         </w:tc>
@@ -4820,7 +4820,7 @@
                 <w:sz w:val="19"/>
                 <w:szCs w:val="19"/>
               </w:rPr>
-              <w:t xml:space="preserve">Your team is celebrating at work this festive season and you’ve been asked to bring mithai for everyone.</w:t>
+              <w:t xml:space="preserve">Your team is celebrating Diwali at work and you’ve been asked to bring mithai for everyone.</w:t>
             </w:r>
           </w:p>
         </w:tc>
@@ -6998,7 +6998,7 @@
                 <w:sz w:val="19"/>
                 <w:szCs w:val="19"/>
               </w:rPr>
-              <w:t xml:space="preserve">You’re heading to a celebration this festive season and stop by a mithai shop before you go.</w:t>
+              <w:t xml:space="preserve">You’re heading to a Diwali celebration and stop by a mithai shop before you go.</w:t>
             </w:r>
           </w:p>
         </w:tc>

</xml_diff>

<commit_message>
The briefs go back to the earlier, more situational set
The five Task at hand lines return to the set used before the scenarios
were rewritten: festive week and the sale board, the cousins and one box
for the room, the office box, the thinning shelves, and the labels read
for a father watching his sugar.

Co-Authored-By: Claude Opus 5 <noreply@anthropic.com>
Claude-Session: https://claude.ai/code/session_012sQsmGULLFzjfa9SrQhDjc
</commit_message>
<xml_diff>
--- a/content/The-Sweet-Pick-Copy.docx
+++ b/content/The-Sweet-Pick-Copy.docx
@@ -2642,7 +2642,7 @@
                 <w:sz w:val="19"/>
                 <w:szCs w:val="19"/>
               </w:rPr>
-              <w:t xml:space="preserve">You’re hosting a Diwali get-together at home and are picking up mithai for your guests.</w:t>
+              <w:t xml:space="preserve">Festive week, and the neighbours have already sent a box over. Now it is your turn, and the shop has its sale board out.</w:t>
             </w:r>
           </w:p>
         </w:tc>
@@ -3731,7 +3731,7 @@
                 <w:sz w:val="19"/>
                 <w:szCs w:val="19"/>
               </w:rPr>
-              <w:t xml:space="preserve">You’re visiting family during the festive season and decide to take some mithai along.</w:t>
+              <w:t xml:space="preserve">The cousins are over for the celebrations. One box has to go around the whole room.</w:t>
             </w:r>
           </w:p>
         </w:tc>
@@ -4820,7 +4820,7 @@
                 <w:sz w:val="19"/>
                 <w:szCs w:val="19"/>
               </w:rPr>
-              <w:t xml:space="preserve">Your team is celebrating Diwali at work and you’ve been asked to bring mithai for everyone.</w:t>
+              <w:t xml:space="preserve">Your turn to bring the festive box for the office. Whatever you carry in will be noticed.</w:t>
             </w:r>
           </w:p>
         </w:tc>
@@ -5909,7 +5909,7 @@
                 <w:sz w:val="19"/>
                 <w:szCs w:val="19"/>
               </w:rPr>
-              <w:t xml:space="preserve">You’re meeting a few friends for a festive evening and want to pick up some mithai on the way.</w:t>
+              <w:t xml:space="preserve">The evening before the big day. The shelves are thinning and the queue behind you is growing.</w:t>
             </w:r>
           </w:p>
         </w:tc>
@@ -6998,7 +6998,7 @@
                 <w:sz w:val="19"/>
                 <w:szCs w:val="19"/>
               </w:rPr>
-              <w:t xml:space="preserve">You’re heading to a Diwali celebration and stop by a mithai shop before you go.</w:t>
+              <w:t xml:space="preserve">A box for your parents. Your father has been told to watch his sugar, so this year you are reading labels.</w:t>
             </w:r>
           </w:p>
         </w:tc>

</xml_diff>

<commit_message>
The first-visit note goes; its line moves onto the cover
The edition now opens straight on the title screen. "This festive season,
a different kind of lesson" sits under the box and over the button, set in
the running face so it reads as a sentence against the script title above.
The overlay, its stylesheet, its open/close code and the localStorage key
that remembered it are all gone.

A short landscape window overflowed by 27px once the line was in, so the
short-screen pass trims the inner padding, the title's margin and the
line's own size. All seven test viewports fit again.

Both copy decks follow: the note's section becomes a row on the title
screen, and the masthead, page-number and seal rows drop the volume number
and date with it.

Co-Authored-By: Claude Opus 5 <noreply@anthropic.com>
Claude-Session: https://claude.ai/code/session_012sQsmGULLFzjfa9SrQhDjc
</commit_message>
<xml_diff>
--- a/content/The-Sweet-Pick-Copy.docx
+++ b/content/The-Sweet-Pick-Copy.docx
@@ -222,66 +222,6 @@
                 <w:sz w:val="19"/>
                 <w:szCs w:val="19"/>
               </w:rPr>
-              <w:t xml:space="preserve">Masthead (header, every page)</w:t>
-            </w:r>
-          </w:p>
-        </w:tc>
-        <w:tc>
-          <w:tcPr>
-            <w:tcW w:type="dxa" w:w="6526"/>
-            <w:tcBorders>
-              <w:top w:val="single" w:color="F0C9A8" w:sz="4"/>
-              <w:left w:val="single" w:color="F0C9A8" w:sz="4"/>
-              <w:bottom w:val="single" w:color="F0C9A8" w:sz="4"/>
-              <w:right w:val="single" w:color="F0C9A8" w:sz="4"/>
-            </w:tcBorders>
-            <w:tcMar>
-              <w:top w:type="dxa" w:w="80"/>
-              <w:left w:type="dxa" w:w="110"/>
-              <w:bottom w:type="dxa" w:w="80"/>
-              <w:right w:type="dxa" w:w="110"/>
-            </w:tcMar>
-          </w:tcPr>
-          <w:p>
-            <w:r>
-              <w:rPr>
-                <w:b w:val="false"/>
-                <w:bCs w:val="false"/>
-                <w:color w:val="222222"/>
-                <w:sz w:val="19"/>
-                <w:szCs w:val="19"/>
-              </w:rPr>
-              <w:t xml:space="preserve">OCTOBER 2026 | VOL. 65</w:t>
-            </w:r>
-          </w:p>
-        </w:tc>
-      </w:tr>
-      <w:tr>
-        <w:tc>
-          <w:tcPr>
-            <w:tcW w:type="dxa" w:w="2500"/>
-            <w:tcBorders>
-              <w:top w:val="single" w:color="F0C9A8" w:sz="4"/>
-              <w:left w:val="single" w:color="F0C9A8" w:sz="4"/>
-              <w:bottom w:val="single" w:color="F0C9A8" w:sz="4"/>
-              <w:right w:val="single" w:color="F0C9A8" w:sz="4"/>
-            </w:tcBorders>
-            <w:tcMar>
-              <w:top w:type="dxa" w:w="80"/>
-              <w:left w:type="dxa" w:w="110"/>
-              <w:bottom w:type="dxa" w:w="80"/>
-              <w:right w:type="dxa" w:w="110"/>
-            </w:tcMar>
-          </w:tcPr>
-          <w:p>
-            <w:r>
-              <w:rPr>
-                <w:b/>
-                <w:bCs/>
-                <w:color w:val="222222"/>
-                <w:sz w:val="19"/>
-                <w:szCs w:val="19"/>
-              </w:rPr>
               <w:t xml:space="preserve">Band, right side</w:t>
             </w:r>
           </w:p>
@@ -626,22 +566,7 @@
         <w:rPr>
           <w:color w:val="F06423"/>
         </w:rPr>
-        <w:t xml:space="preserve">2. First-visit note</w:t>
-      </w:r>
-    </w:p>
-    <w:p>
-      <w:pPr>
-        <w:spacing w:after="120"/>
-      </w:pPr>
-      <w:r>
-        <w:rPr>
-          <w:i/>
-          <w:iCs/>
-          <w:color w:val="222222"/>
-          <w:sz w:val="20"/>
-          <w:szCs w:val="20"/>
-        </w:rPr>
-        <w:t xml:space="preserve">Shown once, over the title screen.</w:t>
+        <w:t xml:space="preserve">2. Title screen (main menu)</w:t>
       </w:r>
     </w:p>
     <w:tbl>
@@ -690,7 +615,7 @@
                 <w:sz w:val="19"/>
                 <w:szCs w:val="19"/>
               </w:rPr>
-              <w:t xml:space="preserve">Part</w:t>
+              <w:t xml:space="preserve">Element</w:t>
             </w:r>
           </w:p>
         </w:tc>
@@ -751,67 +676,127 @@
                 <w:sz w:val="19"/>
                 <w:szCs w:val="19"/>
               </w:rPr>
-              <w:t xml:space="preserve">Kicker</w:t>
-            </w:r>
-          </w:p>
-        </w:tc>
-        <w:tc>
-          <w:tcPr>
-            <w:tcW w:type="dxa" w:w="6526"/>
-            <w:tcBorders>
-              <w:top w:val="single" w:color="F0C9A8" w:sz="4"/>
-              <w:left w:val="single" w:color="F0C9A8" w:sz="4"/>
-              <w:bottom w:val="single" w:color="F0C9A8" w:sz="4"/>
-              <w:right w:val="single" w:color="F0C9A8" w:sz="4"/>
-            </w:tcBorders>
-            <w:tcMar>
-              <w:top w:type="dxa" w:w="80"/>
-              <w:left w:type="dxa" w:w="110"/>
-              <w:bottom w:type="dxa" w:w="80"/>
-              <w:right w:type="dxa" w:w="110"/>
-            </w:tcMar>
-          </w:tcPr>
-          <w:p>
-            <w:r>
-              <w:rPr>
-                <w:b w:val="false"/>
-                <w:bCs w:val="false"/>
-                <w:color w:val="222222"/>
-                <w:sz w:val="19"/>
-                <w:szCs w:val="19"/>
-              </w:rPr>
-              <w:t xml:space="preserve">Interactive edition · Vol. 65</w:t>
-            </w:r>
-          </w:p>
-        </w:tc>
-      </w:tr>
-      <w:tr>
-        <w:tc>
-          <w:tcPr>
-            <w:tcW w:type="dxa" w:w="2500"/>
-            <w:tcBorders>
-              <w:top w:val="single" w:color="F0C9A8" w:sz="4"/>
-              <w:left w:val="single" w:color="F0C9A8" w:sz="4"/>
-              <w:bottom w:val="single" w:color="F0C9A8" w:sz="4"/>
-              <w:right w:val="single" w:color="F0C9A8" w:sz="4"/>
-            </w:tcBorders>
-            <w:tcMar>
-              <w:top w:type="dxa" w:w="80"/>
-              <w:left w:type="dxa" w:w="110"/>
-              <w:bottom w:type="dxa" w:w="80"/>
-              <w:right w:type="dxa" w:w="110"/>
-            </w:tcMar>
-          </w:tcPr>
-          <w:p>
-            <w:r>
-              <w:rPr>
-                <w:b/>
-                <w:bCs/>
-                <w:color w:val="222222"/>
-                <w:sz w:val="19"/>
-                <w:szCs w:val="19"/>
-              </w:rPr>
-              <w:t xml:space="preserve">Heading</w:t>
+              <w:t xml:space="preserve">Lockup</w:t>
+            </w:r>
+          </w:p>
+        </w:tc>
+        <w:tc>
+          <w:tcPr>
+            <w:tcW w:type="dxa" w:w="6526"/>
+            <w:tcBorders>
+              <w:top w:val="single" w:color="F0C9A8" w:sz="4"/>
+              <w:left w:val="single" w:color="F0C9A8" w:sz="4"/>
+              <w:bottom w:val="single" w:color="F0C9A8" w:sz="4"/>
+              <w:right w:val="single" w:color="F0C9A8" w:sz="4"/>
+            </w:tcBorders>
+            <w:tcMar>
+              <w:top w:type="dxa" w:w="80"/>
+              <w:left w:type="dxa" w:w="110"/>
+              <w:bottom w:type="dxa" w:w="80"/>
+              <w:right w:type="dxa" w:w="110"/>
+            </w:tcMar>
+          </w:tcPr>
+          <w:p>
+            <w:r>
+              <w:rPr>
+                <w:b w:val="false"/>
+                <w:bCs w:val="false"/>
+                <w:color w:val="222222"/>
+                <w:sz w:val="19"/>
+                <w:szCs w:val="19"/>
+              </w:rPr>
+              <w:t xml:space="preserve">The / Orange / Book</w:t>
+            </w:r>
+          </w:p>
+        </w:tc>
+      </w:tr>
+      <w:tr>
+        <w:tc>
+          <w:tcPr>
+            <w:tcW w:type="dxa" w:w="2500"/>
+            <w:tcBorders>
+              <w:top w:val="single" w:color="F0C9A8" w:sz="4"/>
+              <w:left w:val="single" w:color="F0C9A8" w:sz="4"/>
+              <w:bottom w:val="single" w:color="F0C9A8" w:sz="4"/>
+              <w:right w:val="single" w:color="F0C9A8" w:sz="4"/>
+            </w:tcBorders>
+            <w:tcMar>
+              <w:top w:type="dxa" w:w="80"/>
+              <w:left w:type="dxa" w:w="110"/>
+              <w:bottom w:type="dxa" w:w="80"/>
+              <w:right w:type="dxa" w:w="110"/>
+            </w:tcMar>
+          </w:tcPr>
+          <w:p>
+            <w:r>
+              <w:rPr>
+                <w:b/>
+                <w:bCs/>
+                <w:color w:val="222222"/>
+                <w:sz w:val="19"/>
+                <w:szCs w:val="19"/>
+              </w:rPr>
+              <w:t xml:space="preserve">Title</w:t>
+            </w:r>
+          </w:p>
+        </w:tc>
+        <w:tc>
+          <w:tcPr>
+            <w:tcW w:type="dxa" w:w="6526"/>
+            <w:tcBorders>
+              <w:top w:val="single" w:color="F0C9A8" w:sz="4"/>
+              <w:left w:val="single" w:color="F0C9A8" w:sz="4"/>
+              <w:bottom w:val="single" w:color="F0C9A8" w:sz="4"/>
+              <w:right w:val="single" w:color="F0C9A8" w:sz="4"/>
+            </w:tcBorders>
+            <w:tcMar>
+              <w:top w:type="dxa" w:w="80"/>
+              <w:left w:type="dxa" w:w="110"/>
+              <w:bottom w:type="dxa" w:w="80"/>
+              <w:right w:type="dxa" w:w="110"/>
+            </w:tcMar>
+          </w:tcPr>
+          <w:p>
+            <w:r>
+              <w:rPr>
+                <w:b w:val="false"/>
+                <w:bCs w:val="false"/>
+                <w:color w:val="222222"/>
+                <w:sz w:val="19"/>
+                <w:szCs w:val="19"/>
+              </w:rPr>
+              <w:t xml:space="preserve">The Sweet Pick</w:t>
+            </w:r>
+          </w:p>
+        </w:tc>
+      </w:tr>
+      <w:tr>
+        <w:tc>
+          <w:tcPr>
+            <w:tcW w:type="dxa" w:w="2500"/>
+            <w:tcBorders>
+              <w:top w:val="single" w:color="F0C9A8" w:sz="4"/>
+              <w:left w:val="single" w:color="F0C9A8" w:sz="4"/>
+              <w:bottom w:val="single" w:color="F0C9A8" w:sz="4"/>
+              <w:right w:val="single" w:color="F0C9A8" w:sz="4"/>
+            </w:tcBorders>
+            <w:tcMar>
+              <w:top w:type="dxa" w:w="80"/>
+              <w:left w:type="dxa" w:w="110"/>
+              <w:bottom w:type="dxa" w:w="80"/>
+              <w:right w:type="dxa" w:w="110"/>
+            </w:tcMar>
+          </w:tcPr>
+          <w:p>
+            <w:r>
+              <w:rPr>
+                <w:b/>
+                <w:bCs/>
+                <w:color w:val="222222"/>
+                <w:sz w:val="19"/>
+                <w:szCs w:val="19"/>
+              </w:rPr>
+              <w:t xml:space="preserve">Tagline (under the box, above the button)</w:t>
             </w:r>
           </w:p>
         </w:tc>
@@ -871,96 +856,336 @@
                 <w:sz w:val="19"/>
                 <w:szCs w:val="19"/>
               </w:rPr>
-              <w:t xml:space="preserve">Body</w:t>
-            </w:r>
-          </w:p>
-        </w:tc>
-        <w:tc>
-          <w:tcPr>
-            <w:tcW w:type="dxa" w:w="6526"/>
-            <w:tcBorders>
-              <w:top w:val="single" w:color="F0C9A8" w:sz="4"/>
-              <w:left w:val="single" w:color="F0C9A8" w:sz="4"/>
-              <w:bottom w:val="single" w:color="F0C9A8" w:sz="4"/>
-              <w:right w:val="single" w:color="F0C9A8" w:sz="4"/>
-            </w:tcBorders>
-            <w:tcMar>
-              <w:top w:type="dxa" w:w="80"/>
-              <w:left w:type="dxa" w:w="110"/>
-              <w:bottom w:type="dxa" w:w="80"/>
-              <w:right w:type="dxa" w:w="110"/>
-            </w:tcMar>
-          </w:tcPr>
-          <w:p>
-            <w:r>
-              <w:rPr>
-                <w:b w:val="false"/>
-                <w:bCs w:val="false"/>
-                <w:color w:val="222222"/>
-                <w:sz w:val="19"/>
-                <w:szCs w:val="19"/>
-              </w:rPr>
-              <w:t xml:space="preserve">Some money lessons are better when experienced. This festive season, The Orange Book takes an interactive approach to explore the choices we make with our money.</w:t>
-            </w:r>
-          </w:p>
-        </w:tc>
-      </w:tr>
-      <w:tr>
-        <w:tc>
-          <w:tcPr>
-            <w:tcW w:type="dxa" w:w="2500"/>
-            <w:tcBorders>
-              <w:top w:val="single" w:color="F0C9A8" w:sz="4"/>
-              <w:left w:val="single" w:color="F0C9A8" w:sz="4"/>
-              <w:bottom w:val="single" w:color="F0C9A8" w:sz="4"/>
-              <w:right w:val="single" w:color="F0C9A8" w:sz="4"/>
-            </w:tcBorders>
-            <w:tcMar>
-              <w:top w:type="dxa" w:w="80"/>
-              <w:left w:type="dxa" w:w="110"/>
-              <w:bottom w:type="dxa" w:w="80"/>
-              <w:right w:type="dxa" w:w="110"/>
-            </w:tcMar>
-          </w:tcPr>
-          <w:p>
-            <w:r>
-              <w:rPr>
-                <w:b/>
-                <w:bCs/>
-                <w:color w:val="222222"/>
-                <w:sz w:val="19"/>
-                <w:szCs w:val="19"/>
-              </w:rPr>
-              <w:t xml:space="preserve">Button</w:t>
-            </w:r>
-          </w:p>
-        </w:tc>
-        <w:tc>
-          <w:tcPr>
-            <w:tcW w:type="dxa" w:w="6526"/>
-            <w:tcBorders>
-              <w:top w:val="single" w:color="F0C9A8" w:sz="4"/>
-              <w:left w:val="single" w:color="F0C9A8" w:sz="4"/>
-              <w:bottom w:val="single" w:color="F0C9A8" w:sz="4"/>
-              <w:right w:val="single" w:color="F0C9A8" w:sz="4"/>
-            </w:tcBorders>
-            <w:tcMar>
-              <w:top w:type="dxa" w:w="80"/>
-              <w:left w:type="dxa" w:w="110"/>
-              <w:bottom w:type="dxa" w:w="80"/>
-              <w:right w:type="dxa" w:w="110"/>
-            </w:tcMar>
-          </w:tcPr>
-          <w:p>
-            <w:r>
-              <w:rPr>
-                <w:b w:val="false"/>
-                <w:bCs w:val="false"/>
-                <w:color w:val="222222"/>
-                <w:sz w:val="19"/>
-                <w:szCs w:val="19"/>
-              </w:rPr>
-              <w:t xml:space="preserve">Continue</w:t>
+              <w:t xml:space="preserve">Menu, first visit</w:t>
+            </w:r>
+          </w:p>
+        </w:tc>
+        <w:tc>
+          <w:tcPr>
+            <w:tcW w:type="dxa" w:w="6526"/>
+            <w:tcBorders>
+              <w:top w:val="single" w:color="F0C9A8" w:sz="4"/>
+              <w:left w:val="single" w:color="F0C9A8" w:sz="4"/>
+              <w:bottom w:val="single" w:color="F0C9A8" w:sz="4"/>
+              <w:right w:val="single" w:color="F0C9A8" w:sz="4"/>
+            </w:tcBorders>
+            <w:tcMar>
+              <w:top w:type="dxa" w:w="80"/>
+              <w:left w:type="dxa" w:w="110"/>
+              <w:bottom w:type="dxa" w:w="80"/>
+              <w:right w:type="dxa" w:w="110"/>
+            </w:tcMar>
+          </w:tcPr>
+          <w:p>
+            <w:r>
+              <w:rPr>
+                <w:b w:val="false"/>
+                <w:bCs w:val="false"/>
+                <w:color w:val="222222"/>
+                <w:sz w:val="19"/>
+                <w:szCs w:val="19"/>
+              </w:rPr>
+              <w:t xml:space="preserve">Play</w:t>
+            </w:r>
+          </w:p>
+        </w:tc>
+      </w:tr>
+      <w:tr>
+        <w:tc>
+          <w:tcPr>
+            <w:tcW w:type="dxa" w:w="2500"/>
+            <w:tcBorders>
+              <w:top w:val="single" w:color="F0C9A8" w:sz="4"/>
+              <w:left w:val="single" w:color="F0C9A8" w:sz="4"/>
+              <w:bottom w:val="single" w:color="F0C9A8" w:sz="4"/>
+              <w:right w:val="single" w:color="F0C9A8" w:sz="4"/>
+            </w:tcBorders>
+            <w:tcMar>
+              <w:top w:type="dxa" w:w="80"/>
+              <w:left w:type="dxa" w:w="110"/>
+              <w:bottom w:type="dxa" w:w="80"/>
+              <w:right w:type="dxa" w:w="110"/>
+            </w:tcMar>
+          </w:tcPr>
+          <w:p>
+            <w:r>
+              <w:rPr>
+                <w:b/>
+                <w:bCs/>
+                <w:color w:val="222222"/>
+                <w:sz w:val="19"/>
+                <w:szCs w:val="19"/>
+              </w:rPr>
+              <w:t xml:space="preserve">Menu, game in progress</w:t>
+            </w:r>
+          </w:p>
+        </w:tc>
+        <w:tc>
+          <w:tcPr>
+            <w:tcW w:type="dxa" w:w="6526"/>
+            <w:tcBorders>
+              <w:top w:val="single" w:color="F0C9A8" w:sz="4"/>
+              <w:left w:val="single" w:color="F0C9A8" w:sz="4"/>
+              <w:bottom w:val="single" w:color="F0C9A8" w:sz="4"/>
+              <w:right w:val="single" w:color="F0C9A8" w:sz="4"/>
+            </w:tcBorders>
+            <w:tcMar>
+              <w:top w:type="dxa" w:w="80"/>
+              <w:left w:type="dxa" w:w="110"/>
+              <w:bottom w:type="dxa" w:w="80"/>
+              <w:right w:type="dxa" w:w="110"/>
+            </w:tcMar>
+          </w:tcPr>
+          <w:p>
+            <w:r>
+              <w:rPr>
+                <w:b w:val="false"/>
+                <w:bCs w:val="false"/>
+                <w:color w:val="222222"/>
+                <w:sz w:val="19"/>
+                <w:szCs w:val="19"/>
+              </w:rPr>
+              <w:t xml:space="preserve">Continue — Pick {N} of 5 · New game</w:t>
+            </w:r>
+          </w:p>
+        </w:tc>
+      </w:tr>
+      <w:tr>
+        <w:tc>
+          <w:tcPr>
+            <w:tcW w:type="dxa" w:w="2500"/>
+            <w:tcBorders>
+              <w:top w:val="single" w:color="F0C9A8" w:sz="4"/>
+              <w:left w:val="single" w:color="F0C9A8" w:sz="4"/>
+              <w:bottom w:val="single" w:color="F0C9A8" w:sz="4"/>
+              <w:right w:val="single" w:color="F0C9A8" w:sz="4"/>
+            </w:tcBorders>
+            <w:tcMar>
+              <w:top w:type="dxa" w:w="80"/>
+              <w:left w:type="dxa" w:w="110"/>
+              <w:bottom w:type="dxa" w:w="80"/>
+              <w:right w:type="dxa" w:w="110"/>
+            </w:tcMar>
+          </w:tcPr>
+          <w:p>
+            <w:r>
+              <w:rPr>
+                <w:b/>
+                <w:bCs/>
+                <w:color w:val="222222"/>
+                <w:sz w:val="19"/>
+                <w:szCs w:val="19"/>
+              </w:rPr>
+              <w:t xml:space="preserve">Plate after a finished game</w:t>
+            </w:r>
+          </w:p>
+        </w:tc>
+        <w:tc>
+          <w:tcPr>
+            <w:tcW w:type="dxa" w:w="6526"/>
+            <w:tcBorders>
+              <w:top w:val="single" w:color="F0C9A8" w:sz="4"/>
+              <w:left w:val="single" w:color="F0C9A8" w:sz="4"/>
+              <w:bottom w:val="single" w:color="F0C9A8" w:sz="4"/>
+              <w:right w:val="single" w:color="F0C9A8" w:sz="4"/>
+            </w:tcBorders>
+            <w:tcMar>
+              <w:top w:type="dxa" w:w="80"/>
+              <w:left w:type="dxa" w:w="110"/>
+              <w:bottom w:type="dxa" w:w="80"/>
+              <w:right w:type="dxa" w:w="110"/>
+            </w:tcMar>
+          </w:tcPr>
+          <w:p>
+            <w:r>
+              <w:rPr>
+                <w:b w:val="false"/>
+                <w:bCs w:val="false"/>
+                <w:color w:val="222222"/>
+                <w:sz w:val="19"/>
+                <w:szCs w:val="19"/>
+              </w:rPr>
+              <w:t xml:space="preserve">Best run {N} of 5 · {Tag}</w:t>
+            </w:r>
+          </w:p>
+        </w:tc>
+      </w:tr>
+      <w:tr>
+        <w:tc>
+          <w:tcPr>
+            <w:tcW w:type="dxa" w:w="2500"/>
+            <w:tcBorders>
+              <w:top w:val="single" w:color="F0C9A8" w:sz="4"/>
+              <w:left w:val="single" w:color="F0C9A8" w:sz="4"/>
+              <w:bottom w:val="single" w:color="F0C9A8" w:sz="4"/>
+              <w:right w:val="single" w:color="F0C9A8" w:sz="4"/>
+            </w:tcBorders>
+            <w:tcMar>
+              <w:top w:type="dxa" w:w="80"/>
+              <w:left w:type="dxa" w:w="110"/>
+              <w:bottom w:type="dxa" w:w="80"/>
+              <w:right w:type="dxa" w:w="110"/>
+            </w:tcMar>
+          </w:tcPr>
+          <w:p>
+            <w:r>
+              <w:rPr>
+                <w:b/>
+                <w:bCs/>
+                <w:color w:val="222222"/>
+                <w:sz w:val="19"/>
+                <w:szCs w:val="19"/>
+              </w:rPr>
+              <w:t xml:space="preserve">Keyboard hint (desktop)</w:t>
+            </w:r>
+          </w:p>
+        </w:tc>
+        <w:tc>
+          <w:tcPr>
+            <w:tcW w:type="dxa" w:w="6526"/>
+            <w:tcBorders>
+              <w:top w:val="single" w:color="F0C9A8" w:sz="4"/>
+              <w:left w:val="single" w:color="F0C9A8" w:sz="4"/>
+              <w:bottom w:val="single" w:color="F0C9A8" w:sz="4"/>
+              <w:right w:val="single" w:color="F0C9A8" w:sz="4"/>
+            </w:tcBorders>
+            <w:tcMar>
+              <w:top w:type="dxa" w:w="80"/>
+              <w:left w:type="dxa" w:w="110"/>
+              <w:bottom w:type="dxa" w:w="80"/>
+              <w:right w:type="dxa" w:w="110"/>
+            </w:tcMar>
+          </w:tcPr>
+          <w:p>
+            <w:r>
+              <w:rPr>
+                <w:b w:val="false"/>
+                <w:bCs w:val="false"/>
+                <w:color w:val="222222"/>
+                <w:sz w:val="19"/>
+                <w:szCs w:val="19"/>
+              </w:rPr>
+              <w:t xml:space="preserve">▲ ▼ Select ↵ Enter</w:t>
+            </w:r>
+          </w:p>
+        </w:tc>
+      </w:tr>
+      <w:tr>
+        <w:tc>
+          <w:tcPr>
+            <w:tcW w:type="dxa" w:w="2500"/>
+            <w:tcBorders>
+              <w:top w:val="single" w:color="F0C9A8" w:sz="4"/>
+              <w:left w:val="single" w:color="F0C9A8" w:sz="4"/>
+              <w:bottom w:val="single" w:color="F0C9A8" w:sz="4"/>
+              <w:right w:val="single" w:color="F0C9A8" w:sz="4"/>
+            </w:tcBorders>
+            <w:tcMar>
+              <w:top w:type="dxa" w:w="80"/>
+              <w:left w:type="dxa" w:w="110"/>
+              <w:bottom w:type="dxa" w:w="80"/>
+              <w:right w:type="dxa" w:w="110"/>
+            </w:tcMar>
+          </w:tcPr>
+          <w:p>
+            <w:r>
+              <w:rPr>
+                <w:b/>
+                <w:bCs/>
+                <w:color w:val="222222"/>
+                <w:sz w:val="19"/>
+                <w:szCs w:val="19"/>
+              </w:rPr>
+              <w:t xml:space="preserve">Tap hint (phone)</w:t>
+            </w:r>
+          </w:p>
+        </w:tc>
+        <w:tc>
+          <w:tcPr>
+            <w:tcW w:type="dxa" w:w="6526"/>
+            <w:tcBorders>
+              <w:top w:val="single" w:color="F0C9A8" w:sz="4"/>
+              <w:left w:val="single" w:color="F0C9A8" w:sz="4"/>
+              <w:bottom w:val="single" w:color="F0C9A8" w:sz="4"/>
+              <w:right w:val="single" w:color="F0C9A8" w:sz="4"/>
+            </w:tcBorders>
+            <w:tcMar>
+              <w:top w:type="dxa" w:w="80"/>
+              <w:left w:type="dxa" w:w="110"/>
+              <w:bottom w:type="dxa" w:w="80"/>
+              <w:right w:type="dxa" w:w="110"/>
+            </w:tcMar>
+          </w:tcPr>
+          <w:p>
+            <w:r>
+              <w:rPr>
+                <w:b w:val="false"/>
+                <w:bCs w:val="false"/>
+                <w:color w:val="222222"/>
+                <w:sz w:val="19"/>
+                <w:szCs w:val="19"/>
+              </w:rPr>
+              <w:t xml:space="preserve">Tap a line to choose</w:t>
+            </w:r>
+          </w:p>
+        </w:tc>
+      </w:tr>
+      <w:tr>
+        <w:tc>
+          <w:tcPr>
+            <w:tcW w:type="dxa" w:w="2500"/>
+            <w:tcBorders>
+              <w:top w:val="single" w:color="F0C9A8" w:sz="4"/>
+              <w:left w:val="single" w:color="F0C9A8" w:sz="4"/>
+              <w:bottom w:val="single" w:color="F0C9A8" w:sz="4"/>
+              <w:right w:val="single" w:color="F0C9A8" w:sz="4"/>
+            </w:tcBorders>
+            <w:tcMar>
+              <w:top w:type="dxa" w:w="80"/>
+              <w:left w:type="dxa" w:w="110"/>
+              <w:bottom w:type="dxa" w:w="80"/>
+              <w:right w:type="dxa" w:w="110"/>
+            </w:tcMar>
+          </w:tcPr>
+          <w:p>
+            <w:r>
+              <w:rPr>
+                <w:b/>
+                <w:bCs/>
+                <w:color w:val="222222"/>
+                <w:sz w:val="19"/>
+                <w:szCs w:val="19"/>
+              </w:rPr>
+              <w:t xml:space="preserve">Hero illustration (alt text)</w:t>
+            </w:r>
+          </w:p>
+        </w:tc>
+        <w:tc>
+          <w:tcPr>
+            <w:tcW w:type="dxa" w:w="6526"/>
+            <w:tcBorders>
+              <w:top w:val="single" w:color="F0C9A8" w:sz="4"/>
+              <w:left w:val="single" w:color="F0C9A8" w:sz="4"/>
+              <w:bottom w:val="single" w:color="F0C9A8" w:sz="4"/>
+              <w:right w:val="single" w:color="F0C9A8" w:sz="4"/>
+            </w:tcBorders>
+            <w:tcMar>
+              <w:top w:type="dxa" w:w="80"/>
+              <w:left w:type="dxa" w:w="110"/>
+              <w:bottom w:type="dxa" w:w="80"/>
+              <w:right w:type="dxa" w:w="110"/>
+            </w:tcMar>
+          </w:tcPr>
+          <w:p>
+            <w:r>
+              <w:rPr>
+                <w:b w:val="false"/>
+                <w:bCs w:val="false"/>
+                <w:color w:val="222222"/>
+                <w:sz w:val="19"/>
+                <w:szCs w:val="19"/>
+              </w:rPr>
+              <w:t xml:space="preserve">An open box of twelve festive mithai, its lid set beside it</w:t>
             </w:r>
           </w:p>
         </w:tc>
@@ -975,7 +1200,7 @@
         <w:rPr>
           <w:color w:val="F06423"/>
         </w:rPr>
-        <w:t xml:space="preserve">3. Title screen (main menu)</w:t>
+        <w:t xml:space="preserve">3. Pick pages · shared elements</w:t>
       </w:r>
     </w:p>
     <w:tbl>
@@ -1055,640 +1280,6 @@
                 <w:szCs w:val="19"/>
               </w:rPr>
               <w:t xml:space="preserve">Copy</w:t>
-            </w:r>
-          </w:p>
-        </w:tc>
-      </w:tr>
-      <w:tr>
-        <w:tc>
-          <w:tcPr>
-            <w:tcW w:type="dxa" w:w="2500"/>
-            <w:tcBorders>
-              <w:top w:val="single" w:color="F0C9A8" w:sz="4"/>
-              <w:left w:val="single" w:color="F0C9A8" w:sz="4"/>
-              <w:bottom w:val="single" w:color="F0C9A8" w:sz="4"/>
-              <w:right w:val="single" w:color="F0C9A8" w:sz="4"/>
-            </w:tcBorders>
-            <w:tcMar>
-              <w:top w:type="dxa" w:w="80"/>
-              <w:left w:type="dxa" w:w="110"/>
-              <w:bottom w:type="dxa" w:w="80"/>
-              <w:right w:type="dxa" w:w="110"/>
-            </w:tcMar>
-          </w:tcPr>
-          <w:p>
-            <w:r>
-              <w:rPr>
-                <w:b/>
-                <w:bCs/>
-                <w:color w:val="222222"/>
-                <w:sz w:val="19"/>
-                <w:szCs w:val="19"/>
-              </w:rPr>
-              <w:t xml:space="preserve">Lockup</w:t>
-            </w:r>
-          </w:p>
-        </w:tc>
-        <w:tc>
-          <w:tcPr>
-            <w:tcW w:type="dxa" w:w="6526"/>
-            <w:tcBorders>
-              <w:top w:val="single" w:color="F0C9A8" w:sz="4"/>
-              <w:left w:val="single" w:color="F0C9A8" w:sz="4"/>
-              <w:bottom w:val="single" w:color="F0C9A8" w:sz="4"/>
-              <w:right w:val="single" w:color="F0C9A8" w:sz="4"/>
-            </w:tcBorders>
-            <w:tcMar>
-              <w:top w:type="dxa" w:w="80"/>
-              <w:left w:type="dxa" w:w="110"/>
-              <w:bottom w:type="dxa" w:w="80"/>
-              <w:right w:type="dxa" w:w="110"/>
-            </w:tcMar>
-          </w:tcPr>
-          <w:p>
-            <w:r>
-              <w:rPr>
-                <w:b w:val="false"/>
-                <w:bCs w:val="false"/>
-                <w:color w:val="222222"/>
-                <w:sz w:val="19"/>
-                <w:szCs w:val="19"/>
-              </w:rPr>
-              <w:t xml:space="preserve">The / Orange / Book</w:t>
-            </w:r>
-          </w:p>
-        </w:tc>
-      </w:tr>
-      <w:tr>
-        <w:tc>
-          <w:tcPr>
-            <w:tcW w:type="dxa" w:w="2500"/>
-            <w:tcBorders>
-              <w:top w:val="single" w:color="F0C9A8" w:sz="4"/>
-              <w:left w:val="single" w:color="F0C9A8" w:sz="4"/>
-              <w:bottom w:val="single" w:color="F0C9A8" w:sz="4"/>
-              <w:right w:val="single" w:color="F0C9A8" w:sz="4"/>
-            </w:tcBorders>
-            <w:tcMar>
-              <w:top w:type="dxa" w:w="80"/>
-              <w:left w:type="dxa" w:w="110"/>
-              <w:bottom w:type="dxa" w:w="80"/>
-              <w:right w:type="dxa" w:w="110"/>
-            </w:tcMar>
-          </w:tcPr>
-          <w:p>
-            <w:r>
-              <w:rPr>
-                <w:b/>
-                <w:bCs/>
-                <w:color w:val="222222"/>
-                <w:sz w:val="19"/>
-                <w:szCs w:val="19"/>
-              </w:rPr>
-              <w:t xml:space="preserve">Title</w:t>
-            </w:r>
-          </w:p>
-        </w:tc>
-        <w:tc>
-          <w:tcPr>
-            <w:tcW w:type="dxa" w:w="6526"/>
-            <w:tcBorders>
-              <w:top w:val="single" w:color="F0C9A8" w:sz="4"/>
-              <w:left w:val="single" w:color="F0C9A8" w:sz="4"/>
-              <w:bottom w:val="single" w:color="F0C9A8" w:sz="4"/>
-              <w:right w:val="single" w:color="F0C9A8" w:sz="4"/>
-            </w:tcBorders>
-            <w:tcMar>
-              <w:top w:type="dxa" w:w="80"/>
-              <w:left w:type="dxa" w:w="110"/>
-              <w:bottom w:type="dxa" w:w="80"/>
-              <w:right w:type="dxa" w:w="110"/>
-            </w:tcMar>
-          </w:tcPr>
-          <w:p>
-            <w:r>
-              <w:rPr>
-                <w:b w:val="false"/>
-                <w:bCs w:val="false"/>
-                <w:color w:val="222222"/>
-                <w:sz w:val="19"/>
-                <w:szCs w:val="19"/>
-              </w:rPr>
-              <w:t xml:space="preserve">The Sweet Pick</w:t>
-            </w:r>
-          </w:p>
-        </w:tc>
-      </w:tr>
-      <w:tr>
-        <w:tc>
-          <w:tcPr>
-            <w:tcW w:type="dxa" w:w="2500"/>
-            <w:tcBorders>
-              <w:top w:val="single" w:color="F0C9A8" w:sz="4"/>
-              <w:left w:val="single" w:color="F0C9A8" w:sz="4"/>
-              <w:bottom w:val="single" w:color="F0C9A8" w:sz="4"/>
-              <w:right w:val="single" w:color="F0C9A8" w:sz="4"/>
-            </w:tcBorders>
-            <w:tcMar>
-              <w:top w:type="dxa" w:w="80"/>
-              <w:left w:type="dxa" w:w="110"/>
-              <w:bottom w:type="dxa" w:w="80"/>
-              <w:right w:type="dxa" w:w="110"/>
-            </w:tcMar>
-          </w:tcPr>
-          <w:p>
-            <w:r>
-              <w:rPr>
-                <w:b/>
-                <w:bCs/>
-                <w:color w:val="222222"/>
-                <w:sz w:val="19"/>
-                <w:szCs w:val="19"/>
-              </w:rPr>
-              <w:t xml:space="preserve">Menu, first visit</w:t>
-            </w:r>
-          </w:p>
-        </w:tc>
-        <w:tc>
-          <w:tcPr>
-            <w:tcW w:type="dxa" w:w="6526"/>
-            <w:tcBorders>
-              <w:top w:val="single" w:color="F0C9A8" w:sz="4"/>
-              <w:left w:val="single" w:color="F0C9A8" w:sz="4"/>
-              <w:bottom w:val="single" w:color="F0C9A8" w:sz="4"/>
-              <w:right w:val="single" w:color="F0C9A8" w:sz="4"/>
-            </w:tcBorders>
-            <w:tcMar>
-              <w:top w:type="dxa" w:w="80"/>
-              <w:left w:type="dxa" w:w="110"/>
-              <w:bottom w:type="dxa" w:w="80"/>
-              <w:right w:type="dxa" w:w="110"/>
-            </w:tcMar>
-          </w:tcPr>
-          <w:p>
-            <w:r>
-              <w:rPr>
-                <w:b w:val="false"/>
-                <w:bCs w:val="false"/>
-                <w:color w:val="222222"/>
-                <w:sz w:val="19"/>
-                <w:szCs w:val="19"/>
-              </w:rPr>
-              <w:t xml:space="preserve">Play</w:t>
-            </w:r>
-          </w:p>
-        </w:tc>
-      </w:tr>
-      <w:tr>
-        <w:tc>
-          <w:tcPr>
-            <w:tcW w:type="dxa" w:w="2500"/>
-            <w:tcBorders>
-              <w:top w:val="single" w:color="F0C9A8" w:sz="4"/>
-              <w:left w:val="single" w:color="F0C9A8" w:sz="4"/>
-              <w:bottom w:val="single" w:color="F0C9A8" w:sz="4"/>
-              <w:right w:val="single" w:color="F0C9A8" w:sz="4"/>
-            </w:tcBorders>
-            <w:tcMar>
-              <w:top w:type="dxa" w:w="80"/>
-              <w:left w:type="dxa" w:w="110"/>
-              <w:bottom w:type="dxa" w:w="80"/>
-              <w:right w:type="dxa" w:w="110"/>
-            </w:tcMar>
-          </w:tcPr>
-          <w:p>
-            <w:r>
-              <w:rPr>
-                <w:b/>
-                <w:bCs/>
-                <w:color w:val="222222"/>
-                <w:sz w:val="19"/>
-                <w:szCs w:val="19"/>
-              </w:rPr>
-              <w:t xml:space="preserve">Menu, game in progress</w:t>
-            </w:r>
-          </w:p>
-        </w:tc>
-        <w:tc>
-          <w:tcPr>
-            <w:tcW w:type="dxa" w:w="6526"/>
-            <w:tcBorders>
-              <w:top w:val="single" w:color="F0C9A8" w:sz="4"/>
-              <w:left w:val="single" w:color="F0C9A8" w:sz="4"/>
-              <w:bottom w:val="single" w:color="F0C9A8" w:sz="4"/>
-              <w:right w:val="single" w:color="F0C9A8" w:sz="4"/>
-            </w:tcBorders>
-            <w:tcMar>
-              <w:top w:type="dxa" w:w="80"/>
-              <w:left w:type="dxa" w:w="110"/>
-              <w:bottom w:type="dxa" w:w="80"/>
-              <w:right w:type="dxa" w:w="110"/>
-            </w:tcMar>
-          </w:tcPr>
-          <w:p>
-            <w:r>
-              <w:rPr>
-                <w:b w:val="false"/>
-                <w:bCs w:val="false"/>
-                <w:color w:val="222222"/>
-                <w:sz w:val="19"/>
-                <w:szCs w:val="19"/>
-              </w:rPr>
-              <w:t xml:space="preserve">Continue — Pick {N} of 5 · New game</w:t>
-            </w:r>
-          </w:p>
-        </w:tc>
-      </w:tr>
-      <w:tr>
-        <w:tc>
-          <w:tcPr>
-            <w:tcW w:type="dxa" w:w="2500"/>
-            <w:tcBorders>
-              <w:top w:val="single" w:color="F0C9A8" w:sz="4"/>
-              <w:left w:val="single" w:color="F0C9A8" w:sz="4"/>
-              <w:bottom w:val="single" w:color="F0C9A8" w:sz="4"/>
-              <w:right w:val="single" w:color="F0C9A8" w:sz="4"/>
-            </w:tcBorders>
-            <w:tcMar>
-              <w:top w:type="dxa" w:w="80"/>
-              <w:left w:type="dxa" w:w="110"/>
-              <w:bottom w:type="dxa" w:w="80"/>
-              <w:right w:type="dxa" w:w="110"/>
-            </w:tcMar>
-          </w:tcPr>
-          <w:p>
-            <w:r>
-              <w:rPr>
-                <w:b/>
-                <w:bCs/>
-                <w:color w:val="222222"/>
-                <w:sz w:val="19"/>
-                <w:szCs w:val="19"/>
-              </w:rPr>
-              <w:t xml:space="preserve">Plate after a finished game</w:t>
-            </w:r>
-          </w:p>
-        </w:tc>
-        <w:tc>
-          <w:tcPr>
-            <w:tcW w:type="dxa" w:w="6526"/>
-            <w:tcBorders>
-              <w:top w:val="single" w:color="F0C9A8" w:sz="4"/>
-              <w:left w:val="single" w:color="F0C9A8" w:sz="4"/>
-              <w:bottom w:val="single" w:color="F0C9A8" w:sz="4"/>
-              <w:right w:val="single" w:color="F0C9A8" w:sz="4"/>
-            </w:tcBorders>
-            <w:tcMar>
-              <w:top w:type="dxa" w:w="80"/>
-              <w:left w:type="dxa" w:w="110"/>
-              <w:bottom w:type="dxa" w:w="80"/>
-              <w:right w:type="dxa" w:w="110"/>
-            </w:tcMar>
-          </w:tcPr>
-          <w:p>
-            <w:r>
-              <w:rPr>
-                <w:b w:val="false"/>
-                <w:bCs w:val="false"/>
-                <w:color w:val="222222"/>
-                <w:sz w:val="19"/>
-                <w:szCs w:val="19"/>
-              </w:rPr>
-              <w:t xml:space="preserve">Best run {N} of 5 · {Tag}</w:t>
-            </w:r>
-          </w:p>
-        </w:tc>
-      </w:tr>
-      <w:tr>
-        <w:tc>
-          <w:tcPr>
-            <w:tcW w:type="dxa" w:w="2500"/>
-            <w:tcBorders>
-              <w:top w:val="single" w:color="F0C9A8" w:sz="4"/>
-              <w:left w:val="single" w:color="F0C9A8" w:sz="4"/>
-              <w:bottom w:val="single" w:color="F0C9A8" w:sz="4"/>
-              <w:right w:val="single" w:color="F0C9A8" w:sz="4"/>
-            </w:tcBorders>
-            <w:tcMar>
-              <w:top w:type="dxa" w:w="80"/>
-              <w:left w:type="dxa" w:w="110"/>
-              <w:bottom w:type="dxa" w:w="80"/>
-              <w:right w:type="dxa" w:w="110"/>
-            </w:tcMar>
-          </w:tcPr>
-          <w:p>
-            <w:r>
-              <w:rPr>
-                <w:b/>
-                <w:bCs/>
-                <w:color w:val="222222"/>
-                <w:sz w:val="19"/>
-                <w:szCs w:val="19"/>
-              </w:rPr>
-              <w:t xml:space="preserve">Keyboard hint (desktop)</w:t>
-            </w:r>
-          </w:p>
-        </w:tc>
-        <w:tc>
-          <w:tcPr>
-            <w:tcW w:type="dxa" w:w="6526"/>
-            <w:tcBorders>
-              <w:top w:val="single" w:color="F0C9A8" w:sz="4"/>
-              <w:left w:val="single" w:color="F0C9A8" w:sz="4"/>
-              <w:bottom w:val="single" w:color="F0C9A8" w:sz="4"/>
-              <w:right w:val="single" w:color="F0C9A8" w:sz="4"/>
-            </w:tcBorders>
-            <w:tcMar>
-              <w:top w:type="dxa" w:w="80"/>
-              <w:left w:type="dxa" w:w="110"/>
-              <w:bottom w:type="dxa" w:w="80"/>
-              <w:right w:type="dxa" w:w="110"/>
-            </w:tcMar>
-          </w:tcPr>
-          <w:p>
-            <w:r>
-              <w:rPr>
-                <w:b w:val="false"/>
-                <w:bCs w:val="false"/>
-                <w:color w:val="222222"/>
-                <w:sz w:val="19"/>
-                <w:szCs w:val="19"/>
-              </w:rPr>
-              <w:t xml:space="preserve">▲ ▼ Select ↵ Enter</w:t>
-            </w:r>
-          </w:p>
-        </w:tc>
-      </w:tr>
-      <w:tr>
-        <w:tc>
-          <w:tcPr>
-            <w:tcW w:type="dxa" w:w="2500"/>
-            <w:tcBorders>
-              <w:top w:val="single" w:color="F0C9A8" w:sz="4"/>
-              <w:left w:val="single" w:color="F0C9A8" w:sz="4"/>
-              <w:bottom w:val="single" w:color="F0C9A8" w:sz="4"/>
-              <w:right w:val="single" w:color="F0C9A8" w:sz="4"/>
-            </w:tcBorders>
-            <w:tcMar>
-              <w:top w:type="dxa" w:w="80"/>
-              <w:left w:type="dxa" w:w="110"/>
-              <w:bottom w:type="dxa" w:w="80"/>
-              <w:right w:type="dxa" w:w="110"/>
-            </w:tcMar>
-          </w:tcPr>
-          <w:p>
-            <w:r>
-              <w:rPr>
-                <w:b/>
-                <w:bCs/>
-                <w:color w:val="222222"/>
-                <w:sz w:val="19"/>
-                <w:szCs w:val="19"/>
-              </w:rPr>
-              <w:t xml:space="preserve">Tap hint (phone)</w:t>
-            </w:r>
-          </w:p>
-        </w:tc>
-        <w:tc>
-          <w:tcPr>
-            <w:tcW w:type="dxa" w:w="6526"/>
-            <w:tcBorders>
-              <w:top w:val="single" w:color="F0C9A8" w:sz="4"/>
-              <w:left w:val="single" w:color="F0C9A8" w:sz="4"/>
-              <w:bottom w:val="single" w:color="F0C9A8" w:sz="4"/>
-              <w:right w:val="single" w:color="F0C9A8" w:sz="4"/>
-            </w:tcBorders>
-            <w:tcMar>
-              <w:top w:type="dxa" w:w="80"/>
-              <w:left w:type="dxa" w:w="110"/>
-              <w:bottom w:type="dxa" w:w="80"/>
-              <w:right w:type="dxa" w:w="110"/>
-            </w:tcMar>
-          </w:tcPr>
-          <w:p>
-            <w:r>
-              <w:rPr>
-                <w:b w:val="false"/>
-                <w:bCs w:val="false"/>
-                <w:color w:val="222222"/>
-                <w:sz w:val="19"/>
-                <w:szCs w:val="19"/>
-              </w:rPr>
-              <w:t xml:space="preserve">Tap a line to choose</w:t>
-            </w:r>
-          </w:p>
-        </w:tc>
-      </w:tr>
-      <w:tr>
-        <w:tc>
-          <w:tcPr>
-            <w:tcW w:type="dxa" w:w="2500"/>
-            <w:tcBorders>
-              <w:top w:val="single" w:color="F0C9A8" w:sz="4"/>
-              <w:left w:val="single" w:color="F0C9A8" w:sz="4"/>
-              <w:bottom w:val="single" w:color="F0C9A8" w:sz="4"/>
-              <w:right w:val="single" w:color="F0C9A8" w:sz="4"/>
-            </w:tcBorders>
-            <w:tcMar>
-              <w:top w:type="dxa" w:w="80"/>
-              <w:left w:type="dxa" w:w="110"/>
-              <w:bottom w:type="dxa" w:w="80"/>
-              <w:right w:type="dxa" w:w="110"/>
-            </w:tcMar>
-          </w:tcPr>
-          <w:p>
-            <w:r>
-              <w:rPr>
-                <w:b/>
-                <w:bCs/>
-                <w:color w:val="222222"/>
-                <w:sz w:val="19"/>
-                <w:szCs w:val="19"/>
-              </w:rPr>
-              <w:t xml:space="preserve">Hero illustration (alt text)</w:t>
-            </w:r>
-          </w:p>
-        </w:tc>
-        <w:tc>
-          <w:tcPr>
-            <w:tcW w:type="dxa" w:w="6526"/>
-            <w:tcBorders>
-              <w:top w:val="single" w:color="F0C9A8" w:sz="4"/>
-              <w:left w:val="single" w:color="F0C9A8" w:sz="4"/>
-              <w:bottom w:val="single" w:color="F0C9A8" w:sz="4"/>
-              <w:right w:val="single" w:color="F0C9A8" w:sz="4"/>
-            </w:tcBorders>
-            <w:tcMar>
-              <w:top w:type="dxa" w:w="80"/>
-              <w:left w:type="dxa" w:w="110"/>
-              <w:bottom w:type="dxa" w:w="80"/>
-              <w:right w:type="dxa" w:w="110"/>
-            </w:tcMar>
-          </w:tcPr>
-          <w:p>
-            <w:r>
-              <w:rPr>
-                <w:b w:val="false"/>
-                <w:bCs w:val="false"/>
-                <w:color w:val="222222"/>
-                <w:sz w:val="19"/>
-                <w:szCs w:val="19"/>
-              </w:rPr>
-              <w:t xml:space="preserve">An open box of twelve festive mithai, its lid set beside it</w:t>
-            </w:r>
-          </w:p>
-        </w:tc>
-      </w:tr>
-    </w:tbl>
-    <w:p>
-      <w:pPr>
-        <w:pStyle w:val="Heading1"/>
-        <w:spacing w:after="160" w:before="360"/>
-      </w:pPr>
-      <w:r>
-        <w:rPr>
-          <w:color w:val="F06423"/>
-        </w:rPr>
-        <w:t xml:space="preserve">4. Pick pages · shared elements</w:t>
-      </w:r>
-    </w:p>
-    <w:tbl>
-      <w:tblPr>
-        <w:tblW w:type="dxa" w:w="9026"/>
-        <w:tblBorders>
-          <w:top w:val="single" w:color="auto" w:sz="4"/>
-          <w:left w:val="single" w:color="auto" w:sz="4"/>
-          <w:bottom w:val="single" w:color="auto" w:sz="4"/>
-          <w:right w:val="single" w:color="auto" w:sz="4"/>
-          <w:insideH w:val="single" w:color="auto" w:sz="4"/>
-          <w:insideV w:val="single" w:color="auto" w:sz="4"/>
-        </w:tblBorders>
-      </w:tblPr>
-      <w:tblGrid>
-        <w:gridCol w:w="2500"/>
-        <w:gridCol w:w="6526"/>
-      </w:tblGrid>
-      <w:tr>
-        <w:trPr>
-          <w:tblHeader/>
-        </w:trPr>
-        <w:tc>
-          <w:tcPr>
-            <w:tcW w:type="dxa" w:w="2500"/>
-            <w:tcBorders>
-              <w:top w:val="single" w:color="F0C9A8" w:sz="4"/>
-              <w:left w:val="single" w:color="F0C9A8" w:sz="4"/>
-              <w:bottom w:val="single" w:color="F0C9A8" w:sz="4"/>
-              <w:right w:val="single" w:color="F0C9A8" w:sz="4"/>
-            </w:tcBorders>
-            <w:shd w:fill="FFF3E6" w:color="auto" w:val="clear"/>
-            <w:tcMar>
-              <w:top w:type="dxa" w:w="80"/>
-              <w:left w:type="dxa" w:w="110"/>
-              <w:bottom w:type="dxa" w:w="80"/>
-              <w:right w:type="dxa" w:w="110"/>
-            </w:tcMar>
-          </w:tcPr>
-          <w:p>
-            <w:r>
-              <w:rPr>
-                <w:b/>
-                <w:bCs/>
-                <w:color w:val="183E6D"/>
-                <w:sz w:val="19"/>
-                <w:szCs w:val="19"/>
-              </w:rPr>
-              <w:t xml:space="preserve">Element</w:t>
-            </w:r>
-          </w:p>
-        </w:tc>
-        <w:tc>
-          <w:tcPr>
-            <w:tcW w:type="dxa" w:w="6526"/>
-            <w:tcBorders>
-              <w:top w:val="single" w:color="F0C9A8" w:sz="4"/>
-              <w:left w:val="single" w:color="F0C9A8" w:sz="4"/>
-              <w:bottom w:val="single" w:color="F0C9A8" w:sz="4"/>
-              <w:right w:val="single" w:color="F0C9A8" w:sz="4"/>
-            </w:tcBorders>
-            <w:shd w:fill="FFF3E6" w:color="auto" w:val="clear"/>
-            <w:tcMar>
-              <w:top w:type="dxa" w:w="80"/>
-              <w:left w:type="dxa" w:w="110"/>
-              <w:bottom w:type="dxa" w:w="80"/>
-              <w:right w:type="dxa" w:w="110"/>
-            </w:tcMar>
-          </w:tcPr>
-          <w:p>
-            <w:r>
-              <w:rPr>
-                <w:b/>
-                <w:bCs/>
-                <w:color w:val="183E6D"/>
-                <w:sz w:val="19"/>
-                <w:szCs w:val="19"/>
-              </w:rPr>
-              <w:t xml:space="preserve">Copy</w:t>
-            </w:r>
-          </w:p>
-        </w:tc>
-      </w:tr>
-      <w:tr>
-        <w:tc>
-          <w:tcPr>
-            <w:tcW w:type="dxa" w:w="2500"/>
-            <w:tcBorders>
-              <w:top w:val="single" w:color="F0C9A8" w:sz="4"/>
-              <w:left w:val="single" w:color="F0C9A8" w:sz="4"/>
-              <w:bottom w:val="single" w:color="F0C9A8" w:sz="4"/>
-              <w:right w:val="single" w:color="F0C9A8" w:sz="4"/>
-            </w:tcBorders>
-            <w:tcMar>
-              <w:top w:type="dxa" w:w="80"/>
-              <w:left w:type="dxa" w:w="110"/>
-              <w:bottom w:type="dxa" w:w="80"/>
-              <w:right w:type="dxa" w:w="110"/>
-            </w:tcMar>
-          </w:tcPr>
-          <w:p>
-            <w:r>
-              <w:rPr>
-                <w:b/>
-                <w:bCs/>
-                <w:color w:val="222222"/>
-                <w:sz w:val="19"/>
-                <w:szCs w:val="19"/>
-              </w:rPr>
-              <w:t xml:space="preserve">Page number</w:t>
-            </w:r>
-          </w:p>
-        </w:tc>
-        <w:tc>
-          <w:tcPr>
-            <w:tcW w:type="dxa" w:w="6526"/>
-            <w:tcBorders>
-              <w:top w:val="single" w:color="F0C9A8" w:sz="4"/>
-              <w:left w:val="single" w:color="F0C9A8" w:sz="4"/>
-              <w:bottom w:val="single" w:color="F0C9A8" w:sz="4"/>
-              <w:right w:val="single" w:color="F0C9A8" w:sz="4"/>
-            </w:tcBorders>
-            <w:tcMar>
-              <w:top w:type="dxa" w:w="80"/>
-              <w:left w:type="dxa" w:w="110"/>
-              <w:bottom w:type="dxa" w:w="80"/>
-              <w:right w:type="dxa" w:w="110"/>
-            </w:tcMar>
-          </w:tcPr>
-          <w:p>
-            <w:r>
-              <w:rPr>
-                <w:b w:val="false"/>
-                <w:bCs w:val="false"/>
-                <w:color w:val="222222"/>
-                <w:sz w:val="19"/>
-                <w:szCs w:val="19"/>
-              </w:rPr>
-              <w:t xml:space="preserve">The Sweet Pick · Pick {N} of 5</w:t>
             </w:r>
           </w:p>
         </w:tc>
@@ -7770,7 +7361,7 @@
         <w:rPr>
           <w:color w:val="F06423"/>
         </w:rPr>
-        <w:t xml:space="preserve">10. Last page</w:t>
+        <w:t xml:space="preserve">9. Last page</w:t>
       </w:r>
     </w:p>
     <w:tbl>
@@ -8149,7 +7740,7 @@
                 <w:sz w:val="19"/>
                 <w:szCs w:val="19"/>
               </w:rPr>
-              <w:t xml:space="preserve">THE ORANGE BOOK · VOL. 65</w:t>
+              <w:t xml:space="preserve">THE ORANGE BOOK</w:t>
             </w:r>
           </w:p>
         </w:tc>
@@ -9446,66 +9037,6 @@
                 <w:sz w:val="19"/>
                 <w:szCs w:val="19"/>
               </w:rPr>
-              <w:t xml:space="preserve">Top right</w:t>
-            </w:r>
-          </w:p>
-        </w:tc>
-        <w:tc>
-          <w:tcPr>
-            <w:tcW w:type="dxa" w:w="6526"/>
-            <w:tcBorders>
-              <w:top w:val="single" w:color="F0C9A8" w:sz="4"/>
-              <w:left w:val="single" w:color="F0C9A8" w:sz="4"/>
-              <w:bottom w:val="single" w:color="F0C9A8" w:sz="4"/>
-              <w:right w:val="single" w:color="F0C9A8" w:sz="4"/>
-            </w:tcBorders>
-            <w:tcMar>
-              <w:top w:type="dxa" w:w="80"/>
-              <w:left w:type="dxa" w:w="110"/>
-              <w:bottom w:type="dxa" w:w="80"/>
-              <w:right w:type="dxa" w:w="110"/>
-            </w:tcMar>
-          </w:tcPr>
-          <w:p>
-            <w:r>
-              <w:rPr>
-                <w:b w:val="false"/>
-                <w:bCs w:val="false"/>
-                <w:color w:val="222222"/>
-                <w:sz w:val="19"/>
-                <w:szCs w:val="19"/>
-              </w:rPr>
-              <w:t xml:space="preserve">OCTOBER 2026 | VOL. 65</w:t>
-            </w:r>
-          </w:p>
-        </w:tc>
-      </w:tr>
-      <w:tr>
-        <w:tc>
-          <w:tcPr>
-            <w:tcW w:type="dxa" w:w="2500"/>
-            <w:tcBorders>
-              <w:top w:val="single" w:color="F0C9A8" w:sz="4"/>
-              <w:left w:val="single" w:color="F0C9A8" w:sz="4"/>
-              <w:bottom w:val="single" w:color="F0C9A8" w:sz="4"/>
-              <w:right w:val="single" w:color="F0C9A8" w:sz="4"/>
-            </w:tcBorders>
-            <w:tcMar>
-              <w:top w:type="dxa" w:w="80"/>
-              <w:left w:type="dxa" w:w="110"/>
-              <w:bottom w:type="dxa" w:w="80"/>
-              <w:right w:type="dxa" w:w="110"/>
-            </w:tcMar>
-          </w:tcPr>
-          <w:p>
-            <w:r>
-              <w:rPr>
-                <w:b/>
-                <w:bCs/>
-                <w:color w:val="222222"/>
-                <w:sz w:val="19"/>
-                <w:szCs w:val="19"/>
-              </w:rPr>
               <w:t xml:space="preserve">Seal</w:t>
             </w:r>
           </w:p>
@@ -9535,7 +9066,7 @@
                 <w:sz w:val="19"/>
                 <w:szCs w:val="19"/>
               </w:rPr>
-              <w:t xml:space="preserve">THE SWEET PICK · {Tag} · THE ORANGE BOOK · VOL. 65</w:t>
+              <w:t xml:space="preserve">THE SWEET PICK · {Tag} · THE ORANGE BOOK</w:t>
             </w:r>
           </w:p>
         </w:tc>
@@ -10004,7 +9535,7 @@
         <w:rPr>
           <w:color w:val="F06423"/>
         </w:rPr>
-        <w:t xml:space="preserve">11. Feedback page</w:t>
+        <w:t xml:space="preserve">10. Feedback page</w:t>
       </w:r>
     </w:p>
     <w:p>
@@ -10523,66 +10054,6 @@
           </w:p>
         </w:tc>
       </w:tr>
-      <w:tr>
-        <w:tc>
-          <w:tcPr>
-            <w:tcW w:type="dxa" w:w="2500"/>
-            <w:tcBorders>
-              <w:top w:val="single" w:color="F0C9A8" w:sz="4"/>
-              <w:left w:val="single" w:color="F0C9A8" w:sz="4"/>
-              <w:bottom w:val="single" w:color="F0C9A8" w:sz="4"/>
-              <w:right w:val="single" w:color="F0C9A8" w:sz="4"/>
-            </w:tcBorders>
-            <w:tcMar>
-              <w:top w:type="dxa" w:w="80"/>
-              <w:left w:type="dxa" w:w="110"/>
-              <w:bottom w:type="dxa" w:w="80"/>
-              <w:right w:type="dxa" w:w="110"/>
-            </w:tcMar>
-          </w:tcPr>
-          <w:p>
-            <w:r>
-              <w:rPr>
-                <w:b/>
-                <w:bCs/>
-                <w:color w:val="222222"/>
-                <w:sz w:val="19"/>
-                <w:szCs w:val="19"/>
-              </w:rPr>
-              <w:t xml:space="preserve">Footer</w:t>
-            </w:r>
-          </w:p>
-        </w:tc>
-        <w:tc>
-          <w:tcPr>
-            <w:tcW w:type="dxa" w:w="6526"/>
-            <w:tcBorders>
-              <w:top w:val="single" w:color="F0C9A8" w:sz="4"/>
-              <w:left w:val="single" w:color="F0C9A8" w:sz="4"/>
-              <w:bottom w:val="single" w:color="F0C9A8" w:sz="4"/>
-              <w:right w:val="single" w:color="F0C9A8" w:sz="4"/>
-            </w:tcBorders>
-            <w:tcMar>
-              <w:top w:type="dxa" w:w="80"/>
-              <w:left w:type="dxa" w:w="110"/>
-              <w:bottom w:type="dxa" w:w="80"/>
-              <w:right w:type="dxa" w:w="110"/>
-            </w:tcMar>
-          </w:tcPr>
-          <w:p>
-            <w:r>
-              <w:rPr>
-                <w:b w:val="false"/>
-                <w:bCs w:val="false"/>
-                <w:color w:val="222222"/>
-                <w:sz w:val="19"/>
-                <w:szCs w:val="19"/>
-              </w:rPr>
-              <w:t xml:space="preserve">OCTOBER 2026 | VOL. 65</w:t>
-            </w:r>
-          </w:p>
-        </w:tc>
-      </w:tr>
     </w:tbl>
     <w:p>
       <w:pPr>
@@ -10593,7 +10064,7 @@
         <w:rPr>
           <w:color w:val="F06423"/>
         </w:rPr>
-        <w:t xml:space="preserve">12. Screen-reader-only labels</w:t>
+        <w:t xml:space="preserve">11. Screen-reader-only labels</w:t>
       </w:r>
     </w:p>
     <w:p>

</xml_diff>

<commit_message>
The WhatsApp button goes; the share sheet already offers it
One button under the line. Nothing is lost: on a phone the share sheet
lists WhatsApp itself, and where the sheet is refused the button already
falls back to WhatsApp directly, so that route stays open either way.

The test that read the button's own href now watches both paths the share
takes — navigator.share where it is allowed, and the WhatsApp anchor where
it is not — so it reads the message whichever one fires.

Co-Authored-By: Claude Opus 5 <noreply@anthropic.com>
Claude-Session: https://claude.ai/code/session_012sQsmGULLFzjfa9SrQhDjc
</commit_message>
<xml_diff>
--- a/content/The-Sweet-Pick-Copy.docx
+++ b/content/The-Sweet-Pick-Copy.docx
@@ -8101,66 +8101,6 @@
                 <w:szCs w:val="19"/>
               </w:rPr>
               <w:t xml:space="preserve">Send festive wishes</w:t>
-            </w:r>
-          </w:p>
-        </w:tc>
-      </w:tr>
-      <w:tr>
-        <w:tc>
-          <w:tcPr>
-            <w:tcW w:type="dxa" w:w="2500"/>
-            <w:tcBorders>
-              <w:top w:val="single" w:color="F0C9A8" w:sz="4"/>
-              <w:left w:val="single" w:color="F0C9A8" w:sz="4"/>
-              <w:bottom w:val="single" w:color="F0C9A8" w:sz="4"/>
-              <w:right w:val="single" w:color="F0C9A8" w:sz="4"/>
-            </w:tcBorders>
-            <w:tcMar>
-              <w:top w:type="dxa" w:w="80"/>
-              <w:left w:type="dxa" w:w="110"/>
-              <w:bottom w:type="dxa" w:w="80"/>
-              <w:right w:type="dxa" w:w="110"/>
-            </w:tcMar>
-          </w:tcPr>
-          <w:p>
-            <w:r>
-              <w:rPr>
-                <w:b/>
-                <w:bCs/>
-                <w:color w:val="222222"/>
-                <w:sz w:val="19"/>
-                <w:szCs w:val="19"/>
-              </w:rPr>
-              <w:t xml:space="preserve">WhatsApp button</w:t>
-            </w:r>
-          </w:p>
-        </w:tc>
-        <w:tc>
-          <w:tcPr>
-            <w:tcW w:type="dxa" w:w="6526"/>
-            <w:tcBorders>
-              <w:top w:val="single" w:color="F0C9A8" w:sz="4"/>
-              <w:left w:val="single" w:color="F0C9A8" w:sz="4"/>
-              <w:bottom w:val="single" w:color="F0C9A8" w:sz="4"/>
-              <w:right w:val="single" w:color="F0C9A8" w:sz="4"/>
-            </w:tcBorders>
-            <w:tcMar>
-              <w:top w:type="dxa" w:w="80"/>
-              <w:left w:type="dxa" w:w="110"/>
-              <w:bottom w:type="dxa" w:w="80"/>
-              <w:right w:type="dxa" w:w="110"/>
-            </w:tcMar>
-          </w:tcPr>
-          <w:p>
-            <w:r>
-              <w:rPr>
-                <w:b w:val="false"/>
-                <w:bCs w:val="false"/>
-                <w:color w:val="222222"/>
-                <w:sz w:val="19"/>
-                <w:szCs w:val="19"/>
-              </w:rPr>
-              <w:t xml:space="preserve">WhatsApp</w:t>
             </w:r>
           </w:p>
         </w:tc>

</xml_diff>

<commit_message>
The share ask follows the closing thought rather than interrupting it
On the last page the invitation to pass the edition on sat between the tally and
the two paragraphs that say what the game was for, so the reader was asked to
share before being told what they were sharing. The lead, the button and the
greeting card now come after those paragraphs, still above the Orange Book
send-off, and the lead has been given air above it now that it follows body copy.

The reveal watches the share row by selector rather than by position, so it still
lands as the reader reaches it. The copy deck follows the page's order.

Co-Authored-By: Claude Opus 5 <noreply@anthropic.com>
Claude-Session: https://claude.ai/code/session_012sQsmGULLFzjfa9SrQhDjc
</commit_message>
<xml_diff>
--- a/content/The-Sweet-Pick-Copy.docx
+++ b/content/The-Sweet-Pick-Copy.docx
@@ -8011,7 +8011,127 @@
                 <w:sz w:val="19"/>
                 <w:szCs w:val="19"/>
               </w:rPr>
-              <w:t xml:space="preserve">Line above the buttons</w:t>
+              <w:t xml:space="preserve">Send-off</w:t>
+            </w:r>
+          </w:p>
+        </w:tc>
+        <w:tc>
+          <w:tcPr>
+            <w:tcW w:type="dxa" w:w="6526"/>
+            <w:tcBorders>
+              <w:top w:val="single" w:color="F0C9A8" w:sz="4"/>
+              <w:left w:val="single" w:color="F0C9A8" w:sz="4"/>
+              <w:bottom w:val="single" w:color="F0C9A8" w:sz="4"/>
+              <w:right w:val="single" w:color="F0C9A8" w:sz="4"/>
+            </w:tcBorders>
+            <w:tcMar>
+              <w:top w:type="dxa" w:w="80"/>
+              <w:left w:type="dxa" w:w="110"/>
+              <w:bottom w:type="dxa" w:w="80"/>
+              <w:right w:type="dxa" w:w="110"/>
+            </w:tcMar>
+          </w:tcPr>
+          <w:p>
+            <w:r>
+              <w:rPr>
+                <w:b w:val="false"/>
+                <w:bCs w:val="false"/>
+                <w:color w:val="222222"/>
+                <w:sz w:val="19"/>
+                <w:szCs w:val="19"/>
+              </w:rPr>
+              <w:t xml:space="preserve">The festive season is a time for happiness, celebration and shopping. But biases can quietly find their way into our decisions and sometimes make us spend more than we planned.</w:t>
+            </w:r>
+          </w:p>
+        </w:tc>
+      </w:tr>
+      <w:tr>
+        <w:tc>
+          <w:tcPr>
+            <w:tcW w:type="dxa" w:w="2500"/>
+            <w:tcBorders>
+              <w:top w:val="single" w:color="F0C9A8" w:sz="4"/>
+              <w:left w:val="single" w:color="F0C9A8" w:sz="4"/>
+              <w:bottom w:val="single" w:color="F0C9A8" w:sz="4"/>
+              <w:right w:val="single" w:color="F0C9A8" w:sz="4"/>
+            </w:tcBorders>
+            <w:tcMar>
+              <w:top w:type="dxa" w:w="80"/>
+              <w:left w:type="dxa" w:w="110"/>
+              <w:bottom w:type="dxa" w:w="80"/>
+              <w:right w:type="dxa" w:w="110"/>
+            </w:tcMar>
+          </w:tcPr>
+          <w:p>
+            <w:r>
+              <w:rPr>
+                <w:b/>
+                <w:bCs/>
+                <w:color w:val="222222"/>
+                <w:sz w:val="19"/>
+                <w:szCs w:val="19"/>
+              </w:rPr>
+              <w:t xml:space="preserve">Send-off, second paragraph</w:t>
+            </w:r>
+          </w:p>
+        </w:tc>
+        <w:tc>
+          <w:tcPr>
+            <w:tcW w:type="dxa" w:w="6526"/>
+            <w:tcBorders>
+              <w:top w:val="single" w:color="F0C9A8" w:sz="4"/>
+              <w:left w:val="single" w:color="F0C9A8" w:sz="4"/>
+              <w:bottom w:val="single" w:color="F0C9A8" w:sz="4"/>
+              <w:right w:val="single" w:color="F0C9A8" w:sz="4"/>
+            </w:tcBorders>
+            <w:tcMar>
+              <w:top w:type="dxa" w:w="80"/>
+              <w:left w:type="dxa" w:w="110"/>
+              <w:bottom w:type="dxa" w:w="80"/>
+              <w:right w:type="dxa" w:w="110"/>
+            </w:tcMar>
+          </w:tcPr>
+          <w:p>
+            <w:r>
+              <w:rPr>
+                <w:b w:val="false"/>
+                <w:bCs w:val="false"/>
+                <w:color w:val="222222"/>
+                <w:sz w:val="19"/>
+                <w:szCs w:val="19"/>
+              </w:rPr>
+              <w:t xml:space="preserve">The idea is not to stop enjoying the season. It is simply to notice what may be shaping a choice, pause when it matters and strike the right balance, always.</w:t>
+            </w:r>
+          </w:p>
+        </w:tc>
+      </w:tr>
+      <w:tr>
+        <w:tc>
+          <w:tcPr>
+            <w:tcW w:type="dxa" w:w="2500"/>
+            <w:tcBorders>
+              <w:top w:val="single" w:color="F0C9A8" w:sz="4"/>
+              <w:left w:val="single" w:color="F0C9A8" w:sz="4"/>
+              <w:bottom w:val="single" w:color="F0C9A8" w:sz="4"/>
+              <w:right w:val="single" w:color="F0C9A8" w:sz="4"/>
+            </w:tcBorders>
+            <w:tcMar>
+              <w:top w:type="dxa" w:w="80"/>
+              <w:left w:type="dxa" w:w="110"/>
+              <w:bottom w:type="dxa" w:w="80"/>
+              <w:right w:type="dxa" w:w="110"/>
+            </w:tcMar>
+          </w:tcPr>
+          <w:p>
+            <w:r>
+              <w:rPr>
+                <w:b/>
+                <w:bCs/>
+                <w:color w:val="222222"/>
+                <w:sz w:val="19"/>
+                <w:szCs w:val="19"/>
+              </w:rPr>
+              <w:t xml:space="preserve">Line above the share button</w:t>
             </w:r>
           </w:p>
         </w:tc>
@@ -8131,6 +8251,66 @@
                 <w:sz w:val="19"/>
                 <w:szCs w:val="19"/>
               </w:rPr>
+              <w:t xml:space="preserve">Greeting card (alt text)</w:t>
+            </w:r>
+          </w:p>
+        </w:tc>
+        <w:tc>
+          <w:tcPr>
+            <w:tcW w:type="dxa" w:w="6526"/>
+            <w:tcBorders>
+              <w:top w:val="single" w:color="F0C9A8" w:sz="4"/>
+              <w:left w:val="single" w:color="F0C9A8" w:sz="4"/>
+              <w:bottom w:val="single" w:color="F0C9A8" w:sz="4"/>
+              <w:right w:val="single" w:color="F0C9A8" w:sz="4"/>
+            </w:tcBorders>
+            <w:tcMar>
+              <w:top w:type="dxa" w:w="80"/>
+              <w:left w:type="dxa" w:w="110"/>
+              <w:bottom w:type="dxa" w:w="80"/>
+              <w:right w:type="dxa" w:w="110"/>
+            </w:tcMar>
+          </w:tcPr>
+          <w:p>
+            <w:r>
+              <w:rPr>
+                <w:b w:val="false"/>
+                <w:bCs w:val="false"/>
+                <w:color w:val="222222"/>
+                <w:sz w:val="19"/>
+                <w:szCs w:val="19"/>
+              </w:rPr>
+              <w:t xml:space="preserve">Your festive greeting card from The Sweet Pick</w:t>
+            </w:r>
+          </w:p>
+        </w:tc>
+      </w:tr>
+      <w:tr>
+        <w:tc>
+          <w:tcPr>
+            <w:tcW w:type="dxa" w:w="2500"/>
+            <w:tcBorders>
+              <w:top w:val="single" w:color="F0C9A8" w:sz="4"/>
+              <w:left w:val="single" w:color="F0C9A8" w:sz="4"/>
+              <w:bottom w:val="single" w:color="F0C9A8" w:sz="4"/>
+              <w:right w:val="single" w:color="F0C9A8" w:sz="4"/>
+            </w:tcBorders>
+            <w:tcMar>
+              <w:top w:type="dxa" w:w="80"/>
+              <w:left w:type="dxa" w:w="110"/>
+              <w:bottom w:type="dxa" w:w="80"/>
+              <w:right w:type="dxa" w:w="110"/>
+            </w:tcMar>
+          </w:tcPr>
+          <w:p>
+            <w:r>
+              <w:rPr>
+                <w:b/>
+                <w:bCs/>
+                <w:color w:val="222222"/>
+                <w:sz w:val="19"/>
+                <w:szCs w:val="19"/>
+              </w:rPr>
               <w:t xml:space="preserve">Save link (under the card)</w:t>
             </w:r>
           </w:p>
@@ -8161,186 +8341,6 @@
                 <w:szCs w:val="19"/>
               </w:rPr>
               <w:t xml:space="preserve">Save image</w:t>
-            </w:r>
-          </w:p>
-        </w:tc>
-      </w:tr>
-      <w:tr>
-        <w:tc>
-          <w:tcPr>
-            <w:tcW w:type="dxa" w:w="2500"/>
-            <w:tcBorders>
-              <w:top w:val="single" w:color="F0C9A8" w:sz="4"/>
-              <w:left w:val="single" w:color="F0C9A8" w:sz="4"/>
-              <w:bottom w:val="single" w:color="F0C9A8" w:sz="4"/>
-              <w:right w:val="single" w:color="F0C9A8" w:sz="4"/>
-            </w:tcBorders>
-            <w:tcMar>
-              <w:top w:type="dxa" w:w="80"/>
-              <w:left w:type="dxa" w:w="110"/>
-              <w:bottom w:type="dxa" w:w="80"/>
-              <w:right w:type="dxa" w:w="110"/>
-            </w:tcMar>
-          </w:tcPr>
-          <w:p>
-            <w:r>
-              <w:rPr>
-                <w:b/>
-                <w:bCs/>
-                <w:color w:val="222222"/>
-                <w:sz w:val="19"/>
-                <w:szCs w:val="19"/>
-              </w:rPr>
-              <w:t xml:space="preserve">Greeting card (alt text)</w:t>
-            </w:r>
-          </w:p>
-        </w:tc>
-        <w:tc>
-          <w:tcPr>
-            <w:tcW w:type="dxa" w:w="6526"/>
-            <w:tcBorders>
-              <w:top w:val="single" w:color="F0C9A8" w:sz="4"/>
-              <w:left w:val="single" w:color="F0C9A8" w:sz="4"/>
-              <w:bottom w:val="single" w:color="F0C9A8" w:sz="4"/>
-              <w:right w:val="single" w:color="F0C9A8" w:sz="4"/>
-            </w:tcBorders>
-            <w:tcMar>
-              <w:top w:type="dxa" w:w="80"/>
-              <w:left w:type="dxa" w:w="110"/>
-              <w:bottom w:type="dxa" w:w="80"/>
-              <w:right w:type="dxa" w:w="110"/>
-            </w:tcMar>
-          </w:tcPr>
-          <w:p>
-            <w:r>
-              <w:rPr>
-                <w:b w:val="false"/>
-                <w:bCs w:val="false"/>
-                <w:color w:val="222222"/>
-                <w:sz w:val="19"/>
-                <w:szCs w:val="19"/>
-              </w:rPr>
-              <w:t xml:space="preserve">Your festive greeting card from The Sweet Pick</w:t>
-            </w:r>
-          </w:p>
-        </w:tc>
-      </w:tr>
-      <w:tr>
-        <w:tc>
-          <w:tcPr>
-            <w:tcW w:type="dxa" w:w="2500"/>
-            <w:tcBorders>
-              <w:top w:val="single" w:color="F0C9A8" w:sz="4"/>
-              <w:left w:val="single" w:color="F0C9A8" w:sz="4"/>
-              <w:bottom w:val="single" w:color="F0C9A8" w:sz="4"/>
-              <w:right w:val="single" w:color="F0C9A8" w:sz="4"/>
-            </w:tcBorders>
-            <w:tcMar>
-              <w:top w:type="dxa" w:w="80"/>
-              <w:left w:type="dxa" w:w="110"/>
-              <w:bottom w:type="dxa" w:w="80"/>
-              <w:right w:type="dxa" w:w="110"/>
-            </w:tcMar>
-          </w:tcPr>
-          <w:p>
-            <w:r>
-              <w:rPr>
-                <w:b/>
-                <w:bCs/>
-                <w:color w:val="222222"/>
-                <w:sz w:val="19"/>
-                <w:szCs w:val="19"/>
-              </w:rPr>
-              <w:t xml:space="preserve">Send-off</w:t>
-            </w:r>
-          </w:p>
-        </w:tc>
-        <w:tc>
-          <w:tcPr>
-            <w:tcW w:type="dxa" w:w="6526"/>
-            <w:tcBorders>
-              <w:top w:val="single" w:color="F0C9A8" w:sz="4"/>
-              <w:left w:val="single" w:color="F0C9A8" w:sz="4"/>
-              <w:bottom w:val="single" w:color="F0C9A8" w:sz="4"/>
-              <w:right w:val="single" w:color="F0C9A8" w:sz="4"/>
-            </w:tcBorders>
-            <w:tcMar>
-              <w:top w:type="dxa" w:w="80"/>
-              <w:left w:type="dxa" w:w="110"/>
-              <w:bottom w:type="dxa" w:w="80"/>
-              <w:right w:type="dxa" w:w="110"/>
-            </w:tcMar>
-          </w:tcPr>
-          <w:p>
-            <w:r>
-              <w:rPr>
-                <w:b w:val="false"/>
-                <w:bCs w:val="false"/>
-                <w:color w:val="222222"/>
-                <w:sz w:val="19"/>
-                <w:szCs w:val="19"/>
-              </w:rPr>
-              <w:t xml:space="preserve">The festive season is a time for happiness, celebration and shopping. But biases can quietly find their way into our decisions and sometimes make us spend more than we planned.</w:t>
-            </w:r>
-          </w:p>
-        </w:tc>
-      </w:tr>
-      <w:tr>
-        <w:tc>
-          <w:tcPr>
-            <w:tcW w:type="dxa" w:w="2500"/>
-            <w:tcBorders>
-              <w:top w:val="single" w:color="F0C9A8" w:sz="4"/>
-              <w:left w:val="single" w:color="F0C9A8" w:sz="4"/>
-              <w:bottom w:val="single" w:color="F0C9A8" w:sz="4"/>
-              <w:right w:val="single" w:color="F0C9A8" w:sz="4"/>
-            </w:tcBorders>
-            <w:tcMar>
-              <w:top w:type="dxa" w:w="80"/>
-              <w:left w:type="dxa" w:w="110"/>
-              <w:bottom w:type="dxa" w:w="80"/>
-              <w:right w:type="dxa" w:w="110"/>
-            </w:tcMar>
-          </w:tcPr>
-          <w:p>
-            <w:r>
-              <w:rPr>
-                <w:b/>
-                <w:bCs/>
-                <w:color w:val="222222"/>
-                <w:sz w:val="19"/>
-                <w:szCs w:val="19"/>
-              </w:rPr>
-              <w:t xml:space="preserve">Send-off, second paragraph</w:t>
-            </w:r>
-          </w:p>
-        </w:tc>
-        <w:tc>
-          <w:tcPr>
-            <w:tcW w:type="dxa" w:w="6526"/>
-            <w:tcBorders>
-              <w:top w:val="single" w:color="F0C9A8" w:sz="4"/>
-              <w:left w:val="single" w:color="F0C9A8" w:sz="4"/>
-              <w:bottom w:val="single" w:color="F0C9A8" w:sz="4"/>
-              <w:right w:val="single" w:color="F0C9A8" w:sz="4"/>
-            </w:tcBorders>
-            <w:tcMar>
-              <w:top w:type="dxa" w:w="80"/>
-              <w:left w:type="dxa" w:w="110"/>
-              <w:bottom w:type="dxa" w:w="80"/>
-              <w:right w:type="dxa" w:w="110"/>
-            </w:tcMar>
-          </w:tcPr>
-          <w:p>
-            <w:r>
-              <w:rPr>
-                <w:b w:val="false"/>
-                <w:bCs w:val="false"/>
-                <w:color w:val="222222"/>
-                <w:sz w:val="19"/>
-                <w:szCs w:val="19"/>
-              </w:rPr>
-              <w:t xml:space="preserve">The idea is not to stop enjoying the season. It is simply to notice what may be shaping a choice, pause when it matters and strike the right balance, always.</w:t>
             </w:r>
           </w:p>
         </w:tc>

</xml_diff>

<commit_message>
The card stands on its own: the Save image link goes
The share sheet already offers a save, and where there is no share sheet the card
is put in view to be held and saved. The link under it, and the downloads
capability it was reaching for inside the claude.ai viewer, were doing that job
twice.

Co-Authored-By: Claude Opus 5 <noreply@anthropic.com>
Claude-Session: https://claude.ai/code/session_012sQsmGULLFzjfa9SrQhDjc
</commit_message>
<xml_diff>
--- a/content/The-Sweet-Pick-Copy.docx
+++ b/content/The-Sweet-Pick-Copy.docx
@@ -8041,66 +8041,6 @@
                 <w:szCs w:val="19"/>
               </w:rPr>
               <w:t xml:space="preserve">Your festive greeting card from The Sweet Pick</w:t>
-            </w:r>
-          </w:p>
-        </w:tc>
-      </w:tr>
-      <w:tr>
-        <w:tc>
-          <w:tcPr>
-            <w:tcW w:type="dxa" w:w="2500"/>
-            <w:tcBorders>
-              <w:top w:val="single" w:color="F0C9A8" w:sz="4"/>
-              <w:left w:val="single" w:color="F0C9A8" w:sz="4"/>
-              <w:bottom w:val="single" w:color="F0C9A8" w:sz="4"/>
-              <w:right w:val="single" w:color="F0C9A8" w:sz="4"/>
-            </w:tcBorders>
-            <w:tcMar>
-              <w:top w:type="dxa" w:w="80"/>
-              <w:left w:type="dxa" w:w="110"/>
-              <w:bottom w:type="dxa" w:w="80"/>
-              <w:right w:type="dxa" w:w="110"/>
-            </w:tcMar>
-          </w:tcPr>
-          <w:p>
-            <w:r>
-              <w:rPr>
-                <w:b/>
-                <w:bCs/>
-                <w:color w:val="222222"/>
-                <w:sz w:val="19"/>
-                <w:szCs w:val="19"/>
-              </w:rPr>
-              <w:t xml:space="preserve">Save link (under the card)</w:t>
-            </w:r>
-          </w:p>
-        </w:tc>
-        <w:tc>
-          <w:tcPr>
-            <w:tcW w:type="dxa" w:w="6526"/>
-            <w:tcBorders>
-              <w:top w:val="single" w:color="F0C9A8" w:sz="4"/>
-              <w:left w:val="single" w:color="F0C9A8" w:sz="4"/>
-              <w:bottom w:val="single" w:color="F0C9A8" w:sz="4"/>
-              <w:right w:val="single" w:color="F0C9A8" w:sz="4"/>
-            </w:tcBorders>
-            <w:tcMar>
-              <w:top w:type="dxa" w:w="80"/>
-              <w:left w:type="dxa" w:w="110"/>
-              <w:bottom w:type="dxa" w:w="80"/>
-              <w:right w:type="dxa" w:w="110"/>
-            </w:tcMar>
-          </w:tcPr>
-          <w:p>
-            <w:r>
-              <w:rPr>
-                <w:b w:val="false"/>
-                <w:bCs w:val="false"/>
-                <w:color w:val="222222"/>
-                <w:sz w:val="19"/>
-                <w:szCs w:val="19"/>
-              </w:rPr>
-              <w:t xml:space="preserve">Save image</w:t>
             </w:r>
           </w:p>
         </w:tc>

</xml_diff>

<commit_message>
The two WhatsApp messages are written for a chat rather than for a press release
Both were one long sentence with the link tacked on the end, which is how a forward
reads as an advertisement. Each is now three short lines - a wish or an opening, the
invitation, then the edition and the link on its own line. WhatsApp keeps the breaks,
and the native share sheet passes them through.

With the card: the diya, the wish, "instead of the usual greeting, here's one you can
play", and the mithai box. From the band: the surprise that the Orange Book is a game
this time, which also takes out the "this month's" that had survived the pass for
month and year.

The emoji are written as escapes rather than as characters, so nothing depends on the
server sending the file as utf-8. The file still holds nothing above the basic plane.

Co-Authored-By: Claude Opus 5 <noreply@anthropic.com>
Claude-Session: https://claude.ai/code/session_012sQsmGULLFzjfa9SrQhDjc
</commit_message>
<xml_diff>
--- a/content/The-Sweet-Pick-Copy.docx
+++ b/content/The-Sweet-Pick-Copy.docx
@@ -9034,13 +9034,56 @@
           <w:p>
             <w:r>
               <w:rPr>
-                <w:b w:val="false"/>
-                <w:bCs w:val="false"/>
-                <w:color w:val="222222"/>
-                <w:sz w:val="19"/>
-                <w:szCs w:val="19"/>
-              </w:rPr>
-              <w:t xml:space="preserve">Wishing you a festive season full of sweet choices. Your turn — try your hand at The Sweet Pick, this season’s interactive Orange Book from ICICI Bank.</w:t>
+                <w:color w:val="222222"/>
+                <w:sz w:val="19"/>
+                <w:szCs w:val="19"/>
+              </w:rPr>
+              <w:t xml:space="preserve">🪔 Wishing you a festive season full of sweet choices.</w:t>
+            </w:r>
+            <w:r>
+              <w:rPr>
+                <w:color w:val="222222"/>
+                <w:sz w:val="19"/>
+                <w:szCs w:val="19"/>
+              </w:rPr>
+              <w:br/>
+              <w:t xml:space="preserve"/>
+            </w:r>
+            <w:r>
+              <w:rPr>
+                <w:color w:val="222222"/>
+                <w:sz w:val="19"/>
+                <w:szCs w:val="19"/>
+              </w:rPr>
+              <w:br/>
+              <w:t xml:space="preserve">Instead of the usual greeting, here’s one you can play — pick a mithai box and see what it says about you 🍬</w:t>
+            </w:r>
+            <w:r>
+              <w:rPr>
+                <w:color w:val="222222"/>
+                <w:sz w:val="19"/>
+                <w:szCs w:val="19"/>
+              </w:rPr>
+              <w:br/>
+              <w:t xml:space="preserve"/>
+            </w:r>
+            <w:r>
+              <w:rPr>
+                <w:color w:val="222222"/>
+                <w:sz w:val="19"/>
+                <w:szCs w:val="19"/>
+              </w:rPr>
+              <w:br/>
+              <w:t xml:space="preserve">The Sweet Pick, ICICI Bank’s interactive Orange Book 👇</w:t>
+            </w:r>
+            <w:r>
+              <w:rPr>
+                <w:color w:val="222222"/>
+                <w:sz w:val="19"/>
+                <w:szCs w:val="19"/>
+              </w:rPr>
+              <w:br/>
+              <w:t xml:space="preserve">{link}</w:t>
             </w:r>
           </w:p>
         </w:tc>
@@ -9094,13 +9137,56 @@
           <w:p>
             <w:r>
               <w:rPr>
-                <w:b w:val="false"/>
-                <w:bCs w:val="false"/>
-                <w:color w:val="222222"/>
-                <w:sz w:val="19"/>
-                <w:szCs w:val="19"/>
-              </w:rPr>
-              <w:t xml:space="preserve">Hey, check out The Sweet Pick, this month’s interactive edition of The Orange Book from ICICI Bank. {link}</w:t>
+                <w:color w:val="222222"/>
+                <w:sz w:val="19"/>
+                <w:szCs w:val="19"/>
+              </w:rPr>
+              <w:t xml:space="preserve">✨ This festive season, ICICI Bank’s Orange Book is a game.</w:t>
+            </w:r>
+            <w:r>
+              <w:rPr>
+                <w:color w:val="222222"/>
+                <w:sz w:val="19"/>
+                <w:szCs w:val="19"/>
+              </w:rPr>
+              <w:br/>
+              <w:t xml:space="preserve"/>
+            </w:r>
+            <w:r>
+              <w:rPr>
+                <w:color w:val="222222"/>
+                <w:sz w:val="19"/>
+                <w:szCs w:val="19"/>
+              </w:rPr>
+              <w:br/>
+              <w:t xml:space="preserve">Pick a mithai box and see what’s really doing the choosing 🍬</w:t>
+            </w:r>
+            <w:r>
+              <w:rPr>
+                <w:color w:val="222222"/>
+                <w:sz w:val="19"/>
+                <w:szCs w:val="19"/>
+              </w:rPr>
+              <w:br/>
+              <w:t xml:space="preserve"/>
+            </w:r>
+            <w:r>
+              <w:rPr>
+                <w:color w:val="222222"/>
+                <w:sz w:val="19"/>
+                <w:szCs w:val="19"/>
+              </w:rPr>
+              <w:br/>
+              <w:t xml:space="preserve">The Sweet Pick 👇</w:t>
+            </w:r>
+            <w:r>
+              <w:rPr>
+                <w:color w:val="222222"/>
+                <w:sz w:val="19"/>
+                <w:szCs w:val="19"/>
+              </w:rPr>
+              <w:br/>
+              <w:t xml:space="preserve">{link}</w:t>
             </w:r>
           </w:p>
         </w:tc>

</xml_diff>

<commit_message>
The places a bias turns up are a list of marks, not a row of buttons
They were set as outlined pills, which is the shape every button on the page wears,
so three labels read as three things to press. They are a list now, each behind a
line-drawn mark, under "Watch for it in:" - which also answers what they are, since
standing there unlabelled was half the problem.

Fifteen marks, one per place: a tag, a bed and a screen for anchoring; a cup, a
renewal arrow and a phone for the decoy; cutlery, a rosette and headphones for the
bandwagon; a bolt, a ticket and an hourglass for FOMO; a jar, a heart and a
megaphone for framing. Each only has to be distinct from the other two in its own
round, which is all the reader sees at once. They are drawn at the weight the
edition draws its other marks and sit at the size of a bullet.

Co-Authored-By: Claude Opus 5 <noreply@anthropic.com>
Claude-Session: https://claude.ai/code/session_012sQsmGULLFzjfa9SrQhDjc
</commit_message>
<xml_diff>
--- a/content/The-Sweet-Pick-Copy.docx
+++ b/content/The-Sweet-Pick-Copy.docx
@@ -2204,7 +2204,7 @@
                 <w:sz w:val="19"/>
                 <w:szCs w:val="19"/>
               </w:rPr>
-              <w:t xml:space="preserve">Chips</w:t>
+              <w:t xml:space="preserve">Watch for it in</w:t>
             </w:r>
           </w:p>
         </w:tc>
@@ -3293,7 +3293,7 @@
                 <w:sz w:val="19"/>
                 <w:szCs w:val="19"/>
               </w:rPr>
-              <w:t xml:space="preserve">Chips</w:t>
+              <w:t xml:space="preserve">Watch for it in</w:t>
             </w:r>
           </w:p>
         </w:tc>
@@ -4382,7 +4382,7 @@
                 <w:sz w:val="19"/>
                 <w:szCs w:val="19"/>
               </w:rPr>
-              <w:t xml:space="preserve">Chips</w:t>
+              <w:t xml:space="preserve">Watch for it in</w:t>
             </w:r>
           </w:p>
         </w:tc>
@@ -5471,7 +5471,7 @@
                 <w:sz w:val="19"/>
                 <w:szCs w:val="19"/>
               </w:rPr>
-              <w:t xml:space="preserve">Chips</w:t>
+              <w:t xml:space="preserve">Watch for it in</w:t>
             </w:r>
           </w:p>
         </w:tc>
@@ -6560,7 +6560,7 @@
                 <w:sz w:val="19"/>
                 <w:szCs w:val="19"/>
               </w:rPr>
-              <w:t xml:space="preserve">Chips</w:t>
+              <w:t xml:space="preserve">Watch for it in</w:t>
             </w:r>
           </w:p>
         </w:tc>

</xml_diff>

<commit_message>
The last page ends on the Orange Book: ask, card, button, replay row, send-off
The card now comes before the button that sends it - the ask, then the thing, then
the action - and the replay row follows the button, so everything the reader can
do sits together. The Orange Book's own send-off and its Read all editions button
close the page, as they close every edition.

The share part of the reveal was cued by the button coming into view. With the card
above it, the button would only arrive after a blank where the card waits, so the
cue moves to the ask itself, which is never staged and is always there to be watched.

Co-Authored-By: Claude Fable 5.1 <noreply@anthropic.com>
Claude-Session: https://claude.ai/code/session_012sQsmGULLFzjfa9SrQhDjc
</commit_message>
<xml_diff>
--- a/content/The-Sweet-Pick-Copy.docx
+++ b/content/The-Sweet-Pick-Copy.docx
@@ -7891,7 +7891,7 @@
                 <w:sz w:val="19"/>
                 <w:szCs w:val="19"/>
               </w:rPr>
-              <w:t xml:space="preserve">Line above the share button</w:t>
+              <w:t xml:space="preserve">Line above the card</w:t>
             </w:r>
           </w:p>
         </w:tc>
@@ -7951,6 +7951,66 @@
                 <w:sz w:val="19"/>
                 <w:szCs w:val="19"/>
               </w:rPr>
+              <w:t xml:space="preserve">Greeting card (alt text)</w:t>
+            </w:r>
+          </w:p>
+        </w:tc>
+        <w:tc>
+          <w:tcPr>
+            <w:tcW w:type="dxa" w:w="6526"/>
+            <w:tcBorders>
+              <w:top w:val="single" w:color="F0C9A8" w:sz="4"/>
+              <w:left w:val="single" w:color="F0C9A8" w:sz="4"/>
+              <w:bottom w:val="single" w:color="F0C9A8" w:sz="4"/>
+              <w:right w:val="single" w:color="F0C9A8" w:sz="4"/>
+            </w:tcBorders>
+            <w:tcMar>
+              <w:top w:type="dxa" w:w="80"/>
+              <w:left w:type="dxa" w:w="110"/>
+              <w:bottom w:type="dxa" w:w="80"/>
+              <w:right w:type="dxa" w:w="110"/>
+            </w:tcMar>
+          </w:tcPr>
+          <w:p>
+            <w:r>
+              <w:rPr>
+                <w:b w:val="false"/>
+                <w:bCs w:val="false"/>
+                <w:color w:val="222222"/>
+                <w:sz w:val="19"/>
+                <w:szCs w:val="19"/>
+              </w:rPr>
+              <w:t xml:space="preserve">Your festive greeting card from The Sweet Pick</w:t>
+            </w:r>
+          </w:p>
+        </w:tc>
+      </w:tr>
+      <w:tr>
+        <w:tc>
+          <w:tcPr>
+            <w:tcW w:type="dxa" w:w="2500"/>
+            <w:tcBorders>
+              <w:top w:val="single" w:color="F0C9A8" w:sz="4"/>
+              <w:left w:val="single" w:color="F0C9A8" w:sz="4"/>
+              <w:bottom w:val="single" w:color="F0C9A8" w:sz="4"/>
+              <w:right w:val="single" w:color="F0C9A8" w:sz="4"/>
+            </w:tcBorders>
+            <w:tcMar>
+              <w:top w:type="dxa" w:w="80"/>
+              <w:left w:type="dxa" w:w="110"/>
+              <w:bottom w:type="dxa" w:w="80"/>
+              <w:right w:type="dxa" w:w="110"/>
+            </w:tcMar>
+          </w:tcPr>
+          <w:p>
+            <w:r>
+              <w:rPr>
+                <w:b/>
+                <w:bCs/>
+                <w:color w:val="222222"/>
+                <w:sz w:val="19"/>
+                <w:szCs w:val="19"/>
+              </w:rPr>
               <w:t xml:space="preserve">Share button</w:t>
             </w:r>
           </w:p>
@@ -8011,36 +8071,36 @@
                 <w:sz w:val="19"/>
                 <w:szCs w:val="19"/>
               </w:rPr>
-              <w:t xml:space="preserve">Greeting card (alt text)</w:t>
-            </w:r>
-          </w:p>
-        </w:tc>
-        <w:tc>
-          <w:tcPr>
-            <w:tcW w:type="dxa" w:w="6526"/>
-            <w:tcBorders>
-              <w:top w:val="single" w:color="F0C9A8" w:sz="4"/>
-              <w:left w:val="single" w:color="F0C9A8" w:sz="4"/>
-              <w:bottom w:val="single" w:color="F0C9A8" w:sz="4"/>
-              <w:right w:val="single" w:color="F0C9A8" w:sz="4"/>
-            </w:tcBorders>
-            <w:tcMar>
-              <w:top w:type="dxa" w:w="80"/>
-              <w:left w:type="dxa" w:w="110"/>
-              <w:bottom w:type="dxa" w:w="80"/>
-              <w:right w:type="dxa" w:w="110"/>
-            </w:tcMar>
-          </w:tcPr>
-          <w:p>
-            <w:r>
-              <w:rPr>
-                <w:b w:val="false"/>
-                <w:bCs w:val="false"/>
-                <w:color w:val="222222"/>
-                <w:sz w:val="19"/>
-                <w:szCs w:val="19"/>
-              </w:rPr>
-              <w:t xml:space="preserve">Your festive greeting card from The Sweet Pick</w:t>
+              <w:t xml:space="preserve">Replay row</w:t>
+            </w:r>
+          </w:p>
+        </w:tc>
+        <w:tc>
+          <w:tcPr>
+            <w:tcW w:type="dxa" w:w="6526"/>
+            <w:tcBorders>
+              <w:top w:val="single" w:color="F0C9A8" w:sz="4"/>
+              <w:left w:val="single" w:color="F0C9A8" w:sz="4"/>
+              <w:bottom w:val="single" w:color="F0C9A8" w:sz="4"/>
+              <w:right w:val="single" w:color="F0C9A8" w:sz="4"/>
+            </w:tcBorders>
+            <w:tcMar>
+              <w:top w:type="dxa" w:w="80"/>
+              <w:left w:type="dxa" w:w="110"/>
+              <w:bottom w:type="dxa" w:w="80"/>
+              <w:right w:type="dxa" w:w="110"/>
+            </w:tcMar>
+          </w:tcPr>
+          <w:p>
+            <w:r>
+              <w:rPr>
+                <w:b w:val="false"/>
+                <w:bCs w:val="false"/>
+                <w:color w:val="222222"/>
+                <w:sz w:val="19"/>
+                <w:szCs w:val="19"/>
+              </w:rPr>
+              <w:t xml:space="preserve">Play again · Feedback</w:t>
             </w:r>
           </w:p>
         </w:tc>
@@ -8161,66 +8221,6 @@
                 <w:szCs w:val="19"/>
               </w:rPr>
               <w:t xml:space="preserve">Read all editions → https://www.icici.bank.in/campaigns/TOBalleditions/index</w:t>
-            </w:r>
-          </w:p>
-        </w:tc>
-      </w:tr>
-      <w:tr>
-        <w:tc>
-          <w:tcPr>
-            <w:tcW w:type="dxa" w:w="2500"/>
-            <w:tcBorders>
-              <w:top w:val="single" w:color="F0C9A8" w:sz="4"/>
-              <w:left w:val="single" w:color="F0C9A8" w:sz="4"/>
-              <w:bottom w:val="single" w:color="F0C9A8" w:sz="4"/>
-              <w:right w:val="single" w:color="F0C9A8" w:sz="4"/>
-            </w:tcBorders>
-            <w:tcMar>
-              <w:top w:type="dxa" w:w="80"/>
-              <w:left w:type="dxa" w:w="110"/>
-              <w:bottom w:type="dxa" w:w="80"/>
-              <w:right w:type="dxa" w:w="110"/>
-            </w:tcMar>
-          </w:tcPr>
-          <w:p>
-            <w:r>
-              <w:rPr>
-                <w:b/>
-                <w:bCs/>
-                <w:color w:val="222222"/>
-                <w:sz w:val="19"/>
-                <w:szCs w:val="19"/>
-              </w:rPr>
-              <w:t xml:space="preserve">Replay row</w:t>
-            </w:r>
-          </w:p>
-        </w:tc>
-        <w:tc>
-          <w:tcPr>
-            <w:tcW w:type="dxa" w:w="6526"/>
-            <w:tcBorders>
-              <w:top w:val="single" w:color="F0C9A8" w:sz="4"/>
-              <w:left w:val="single" w:color="F0C9A8" w:sz="4"/>
-              <w:bottom w:val="single" w:color="F0C9A8" w:sz="4"/>
-              <w:right w:val="single" w:color="F0C9A8" w:sz="4"/>
-            </w:tcBorders>
-            <w:tcMar>
-              <w:top w:type="dxa" w:w="80"/>
-              <w:left w:type="dxa" w:w="110"/>
-              <w:bottom w:type="dxa" w:w="80"/>
-              <w:right w:type="dxa" w:w="110"/>
-            </w:tcMar>
-          </w:tcPr>
-          <w:p>
-            <w:r>
-              <w:rPr>
-                <w:b w:val="false"/>
-                <w:bCs w:val="false"/>
-                <w:color w:val="222222"/>
-                <w:sz w:val="19"/>
-                <w:szCs w:val="19"/>
-              </w:rPr>
-              <w:t xml:space="preserve">Play again · Feedback</w:t>
             </w:r>
           </w:p>
         </w:tc>

</xml_diff>

<commit_message>
The cards are counted where the reader meets them, and "Your festive box" goes
On a phone the task ticket ends at the bottom of the first screen and the cards
start below it, so a first-time reader scrolls, meets one card filling the screen,
and taps it without knowing there are two more. A line now sits directly above the
cards, on screen at the moment of the tap: "Three cards below. Pick one." ("Two"
on the last pick, which has two). The second step of How to play says the same
thing for anyone who reads it first: "Compare the three cards, then make your
Sweet Pick."

The last page no longer captions the box "Your festive box"; the headline and its
subhead lead straight into it.

Co-Authored-By: Claude Fable 5.1 <noreply@anthropic.com>
Claude-Session: https://claude.ai/code/session_012sQsmGULLFzjfa9SrQhDjc
</commit_message>
<xml_diff>
--- a/content/The-Sweet-Pick-Copy.docx
+++ b/content/The-Sweet-Pick-Copy.docx
@@ -1688,7 +1688,7 @@
           <w:sz w:val="20"/>
           <w:szCs w:val="20"/>
         </w:rPr>
-        <w:t xml:space="preserve">Make your Sweet Pick.</w:t>
+        <w:t xml:space="preserve">Compare the three cards, then make your Sweet Pick.</w:t>
       </w:r>
     </w:p>
     <w:p>
@@ -1964,6 +1964,66 @@
                 <w:sz w:val="19"/>
                 <w:szCs w:val="19"/>
               </w:rPr>
+              <w:t xml:space="preserve">Line above the cards</w:t>
+            </w:r>
+          </w:p>
+        </w:tc>
+        <w:tc>
+          <w:tcPr>
+            <w:tcW w:type="dxa" w:w="6526"/>
+            <w:tcBorders>
+              <w:top w:val="single" w:color="F0C9A8" w:sz="4"/>
+              <w:left w:val="single" w:color="F0C9A8" w:sz="4"/>
+              <w:bottom w:val="single" w:color="F0C9A8" w:sz="4"/>
+              <w:right w:val="single" w:color="F0C9A8" w:sz="4"/>
+            </w:tcBorders>
+            <w:tcMar>
+              <w:top w:type="dxa" w:w="80"/>
+              <w:left w:type="dxa" w:w="110"/>
+              <w:bottom w:type="dxa" w:w="80"/>
+              <w:right w:type="dxa" w:w="110"/>
+            </w:tcMar>
+          </w:tcPr>
+          <w:p>
+            <w:r>
+              <w:rPr>
+                <w:b w:val="false"/>
+                <w:bCs w:val="false"/>
+                <w:color w:val="222222"/>
+                <w:sz w:val="19"/>
+                <w:szCs w:val="19"/>
+              </w:rPr>
+              <w:t xml:space="preserve">Three cards below. Pick one.</w:t>
+            </w:r>
+          </w:p>
+        </w:tc>
+      </w:tr>
+      <w:tr>
+        <w:tc>
+          <w:tcPr>
+            <w:tcW w:type="dxa" w:w="2500"/>
+            <w:tcBorders>
+              <w:top w:val="single" w:color="F0C9A8" w:sz="4"/>
+              <w:left w:val="single" w:color="F0C9A8" w:sz="4"/>
+              <w:bottom w:val="single" w:color="F0C9A8" w:sz="4"/>
+              <w:right w:val="single" w:color="F0C9A8" w:sz="4"/>
+            </w:tcBorders>
+            <w:tcMar>
+              <w:top w:type="dxa" w:w="80"/>
+              <w:left w:type="dxa" w:w="110"/>
+              <w:bottom w:type="dxa" w:w="80"/>
+              <w:right w:type="dxa" w:w="110"/>
+            </w:tcMar>
+          </w:tcPr>
+          <w:p>
+            <w:r>
+              <w:rPr>
+                <w:b/>
+                <w:bCs/>
+                <w:color w:val="222222"/>
+                <w:sz w:val="19"/>
+                <w:szCs w:val="19"/>
+              </w:rPr>
               <w:t xml:space="preserve">Mithai earned</w:t>
             </w:r>
           </w:p>
@@ -3053,6 +3113,66 @@
                 <w:sz w:val="19"/>
                 <w:szCs w:val="19"/>
               </w:rPr>
+              <w:t xml:space="preserve">Line above the cards</w:t>
+            </w:r>
+          </w:p>
+        </w:tc>
+        <w:tc>
+          <w:tcPr>
+            <w:tcW w:type="dxa" w:w="6526"/>
+            <w:tcBorders>
+              <w:top w:val="single" w:color="F0C9A8" w:sz="4"/>
+              <w:left w:val="single" w:color="F0C9A8" w:sz="4"/>
+              <w:bottom w:val="single" w:color="F0C9A8" w:sz="4"/>
+              <w:right w:val="single" w:color="F0C9A8" w:sz="4"/>
+            </w:tcBorders>
+            <w:tcMar>
+              <w:top w:type="dxa" w:w="80"/>
+              <w:left w:type="dxa" w:w="110"/>
+              <w:bottom w:type="dxa" w:w="80"/>
+              <w:right w:type="dxa" w:w="110"/>
+            </w:tcMar>
+          </w:tcPr>
+          <w:p>
+            <w:r>
+              <w:rPr>
+                <w:b w:val="false"/>
+                <w:bCs w:val="false"/>
+                <w:color w:val="222222"/>
+                <w:sz w:val="19"/>
+                <w:szCs w:val="19"/>
+              </w:rPr>
+              <w:t xml:space="preserve">Three cards below. Pick one.</w:t>
+            </w:r>
+          </w:p>
+        </w:tc>
+      </w:tr>
+      <w:tr>
+        <w:tc>
+          <w:tcPr>
+            <w:tcW w:type="dxa" w:w="2500"/>
+            <w:tcBorders>
+              <w:top w:val="single" w:color="F0C9A8" w:sz="4"/>
+              <w:left w:val="single" w:color="F0C9A8" w:sz="4"/>
+              <w:bottom w:val="single" w:color="F0C9A8" w:sz="4"/>
+              <w:right w:val="single" w:color="F0C9A8" w:sz="4"/>
+            </w:tcBorders>
+            <w:tcMar>
+              <w:top w:type="dxa" w:w="80"/>
+              <w:left w:type="dxa" w:w="110"/>
+              <w:bottom w:type="dxa" w:w="80"/>
+              <w:right w:type="dxa" w:w="110"/>
+            </w:tcMar>
+          </w:tcPr>
+          <w:p>
+            <w:r>
+              <w:rPr>
+                <w:b/>
+                <w:bCs/>
+                <w:color w:val="222222"/>
+                <w:sz w:val="19"/>
+                <w:szCs w:val="19"/>
+              </w:rPr>
               <w:t xml:space="preserve">Mithai earned</w:t>
             </w:r>
           </w:p>
@@ -4142,6 +4262,66 @@
                 <w:sz w:val="19"/>
                 <w:szCs w:val="19"/>
               </w:rPr>
+              <w:t xml:space="preserve">Line above the cards</w:t>
+            </w:r>
+          </w:p>
+        </w:tc>
+        <w:tc>
+          <w:tcPr>
+            <w:tcW w:type="dxa" w:w="6526"/>
+            <w:tcBorders>
+              <w:top w:val="single" w:color="F0C9A8" w:sz="4"/>
+              <w:left w:val="single" w:color="F0C9A8" w:sz="4"/>
+              <w:bottom w:val="single" w:color="F0C9A8" w:sz="4"/>
+              <w:right w:val="single" w:color="F0C9A8" w:sz="4"/>
+            </w:tcBorders>
+            <w:tcMar>
+              <w:top w:type="dxa" w:w="80"/>
+              <w:left w:type="dxa" w:w="110"/>
+              <w:bottom w:type="dxa" w:w="80"/>
+              <w:right w:type="dxa" w:w="110"/>
+            </w:tcMar>
+          </w:tcPr>
+          <w:p>
+            <w:r>
+              <w:rPr>
+                <w:b w:val="false"/>
+                <w:bCs w:val="false"/>
+                <w:color w:val="222222"/>
+                <w:sz w:val="19"/>
+                <w:szCs w:val="19"/>
+              </w:rPr>
+              <w:t xml:space="preserve">Three cards below. Pick one.</w:t>
+            </w:r>
+          </w:p>
+        </w:tc>
+      </w:tr>
+      <w:tr>
+        <w:tc>
+          <w:tcPr>
+            <w:tcW w:type="dxa" w:w="2500"/>
+            <w:tcBorders>
+              <w:top w:val="single" w:color="F0C9A8" w:sz="4"/>
+              <w:left w:val="single" w:color="F0C9A8" w:sz="4"/>
+              <w:bottom w:val="single" w:color="F0C9A8" w:sz="4"/>
+              <w:right w:val="single" w:color="F0C9A8" w:sz="4"/>
+            </w:tcBorders>
+            <w:tcMar>
+              <w:top w:type="dxa" w:w="80"/>
+              <w:left w:type="dxa" w:w="110"/>
+              <w:bottom w:type="dxa" w:w="80"/>
+              <w:right w:type="dxa" w:w="110"/>
+            </w:tcMar>
+          </w:tcPr>
+          <w:p>
+            <w:r>
+              <w:rPr>
+                <w:b/>
+                <w:bCs/>
+                <w:color w:val="222222"/>
+                <w:sz w:val="19"/>
+                <w:szCs w:val="19"/>
+              </w:rPr>
               <w:t xml:space="preserve">Mithai earned</w:t>
             </w:r>
           </w:p>
@@ -5231,6 +5411,66 @@
                 <w:sz w:val="19"/>
                 <w:szCs w:val="19"/>
               </w:rPr>
+              <w:t xml:space="preserve">Line above the cards</w:t>
+            </w:r>
+          </w:p>
+        </w:tc>
+        <w:tc>
+          <w:tcPr>
+            <w:tcW w:type="dxa" w:w="6526"/>
+            <w:tcBorders>
+              <w:top w:val="single" w:color="F0C9A8" w:sz="4"/>
+              <w:left w:val="single" w:color="F0C9A8" w:sz="4"/>
+              <w:bottom w:val="single" w:color="F0C9A8" w:sz="4"/>
+              <w:right w:val="single" w:color="F0C9A8" w:sz="4"/>
+            </w:tcBorders>
+            <w:tcMar>
+              <w:top w:type="dxa" w:w="80"/>
+              <w:left w:type="dxa" w:w="110"/>
+              <w:bottom w:type="dxa" w:w="80"/>
+              <w:right w:type="dxa" w:w="110"/>
+            </w:tcMar>
+          </w:tcPr>
+          <w:p>
+            <w:r>
+              <w:rPr>
+                <w:b w:val="false"/>
+                <w:bCs w:val="false"/>
+                <w:color w:val="222222"/>
+                <w:sz w:val="19"/>
+                <w:szCs w:val="19"/>
+              </w:rPr>
+              <w:t xml:space="preserve">Three cards below. Pick one.</w:t>
+            </w:r>
+          </w:p>
+        </w:tc>
+      </w:tr>
+      <w:tr>
+        <w:tc>
+          <w:tcPr>
+            <w:tcW w:type="dxa" w:w="2500"/>
+            <w:tcBorders>
+              <w:top w:val="single" w:color="F0C9A8" w:sz="4"/>
+              <w:left w:val="single" w:color="F0C9A8" w:sz="4"/>
+              <w:bottom w:val="single" w:color="F0C9A8" w:sz="4"/>
+              <w:right w:val="single" w:color="F0C9A8" w:sz="4"/>
+            </w:tcBorders>
+            <w:tcMar>
+              <w:top w:type="dxa" w:w="80"/>
+              <w:left w:type="dxa" w:w="110"/>
+              <w:bottom w:type="dxa" w:w="80"/>
+              <w:right w:type="dxa" w:w="110"/>
+            </w:tcMar>
+          </w:tcPr>
+          <w:p>
+            <w:r>
+              <w:rPr>
+                <w:b/>
+                <w:bCs/>
+                <w:color w:val="222222"/>
+                <w:sz w:val="19"/>
+                <w:szCs w:val="19"/>
+              </w:rPr>
               <w:t xml:space="preserve">Mithai earned</w:t>
             </w:r>
           </w:p>
@@ -6320,6 +6560,66 @@
                 <w:sz w:val="19"/>
                 <w:szCs w:val="19"/>
               </w:rPr>
+              <w:t xml:space="preserve">Line above the cards</w:t>
+            </w:r>
+          </w:p>
+        </w:tc>
+        <w:tc>
+          <w:tcPr>
+            <w:tcW w:type="dxa" w:w="6526"/>
+            <w:tcBorders>
+              <w:top w:val="single" w:color="F0C9A8" w:sz="4"/>
+              <w:left w:val="single" w:color="F0C9A8" w:sz="4"/>
+              <w:bottom w:val="single" w:color="F0C9A8" w:sz="4"/>
+              <w:right w:val="single" w:color="F0C9A8" w:sz="4"/>
+            </w:tcBorders>
+            <w:tcMar>
+              <w:top w:type="dxa" w:w="80"/>
+              <w:left w:type="dxa" w:w="110"/>
+              <w:bottom w:type="dxa" w:w="80"/>
+              <w:right w:type="dxa" w:w="110"/>
+            </w:tcMar>
+          </w:tcPr>
+          <w:p>
+            <w:r>
+              <w:rPr>
+                <w:b w:val="false"/>
+                <w:bCs w:val="false"/>
+                <w:color w:val="222222"/>
+                <w:sz w:val="19"/>
+                <w:szCs w:val="19"/>
+              </w:rPr>
+              <w:t xml:space="preserve">Two cards below. Pick one.</w:t>
+            </w:r>
+          </w:p>
+        </w:tc>
+      </w:tr>
+      <w:tr>
+        <w:tc>
+          <w:tcPr>
+            <w:tcW w:type="dxa" w:w="2500"/>
+            <w:tcBorders>
+              <w:top w:val="single" w:color="F0C9A8" w:sz="4"/>
+              <w:left w:val="single" w:color="F0C9A8" w:sz="4"/>
+              <w:bottom w:val="single" w:color="F0C9A8" w:sz="4"/>
+              <w:right w:val="single" w:color="F0C9A8" w:sz="4"/>
+            </w:tcBorders>
+            <w:tcMar>
+              <w:top w:type="dxa" w:w="80"/>
+              <w:left w:type="dxa" w:w="110"/>
+              <w:bottom w:type="dxa" w:w="80"/>
+              <w:right w:type="dxa" w:w="110"/>
+            </w:tcMar>
+          </w:tcPr>
+          <w:p>
+            <w:r>
+              <w:rPr>
+                <w:b/>
+                <w:bCs/>
+                <w:color w:val="222222"/>
+                <w:sz w:val="19"/>
+                <w:szCs w:val="19"/>
+              </w:rPr>
               <w:t xml:space="preserve">Mithai earned</w:t>
             </w:r>
           </w:p>
@@ -7261,66 +7561,6 @@
                 <w:szCs w:val="19"/>
               </w:rPr>
               <w:t xml:space="preserve">the tag’s line, see Result tags</w:t>
-            </w:r>
-          </w:p>
-        </w:tc>
-      </w:tr>
-      <w:tr>
-        <w:tc>
-          <w:tcPr>
-            <w:tcW w:type="dxa" w:w="2500"/>
-            <w:tcBorders>
-              <w:top w:val="single" w:color="F0C9A8" w:sz="4"/>
-              <w:left w:val="single" w:color="F0C9A8" w:sz="4"/>
-              <w:bottom w:val="single" w:color="F0C9A8" w:sz="4"/>
-              <w:right w:val="single" w:color="F0C9A8" w:sz="4"/>
-            </w:tcBorders>
-            <w:tcMar>
-              <w:top w:type="dxa" w:w="80"/>
-              <w:left w:type="dxa" w:w="110"/>
-              <w:bottom w:type="dxa" w:w="80"/>
-              <w:right w:type="dxa" w:w="110"/>
-            </w:tcMar>
-          </w:tcPr>
-          <w:p>
-            <w:r>
-              <w:rPr>
-                <w:b/>
-                <w:bCs/>
-                <w:color w:val="222222"/>
-                <w:sz w:val="19"/>
-                <w:szCs w:val="19"/>
-              </w:rPr>
-              <w:t xml:space="preserve">Eyebrow</w:t>
-            </w:r>
-          </w:p>
-        </w:tc>
-        <w:tc>
-          <w:tcPr>
-            <w:tcW w:type="dxa" w:w="6526"/>
-            <w:tcBorders>
-              <w:top w:val="single" w:color="F0C9A8" w:sz="4"/>
-              <w:left w:val="single" w:color="F0C9A8" w:sz="4"/>
-              <w:bottom w:val="single" w:color="F0C9A8" w:sz="4"/>
-              <w:right w:val="single" w:color="F0C9A8" w:sz="4"/>
-            </w:tcBorders>
-            <w:tcMar>
-              <w:top w:type="dxa" w:w="80"/>
-              <w:left w:type="dxa" w:w="110"/>
-              <w:bottom w:type="dxa" w:w="80"/>
-              <w:right w:type="dxa" w:w="110"/>
-            </w:tcMar>
-          </w:tcPr>
-          <w:p>
-            <w:r>
-              <w:rPr>
-                <w:b w:val="false"/>
-                <w:bCs w:val="false"/>
-                <w:color w:val="222222"/>
-                <w:sz w:val="19"/>
-                <w:szCs w:val="19"/>
-              </w:rPr>
-              <w:t xml:space="preserve">Your festive box</w:t>
             </w:r>
           </w:p>
         </w:tc>

</xml_diff>

<commit_message>
The copy deck is brought level with the edition for content approval
Every string the running page shows was scraped and checked against both forms of
the deck. The shareable-card section still described an earlier design with a
volume line in its footer; the card's alt text was wrong; the line above the
places a bias turns up and the five card-back headings were not listed as copy;
the .docx had never carried the seal's top arc; the rating card's link and the
disclaimer link had no address. All set right, and the note that the edition itself
carries no volume, month or year is on the first page. 155 strings, none missing
from either deck.

Co-Authored-By: Claude Fable 5.1 <noreply@anthropic.com>
Claude-Session: https://claude.ai/code/session_012sQsmGULLFzjfa9SrQhDjc
</commit_message>
<xml_diff>
--- a/content/The-Sweet-Pick-Copy.docx
+++ b/content/The-Sweet-Pick-Copy.docx
@@ -40,7 +40,7 @@
           <w:sz w:val="20"/>
           <w:szCs w:val="20"/>
         </w:rPr>
-        <w:t xml:space="preserve">Every word the edition shows, in the order a reader meets it. Text in curly braces is filled in by the game: {N} is a count, {Tag} is the result tag, {Bias} is the pick’s bias name. The budget is ₹500 on every pick.</w:t>
+        <w:t xml:space="preserve">Every word the edition shows, in the order a reader meets it. Text in curly braces is filled in by the game: {N} is a count, {Tag} is the result tag, {Bias} is the pick’s bias name. The budget is ₹500 on every pick. The volume, month and year identify this document only; the edition itself carries none of them on any screen.</w:t>
       </w:r>
     </w:p>
     <w:p>
@@ -825,7 +825,7 @@
                 <w:sz w:val="19"/>
                 <w:szCs w:val="19"/>
               </w:rPr>
-              <w:t xml:space="preserve">▲ ▼ Select ↵ Enter</w:t>
+              <w:t xml:space="preserve">▲▼ Select ↵ Enter</w:t>
             </w:r>
           </w:p>
         </w:tc>
@@ -1340,6 +1340,186 @@
                 <w:szCs w:val="19"/>
               </w:rPr>
               <w:t xml:space="preserve">What is the {Bias}? (for FOMO: What is FOMO?)</w:t>
+            </w:r>
+          </w:p>
+        </w:tc>
+      </w:tr>
+      <w:tr>
+        <w:tc>
+          <w:tcPr>
+            <w:tcW w:type="dxa" w:w="2500"/>
+            <w:tcBorders>
+              <w:top w:val="single" w:color="F0C9A8" w:sz="4"/>
+              <w:left w:val="single" w:color="F0C9A8" w:sz="4"/>
+              <w:bottom w:val="single" w:color="F0C9A8" w:sz="4"/>
+              <w:right w:val="single" w:color="F0C9A8" w:sz="4"/>
+            </w:tcBorders>
+            <w:tcMar>
+              <w:top w:type="dxa" w:w="80"/>
+              <w:left w:type="dxa" w:w="110"/>
+              <w:bottom w:type="dxa" w:w="80"/>
+              <w:right w:type="dxa" w:w="110"/>
+            </w:tcMar>
+          </w:tcPr>
+          <w:p>
+            <w:r>
+              <w:rPr>
+                <w:b/>
+                <w:bCs/>
+                <w:color w:val="222222"/>
+                <w:sz w:val="19"/>
+                <w:szCs w:val="19"/>
+              </w:rPr>
+              <w:t xml:space="preserve">Line above the cards</w:t>
+            </w:r>
+          </w:p>
+        </w:tc>
+        <w:tc>
+          <w:tcPr>
+            <w:tcW w:type="dxa" w:w="6526"/>
+            <w:tcBorders>
+              <w:top w:val="single" w:color="F0C9A8" w:sz="4"/>
+              <w:left w:val="single" w:color="F0C9A8" w:sz="4"/>
+              <w:bottom w:val="single" w:color="F0C9A8" w:sz="4"/>
+              <w:right w:val="single" w:color="F0C9A8" w:sz="4"/>
+            </w:tcBorders>
+            <w:tcMar>
+              <w:top w:type="dxa" w:w="80"/>
+              <w:left w:type="dxa" w:w="110"/>
+              <w:bottom w:type="dxa" w:w="80"/>
+              <w:right w:type="dxa" w:w="110"/>
+            </w:tcMar>
+          </w:tcPr>
+          <w:p>
+            <w:r>
+              <w:rPr>
+                <w:b w:val="false"/>
+                <w:bCs w:val="false"/>
+                <w:color w:val="222222"/>
+                <w:sz w:val="19"/>
+                <w:szCs w:val="19"/>
+              </w:rPr>
+              <w:t xml:space="preserve">Three cards below. Pick one.</w:t>
+            </w:r>
+          </w:p>
+        </w:tc>
+      </w:tr>
+      <w:tr>
+        <w:tc>
+          <w:tcPr>
+            <w:tcW w:type="dxa" w:w="2500"/>
+            <w:tcBorders>
+              <w:top w:val="single" w:color="F0C9A8" w:sz="4"/>
+              <w:left w:val="single" w:color="F0C9A8" w:sz="4"/>
+              <w:bottom w:val="single" w:color="F0C9A8" w:sz="4"/>
+              <w:right w:val="single" w:color="F0C9A8" w:sz="4"/>
+            </w:tcBorders>
+            <w:tcMar>
+              <w:top w:type="dxa" w:w="80"/>
+              <w:left w:type="dxa" w:w="110"/>
+              <w:bottom w:type="dxa" w:w="80"/>
+              <w:right w:type="dxa" w:w="110"/>
+            </w:tcMar>
+          </w:tcPr>
+          <w:p>
+            <w:r>
+              <w:rPr>
+                <w:b/>
+                <w:bCs/>
+                <w:color w:val="222222"/>
+                <w:sz w:val="19"/>
+                <w:szCs w:val="19"/>
+              </w:rPr>
+              <w:t xml:space="preserve">Line above the cards, pick 5 (two cards)</w:t>
+            </w:r>
+          </w:p>
+        </w:tc>
+        <w:tc>
+          <w:tcPr>
+            <w:tcW w:type="dxa" w:w="6526"/>
+            <w:tcBorders>
+              <w:top w:val="single" w:color="F0C9A8" w:sz="4"/>
+              <w:left w:val="single" w:color="F0C9A8" w:sz="4"/>
+              <w:bottom w:val="single" w:color="F0C9A8" w:sz="4"/>
+              <w:right w:val="single" w:color="F0C9A8" w:sz="4"/>
+            </w:tcBorders>
+            <w:tcMar>
+              <w:top w:type="dxa" w:w="80"/>
+              <w:left w:type="dxa" w:w="110"/>
+              <w:bottom w:type="dxa" w:w="80"/>
+              <w:right w:type="dxa" w:w="110"/>
+            </w:tcMar>
+          </w:tcPr>
+          <w:p>
+            <w:r>
+              <w:rPr>
+                <w:b w:val="false"/>
+                <w:bCs w:val="false"/>
+                <w:color w:val="222222"/>
+                <w:sz w:val="19"/>
+                <w:szCs w:val="19"/>
+              </w:rPr>
+              <w:t xml:space="preserve">Two cards below. Pick one.</w:t>
+            </w:r>
+          </w:p>
+        </w:tc>
+      </w:tr>
+      <w:tr>
+        <w:tc>
+          <w:tcPr>
+            <w:tcW w:type="dxa" w:w="2500"/>
+            <w:tcBorders>
+              <w:top w:val="single" w:color="F0C9A8" w:sz="4"/>
+              <w:left w:val="single" w:color="F0C9A8" w:sz="4"/>
+              <w:bottom w:val="single" w:color="F0C9A8" w:sz="4"/>
+              <w:right w:val="single" w:color="F0C9A8" w:sz="4"/>
+            </w:tcBorders>
+            <w:tcMar>
+              <w:top w:type="dxa" w:w="80"/>
+              <w:left w:type="dxa" w:w="110"/>
+              <w:bottom w:type="dxa" w:w="80"/>
+              <w:right w:type="dxa" w:w="110"/>
+            </w:tcMar>
+          </w:tcPr>
+          <w:p>
+            <w:r>
+              <w:rPr>
+                <w:b/>
+                <w:bCs/>
+                <w:color w:val="222222"/>
+                <w:sz w:val="19"/>
+                <w:szCs w:val="19"/>
+              </w:rPr>
+              <w:t xml:space="preserve">Line above the places it turns up</w:t>
+            </w:r>
+          </w:p>
+        </w:tc>
+        <w:tc>
+          <w:tcPr>
+            <w:tcW w:type="dxa" w:w="6526"/>
+            <w:tcBorders>
+              <w:top w:val="single" w:color="F0C9A8" w:sz="4"/>
+              <w:left w:val="single" w:color="F0C9A8" w:sz="4"/>
+              <w:bottom w:val="single" w:color="F0C9A8" w:sz="4"/>
+              <w:right w:val="single" w:color="F0C9A8" w:sz="4"/>
+            </w:tcBorders>
+            <w:tcMar>
+              <w:top w:type="dxa" w:w="80"/>
+              <w:left w:type="dxa" w:w="110"/>
+              <w:bottom w:type="dxa" w:w="80"/>
+              <w:right w:type="dxa" w:w="110"/>
+            </w:tcMar>
+          </w:tcPr>
+          <w:p>
+            <w:r>
+              <w:rPr>
+                <w:b w:val="false"/>
+                <w:bCs w:val="false"/>
+                <w:color w:val="222222"/>
+                <w:sz w:val="19"/>
+                <w:szCs w:val="19"/>
+              </w:rPr>
+              <w:t xml:space="preserve">Watch for it in:</w:t>
             </w:r>
           </w:p>
         </w:tc>
@@ -2144,6 +2324,66 @@
                 <w:sz w:val="19"/>
                 <w:szCs w:val="19"/>
               </w:rPr>
+              <w:t xml:space="preserve">Card back, heading</w:t>
+            </w:r>
+          </w:p>
+        </w:tc>
+        <w:tc>
+          <w:tcPr>
+            <w:tcW w:type="dxa" w:w="6526"/>
+            <w:tcBorders>
+              <w:top w:val="single" w:color="F0C9A8" w:sz="4"/>
+              <w:left w:val="single" w:color="F0C9A8" w:sz="4"/>
+              <w:bottom w:val="single" w:color="F0C9A8" w:sz="4"/>
+              <w:right w:val="single" w:color="F0C9A8" w:sz="4"/>
+            </w:tcBorders>
+            <w:tcMar>
+              <w:top w:type="dxa" w:w="80"/>
+              <w:left w:type="dxa" w:w="110"/>
+              <w:bottom w:type="dxa" w:w="80"/>
+              <w:right w:type="dxa" w:w="110"/>
+            </w:tcMar>
+          </w:tcPr>
+          <w:p>
+            <w:r>
+              <w:rPr>
+                <w:b w:val="false"/>
+                <w:bCs w:val="false"/>
+                <w:color w:val="222222"/>
+                <w:sz w:val="19"/>
+                <w:szCs w:val="19"/>
+              </w:rPr>
+              <w:t xml:space="preserve">What is the Anchoring Bias?</w:t>
+            </w:r>
+          </w:p>
+        </w:tc>
+      </w:tr>
+      <w:tr>
+        <w:tc>
+          <w:tcPr>
+            <w:tcW w:type="dxa" w:w="2500"/>
+            <w:tcBorders>
+              <w:top w:val="single" w:color="F0C9A8" w:sz="4"/>
+              <w:left w:val="single" w:color="F0C9A8" w:sz="4"/>
+              <w:bottom w:val="single" w:color="F0C9A8" w:sz="4"/>
+              <w:right w:val="single" w:color="F0C9A8" w:sz="4"/>
+            </w:tcBorders>
+            <w:tcMar>
+              <w:top w:type="dxa" w:w="80"/>
+              <w:left w:type="dxa" w:w="110"/>
+              <w:bottom w:type="dxa" w:w="80"/>
+              <w:right w:type="dxa" w:w="110"/>
+            </w:tcMar>
+          </w:tcPr>
+          <w:p>
+            <w:r>
+              <w:rPr>
+                <w:b/>
+                <w:bCs/>
+                <w:color w:val="222222"/>
+                <w:sz w:val="19"/>
+                <w:szCs w:val="19"/>
+              </w:rPr>
               <w:t xml:space="preserve">The same trick, elsewhere</w:t>
             </w:r>
           </w:p>
@@ -3293,6 +3533,66 @@
                 <w:sz w:val="19"/>
                 <w:szCs w:val="19"/>
               </w:rPr>
+              <w:t xml:space="preserve">Card back, heading</w:t>
+            </w:r>
+          </w:p>
+        </w:tc>
+        <w:tc>
+          <w:tcPr>
+            <w:tcW w:type="dxa" w:w="6526"/>
+            <w:tcBorders>
+              <w:top w:val="single" w:color="F0C9A8" w:sz="4"/>
+              <w:left w:val="single" w:color="F0C9A8" w:sz="4"/>
+              <w:bottom w:val="single" w:color="F0C9A8" w:sz="4"/>
+              <w:right w:val="single" w:color="F0C9A8" w:sz="4"/>
+            </w:tcBorders>
+            <w:tcMar>
+              <w:top w:type="dxa" w:w="80"/>
+              <w:left w:type="dxa" w:w="110"/>
+              <w:bottom w:type="dxa" w:w="80"/>
+              <w:right w:type="dxa" w:w="110"/>
+            </w:tcMar>
+          </w:tcPr>
+          <w:p>
+            <w:r>
+              <w:rPr>
+                <w:b w:val="false"/>
+                <w:bCs w:val="false"/>
+                <w:color w:val="222222"/>
+                <w:sz w:val="19"/>
+                <w:szCs w:val="19"/>
+              </w:rPr>
+              <w:t xml:space="preserve">What is the Decoy Effect?</w:t>
+            </w:r>
+          </w:p>
+        </w:tc>
+      </w:tr>
+      <w:tr>
+        <w:tc>
+          <w:tcPr>
+            <w:tcW w:type="dxa" w:w="2500"/>
+            <w:tcBorders>
+              <w:top w:val="single" w:color="F0C9A8" w:sz="4"/>
+              <w:left w:val="single" w:color="F0C9A8" w:sz="4"/>
+              <w:bottom w:val="single" w:color="F0C9A8" w:sz="4"/>
+              <w:right w:val="single" w:color="F0C9A8" w:sz="4"/>
+            </w:tcBorders>
+            <w:tcMar>
+              <w:top w:type="dxa" w:w="80"/>
+              <w:left w:type="dxa" w:w="110"/>
+              <w:bottom w:type="dxa" w:w="80"/>
+              <w:right w:type="dxa" w:w="110"/>
+            </w:tcMar>
+          </w:tcPr>
+          <w:p>
+            <w:r>
+              <w:rPr>
+                <w:b/>
+                <w:bCs/>
+                <w:color w:val="222222"/>
+                <w:sz w:val="19"/>
+                <w:szCs w:val="19"/>
+              </w:rPr>
               <w:t xml:space="preserve">The same trick, elsewhere</w:t>
             </w:r>
           </w:p>
@@ -4442,6 +4742,66 @@
                 <w:sz w:val="19"/>
                 <w:szCs w:val="19"/>
               </w:rPr>
+              <w:t xml:space="preserve">Card back, heading</w:t>
+            </w:r>
+          </w:p>
+        </w:tc>
+        <w:tc>
+          <w:tcPr>
+            <w:tcW w:type="dxa" w:w="6526"/>
+            <w:tcBorders>
+              <w:top w:val="single" w:color="F0C9A8" w:sz="4"/>
+              <w:left w:val="single" w:color="F0C9A8" w:sz="4"/>
+              <w:bottom w:val="single" w:color="F0C9A8" w:sz="4"/>
+              <w:right w:val="single" w:color="F0C9A8" w:sz="4"/>
+            </w:tcBorders>
+            <w:tcMar>
+              <w:top w:type="dxa" w:w="80"/>
+              <w:left w:type="dxa" w:w="110"/>
+              <w:bottom w:type="dxa" w:w="80"/>
+              <w:right w:type="dxa" w:w="110"/>
+            </w:tcMar>
+          </w:tcPr>
+          <w:p>
+            <w:r>
+              <w:rPr>
+                <w:b w:val="false"/>
+                <w:bCs w:val="false"/>
+                <w:color w:val="222222"/>
+                <w:sz w:val="19"/>
+                <w:szCs w:val="19"/>
+              </w:rPr>
+              <w:t xml:space="preserve">What is the Bandwagon Effect?</w:t>
+            </w:r>
+          </w:p>
+        </w:tc>
+      </w:tr>
+      <w:tr>
+        <w:tc>
+          <w:tcPr>
+            <w:tcW w:type="dxa" w:w="2500"/>
+            <w:tcBorders>
+              <w:top w:val="single" w:color="F0C9A8" w:sz="4"/>
+              <w:left w:val="single" w:color="F0C9A8" w:sz="4"/>
+              <w:bottom w:val="single" w:color="F0C9A8" w:sz="4"/>
+              <w:right w:val="single" w:color="F0C9A8" w:sz="4"/>
+            </w:tcBorders>
+            <w:tcMar>
+              <w:top w:type="dxa" w:w="80"/>
+              <w:left w:type="dxa" w:w="110"/>
+              <w:bottom w:type="dxa" w:w="80"/>
+              <w:right w:type="dxa" w:w="110"/>
+            </w:tcMar>
+          </w:tcPr>
+          <w:p>
+            <w:r>
+              <w:rPr>
+                <w:b/>
+                <w:bCs/>
+                <w:color w:val="222222"/>
+                <w:sz w:val="19"/>
+                <w:szCs w:val="19"/>
+              </w:rPr>
               <w:t xml:space="preserve">The same trick, elsewhere</w:t>
             </w:r>
           </w:p>
@@ -5591,6 +5951,66 @@
                 <w:sz w:val="19"/>
                 <w:szCs w:val="19"/>
               </w:rPr>
+              <w:t xml:space="preserve">Card back, heading</w:t>
+            </w:r>
+          </w:p>
+        </w:tc>
+        <w:tc>
+          <w:tcPr>
+            <w:tcW w:type="dxa" w:w="6526"/>
+            <w:tcBorders>
+              <w:top w:val="single" w:color="F0C9A8" w:sz="4"/>
+              <w:left w:val="single" w:color="F0C9A8" w:sz="4"/>
+              <w:bottom w:val="single" w:color="F0C9A8" w:sz="4"/>
+              <w:right w:val="single" w:color="F0C9A8" w:sz="4"/>
+            </w:tcBorders>
+            <w:tcMar>
+              <w:top w:type="dxa" w:w="80"/>
+              <w:left w:type="dxa" w:w="110"/>
+              <w:bottom w:type="dxa" w:w="80"/>
+              <w:right w:type="dxa" w:w="110"/>
+            </w:tcMar>
+          </w:tcPr>
+          <w:p>
+            <w:r>
+              <w:rPr>
+                <w:b w:val="false"/>
+                <w:bCs w:val="false"/>
+                <w:color w:val="222222"/>
+                <w:sz w:val="19"/>
+                <w:szCs w:val="19"/>
+              </w:rPr>
+              <w:t xml:space="preserve">What is FOMO?</w:t>
+            </w:r>
+          </w:p>
+        </w:tc>
+      </w:tr>
+      <w:tr>
+        <w:tc>
+          <w:tcPr>
+            <w:tcW w:type="dxa" w:w="2500"/>
+            <w:tcBorders>
+              <w:top w:val="single" w:color="F0C9A8" w:sz="4"/>
+              <w:left w:val="single" w:color="F0C9A8" w:sz="4"/>
+              <w:bottom w:val="single" w:color="F0C9A8" w:sz="4"/>
+              <w:right w:val="single" w:color="F0C9A8" w:sz="4"/>
+            </w:tcBorders>
+            <w:tcMar>
+              <w:top w:type="dxa" w:w="80"/>
+              <w:left w:type="dxa" w:w="110"/>
+              <w:bottom w:type="dxa" w:w="80"/>
+              <w:right w:type="dxa" w:w="110"/>
+            </w:tcMar>
+          </w:tcPr>
+          <w:p>
+            <w:r>
+              <w:rPr>
+                <w:b/>
+                <w:bCs/>
+                <w:color w:val="222222"/>
+                <w:sz w:val="19"/>
+                <w:szCs w:val="19"/>
+              </w:rPr>
               <w:t xml:space="preserve">The same trick, elsewhere</w:t>
             </w:r>
           </w:p>
@@ -6740,6 +7160,66 @@
                 <w:sz w:val="19"/>
                 <w:szCs w:val="19"/>
               </w:rPr>
+              <w:t xml:space="preserve">Card back, heading</w:t>
+            </w:r>
+          </w:p>
+        </w:tc>
+        <w:tc>
+          <w:tcPr>
+            <w:tcW w:type="dxa" w:w="6526"/>
+            <w:tcBorders>
+              <w:top w:val="single" w:color="F0C9A8" w:sz="4"/>
+              <w:left w:val="single" w:color="F0C9A8" w:sz="4"/>
+              <w:bottom w:val="single" w:color="F0C9A8" w:sz="4"/>
+              <w:right w:val="single" w:color="F0C9A8" w:sz="4"/>
+            </w:tcBorders>
+            <w:tcMar>
+              <w:top w:type="dxa" w:w="80"/>
+              <w:left w:type="dxa" w:w="110"/>
+              <w:bottom w:type="dxa" w:w="80"/>
+              <w:right w:type="dxa" w:w="110"/>
+            </w:tcMar>
+          </w:tcPr>
+          <w:p>
+            <w:r>
+              <w:rPr>
+                <w:b w:val="false"/>
+                <w:bCs w:val="false"/>
+                <w:color w:val="222222"/>
+                <w:sz w:val="19"/>
+                <w:szCs w:val="19"/>
+              </w:rPr>
+              <w:t xml:space="preserve">What is the Framing Effect?</w:t>
+            </w:r>
+          </w:p>
+        </w:tc>
+      </w:tr>
+      <w:tr>
+        <w:tc>
+          <w:tcPr>
+            <w:tcW w:type="dxa" w:w="2500"/>
+            <w:tcBorders>
+              <w:top w:val="single" w:color="F0C9A8" w:sz="4"/>
+              <w:left w:val="single" w:color="F0C9A8" w:sz="4"/>
+              <w:bottom w:val="single" w:color="F0C9A8" w:sz="4"/>
+              <w:right w:val="single" w:color="F0C9A8" w:sz="4"/>
+            </w:tcBorders>
+            <w:tcMar>
+              <w:top w:type="dxa" w:w="80"/>
+              <w:left w:type="dxa" w:w="110"/>
+              <w:bottom w:type="dxa" w:w="80"/>
+              <w:right w:type="dxa" w:w="110"/>
+            </w:tcMar>
+          </w:tcPr>
+          <w:p>
+            <w:r>
+              <w:rPr>
+                <w:b/>
+                <w:bCs/>
+                <w:color w:val="222222"/>
+                <w:sz w:val="19"/>
+                <w:szCs w:val="19"/>
+              </w:rPr>
               <w:t xml:space="preserve">The same trick, elsewhere</w:t>
             </w:r>
           </w:p>
@@ -7591,6 +8071,66 @@
                 <w:sz w:val="19"/>
                 <w:szCs w:val="19"/>
               </w:rPr>
+              <w:t xml:space="preserve">Seal, top arc</w:t>
+            </w:r>
+          </w:p>
+        </w:tc>
+        <w:tc>
+          <w:tcPr>
+            <w:tcW w:type="dxa" w:w="6526"/>
+            <w:tcBorders>
+              <w:top w:val="single" w:color="F0C9A8" w:sz="4"/>
+              <w:left w:val="single" w:color="F0C9A8" w:sz="4"/>
+              <w:bottom w:val="single" w:color="F0C9A8" w:sz="4"/>
+              <w:right w:val="single" w:color="F0C9A8" w:sz="4"/>
+            </w:tcBorders>
+            <w:tcMar>
+              <w:top w:type="dxa" w:w="80"/>
+              <w:left w:type="dxa" w:w="110"/>
+              <w:bottom w:type="dxa" w:w="80"/>
+              <w:right w:type="dxa" w:w="110"/>
+            </w:tcMar>
+          </w:tcPr>
+          <w:p>
+            <w:r>
+              <w:rPr>
+                <w:b w:val="false"/>
+                <w:bCs w:val="false"/>
+                <w:color w:val="222222"/>
+                <w:sz w:val="19"/>
+                <w:szCs w:val="19"/>
+              </w:rPr>
+              <w:t xml:space="preserve">THE SWEET PICK</w:t>
+            </w:r>
+          </w:p>
+        </w:tc>
+      </w:tr>
+      <w:tr>
+        <w:tc>
+          <w:tcPr>
+            <w:tcW w:type="dxa" w:w="2500"/>
+            <w:tcBorders>
+              <w:top w:val="single" w:color="F0C9A8" w:sz="4"/>
+              <w:left w:val="single" w:color="F0C9A8" w:sz="4"/>
+              <w:bottom w:val="single" w:color="F0C9A8" w:sz="4"/>
+              <w:right w:val="single" w:color="F0C9A8" w:sz="4"/>
+            </w:tcBorders>
+            <w:tcMar>
+              <w:top w:type="dxa" w:w="80"/>
+              <w:left w:type="dxa" w:w="110"/>
+              <w:bottom w:type="dxa" w:w="80"/>
+              <w:right w:type="dxa" w:w="110"/>
+            </w:tcMar>
+          </w:tcPr>
+          <w:p>
+            <w:r>
+              <w:rPr>
+                <w:b/>
+                <w:bCs/>
+                <w:color w:val="222222"/>
+                <w:sz w:val="19"/>
+                <w:szCs w:val="19"/>
+              </w:rPr>
               <w:t xml:space="preserve">Seal, bottom arc</w:t>
             </w:r>
           </w:p>
@@ -7980,7 +8520,7 @@
                 <w:sz w:val="19"/>
                 <w:szCs w:val="19"/>
               </w:rPr>
-              <w:t xml:space="preserve">Your festive greeting card from The Sweet Pick</w:t>
+              <w:t xml:space="preserve">Your result card: {Tag}, {N} of 5 mindful picks</w:t>
             </w:r>
           </w:p>
         </w:tc>
@@ -8737,6 +9277,126 @@
                 <w:sz w:val="19"/>
                 <w:szCs w:val="19"/>
               </w:rPr>
+              <w:t xml:space="preserve">Top left</w:t>
+            </w:r>
+          </w:p>
+        </w:tc>
+        <w:tc>
+          <w:tcPr>
+            <w:tcW w:type="dxa" w:w="6526"/>
+            <w:tcBorders>
+              <w:top w:val="single" w:color="F0C9A8" w:sz="4"/>
+              <w:left w:val="single" w:color="F0C9A8" w:sz="4"/>
+              <w:bottom w:val="single" w:color="F0C9A8" w:sz="4"/>
+              <w:right w:val="single" w:color="F0C9A8" w:sz="4"/>
+            </w:tcBorders>
+            <w:tcMar>
+              <w:top w:type="dxa" w:w="80"/>
+              <w:left w:type="dxa" w:w="110"/>
+              <w:bottom w:type="dxa" w:w="80"/>
+              <w:right w:type="dxa" w:w="110"/>
+            </w:tcMar>
+          </w:tcPr>
+          <w:p>
+            <w:r>
+              <w:rPr>
+                <w:b w:val="false"/>
+                <w:bCs w:val="false"/>
+                <w:color w:val="222222"/>
+                <w:sz w:val="19"/>
+                <w:szCs w:val="19"/>
+              </w:rPr>
+              <w:t xml:space="preserve">ICICI Bank logo</w:t>
+            </w:r>
+          </w:p>
+        </w:tc>
+      </w:tr>
+      <w:tr>
+        <w:tc>
+          <w:tcPr>
+            <w:tcW w:type="dxa" w:w="2500"/>
+            <w:tcBorders>
+              <w:top w:val="single" w:color="F0C9A8" w:sz="4"/>
+              <w:left w:val="single" w:color="F0C9A8" w:sz="4"/>
+              <w:bottom w:val="single" w:color="F0C9A8" w:sz="4"/>
+              <w:right w:val="single" w:color="F0C9A8" w:sz="4"/>
+            </w:tcBorders>
+            <w:tcMar>
+              <w:top w:type="dxa" w:w="80"/>
+              <w:left w:type="dxa" w:w="110"/>
+              <w:bottom w:type="dxa" w:w="80"/>
+              <w:right w:type="dxa" w:w="110"/>
+            </w:tcMar>
+          </w:tcPr>
+          <w:p>
+            <w:r>
+              <w:rPr>
+                <w:b/>
+                <w:bCs/>
+                <w:color w:val="222222"/>
+                <w:sz w:val="19"/>
+                <w:szCs w:val="19"/>
+              </w:rPr>
+              <w:t xml:space="preserve">Top right</w:t>
+            </w:r>
+          </w:p>
+        </w:tc>
+        <w:tc>
+          <w:tcPr>
+            <w:tcW w:type="dxa" w:w="6526"/>
+            <w:tcBorders>
+              <w:top w:val="single" w:color="F0C9A8" w:sz="4"/>
+              <w:left w:val="single" w:color="F0C9A8" w:sz="4"/>
+              <w:bottom w:val="single" w:color="F0C9A8" w:sz="4"/>
+              <w:right w:val="single" w:color="F0C9A8" w:sz="4"/>
+            </w:tcBorders>
+            <w:tcMar>
+              <w:top w:type="dxa" w:w="80"/>
+              <w:left w:type="dxa" w:w="110"/>
+              <w:bottom w:type="dxa" w:w="80"/>
+              <w:right w:type="dxa" w:w="110"/>
+            </w:tcMar>
+          </w:tcPr>
+          <w:p>
+            <w:r>
+              <w:rPr>
+                <w:b w:val="false"/>
+                <w:bCs w:val="false"/>
+                <w:color w:val="222222"/>
+                <w:sz w:val="19"/>
+                <w:szCs w:val="19"/>
+              </w:rPr>
+              <w:t xml:space="preserve">THE / ORANGE BOOK (the lockup, set as on the title screen)</w:t>
+            </w:r>
+          </w:p>
+        </w:tc>
+      </w:tr>
+      <w:tr>
+        <w:tc>
+          <w:tcPr>
+            <w:tcW w:type="dxa" w:w="2500"/>
+            <w:tcBorders>
+              <w:top w:val="single" w:color="F0C9A8" w:sz="4"/>
+              <w:left w:val="single" w:color="F0C9A8" w:sz="4"/>
+              <w:bottom w:val="single" w:color="F0C9A8" w:sz="4"/>
+              <w:right w:val="single" w:color="F0C9A8" w:sz="4"/>
+            </w:tcBorders>
+            <w:tcMar>
+              <w:top w:type="dxa" w:w="80"/>
+              <w:left w:type="dxa" w:w="110"/>
+              <w:bottom w:type="dxa" w:w="80"/>
+              <w:right w:type="dxa" w:w="110"/>
+            </w:tcMar>
+          </w:tcPr>
+          <w:p>
+            <w:r>
+              <w:rPr>
+                <w:b/>
+                <w:bCs/>
+                <w:color w:val="222222"/>
+                <w:sz w:val="19"/>
+                <w:szCs w:val="19"/>
+              </w:rPr>
               <w:t xml:space="preserve">Wish (the card’s only line)</w:t>
             </w:r>
           </w:p>
@@ -8797,96 +9457,36 @@
                 <w:sz w:val="19"/>
                 <w:szCs w:val="19"/>
               </w:rPr>
-              <w:t xml:space="preserve">Footer, wordmark</w:t>
-            </w:r>
-          </w:p>
-        </w:tc>
-        <w:tc>
-          <w:tcPr>
-            <w:tcW w:type="dxa" w:w="6526"/>
-            <w:tcBorders>
-              <w:top w:val="single" w:color="F0C9A8" w:sz="4"/>
-              <w:left w:val="single" w:color="F0C9A8" w:sz="4"/>
-              <w:bottom w:val="single" w:color="F0C9A8" w:sz="4"/>
-              <w:right w:val="single" w:color="F0C9A8" w:sz="4"/>
-            </w:tcBorders>
-            <w:tcMar>
-              <w:top w:type="dxa" w:w="80"/>
-              <w:left w:type="dxa" w:w="110"/>
-              <w:bottom w:type="dxa" w:w="80"/>
-              <w:right w:type="dxa" w:w="110"/>
-            </w:tcMar>
-          </w:tcPr>
-          <w:p>
-            <w:r>
-              <w:rPr>
-                <w:b w:val="false"/>
-                <w:bCs w:val="false"/>
-                <w:color w:val="222222"/>
-                <w:sz w:val="19"/>
-                <w:szCs w:val="19"/>
-              </w:rPr>
-              <w:t xml:space="preserve">THE / ORANGE BOOK (set as on the cover)</w:t>
-            </w:r>
-          </w:p>
-        </w:tc>
-      </w:tr>
-      <w:tr>
-        <w:tc>
-          <w:tcPr>
-            <w:tcW w:type="dxa" w:w="2500"/>
-            <w:tcBorders>
-              <w:top w:val="single" w:color="F0C9A8" w:sz="4"/>
-              <w:left w:val="single" w:color="F0C9A8" w:sz="4"/>
-              <w:bottom w:val="single" w:color="F0C9A8" w:sz="4"/>
-              <w:right w:val="single" w:color="F0C9A8" w:sz="4"/>
-            </w:tcBorders>
-            <w:tcMar>
-              <w:top w:type="dxa" w:w="80"/>
-              <w:left w:type="dxa" w:w="110"/>
-              <w:bottom w:type="dxa" w:w="80"/>
-              <w:right w:type="dxa" w:w="110"/>
-            </w:tcMar>
-          </w:tcPr>
-          <w:p>
-            <w:r>
-              <w:rPr>
-                <w:b/>
-                <w:bCs/>
-                <w:color w:val="222222"/>
-                <w:sz w:val="19"/>
-                <w:szCs w:val="19"/>
-              </w:rPr>
-              <w:t xml:space="preserve">Footer, line under it</w:t>
-            </w:r>
-          </w:p>
-        </w:tc>
-        <w:tc>
-          <w:tcPr>
-            <w:tcW w:type="dxa" w:w="6526"/>
-            <w:tcBorders>
-              <w:top w:val="single" w:color="F0C9A8" w:sz="4"/>
-              <w:left w:val="single" w:color="F0C9A8" w:sz="4"/>
-              <w:bottom w:val="single" w:color="F0C9A8" w:sz="4"/>
-              <w:right w:val="single" w:color="F0C9A8" w:sz="4"/>
-            </w:tcBorders>
-            <w:tcMar>
-              <w:top w:type="dxa" w:w="80"/>
-              <w:left w:type="dxa" w:w="110"/>
-              <w:bottom w:type="dxa" w:w="80"/>
-              <w:right w:type="dxa" w:w="110"/>
-            </w:tcMar>
-          </w:tcPr>
-          <w:p>
-            <w:r>
-              <w:rPr>
-                <w:b w:val="false"/>
-                <w:bCs w:val="false"/>
-                <w:color w:val="222222"/>
-                <w:sz w:val="19"/>
-                <w:szCs w:val="19"/>
-              </w:rPr>
-              <w:t xml:space="preserve">Vol. 65 · ICICI Bank</w:t>
+              <w:t xml:space="preserve">Illustration</w:t>
+            </w:r>
+          </w:p>
+        </w:tc>
+        <w:tc>
+          <w:tcPr>
+            <w:tcW w:type="dxa" w:w="6526"/>
+            <w:tcBorders>
+              <w:top w:val="single" w:color="F0C9A8" w:sz="4"/>
+              <w:left w:val="single" w:color="F0C9A8" w:sz="4"/>
+              <w:bottom w:val="single" w:color="F0C9A8" w:sz="4"/>
+              <w:right w:val="single" w:color="F0C9A8" w:sz="4"/>
+            </w:tcBorders>
+            <w:tcMar>
+              <w:top w:type="dxa" w:w="80"/>
+              <w:left w:type="dxa" w:w="110"/>
+              <w:bottom w:type="dxa" w:w="80"/>
+              <w:right w:type="dxa" w:w="110"/>
+            </w:tcMar>
+          </w:tcPr>
+          <w:p>
+            <w:r>
+              <w:rPr>
+                <w:b w:val="false"/>
+                <w:bCs w:val="false"/>
+                <w:color w:val="222222"/>
+                <w:sz w:val="19"/>
+                <w:szCs w:val="19"/>
+              </w:rPr>
+              <w:t xml:space="preserve">The open mithai box from the title screen, lid set beside it</w:t>
             </w:r>
           </w:p>
         </w:tc>
@@ -9189,7 +9789,7 @@
           <w:sz w:val="20"/>
           <w:szCs w:val="20"/>
         </w:rPr>
-        <w:t xml:space="preserve">The feedback page is gone; the Feedback button on the last page opens a small rating card instead. The edition’s disclaimer, which lived on that page, now closes the last page.</w:t>
+        <w:t xml:space="preserve">The Feedback button on the last page opens a small rating card over the page. The edition’s disclaimer closes the last page.</w:t>
       </w:r>
     </w:p>
     <w:tbl>

</xml_diff>

<commit_message>
The card wish grows a word, every seal takes maroon ink, and the round buttons sit left again
The greeting on the shareable card now reads "Wishing you a festive
season full of sweet & mindful choices". The copy deck, in both its
markdown and .docx forms, carries the new line.

The Mithai Master seal no longer switches to gold ink for a clean
sweep: all three personality stamps use the same cream-and-maroon
seal as Sweet Spotter. The gold paper gradient, its rules and the
stamp's gold flag go with it.

The centring meant for Play again and Feedback on the last page had
leaked onto the round page. It is now scoped to the last page, so
Next Pick and Pick again sit at the left as before.

Co-Authored-By: Claude Fable 5.1 <noreply@anthropic.com>
Claude-Session: https://claude.ai/code/session_012sQsmGULLFzjfa9SrQhDjc
</commit_message>
<xml_diff>
--- a/content/The-Sweet-Pick-Copy.docx
+++ b/content/The-Sweet-Pick-Copy.docx
@@ -8220,7 +8220,7 @@
                 <w:sz w:val="19"/>
                 <w:szCs w:val="19"/>
               </w:rPr>
-              <w:t xml:space="preserve">{Tag} (gold ink for 5 of 5)</w:t>
+              <w:t xml:space="preserve">{Tag}</w:t>
             </w:r>
           </w:p>
         </w:tc>
@@ -9426,7 +9426,7 @@
                 <w:sz w:val="19"/>
                 <w:szCs w:val="19"/>
               </w:rPr>
-              <w:t xml:space="preserve">Wishing you a festive season full of sweet choices</w:t>
+              <w:t xml:space="preserve">Wishing you a festive season full of sweet &amp; mindful choices</w:t>
             </w:r>
           </w:p>
         </w:tc>

</xml_diff>

<commit_message>
The pick pages say in words that the cards are mithai boxes
The pictures said mithai everywhere and the copy never did. Two
touches now: the second how-to step reads "Compare the three mithai
boxes on the cards, then make your Sweet Pick", and the ticket stub
on every pick reads "You plan to spend around ₹500 on a mithai box",
set as label, amount and a closing line. The deck carries both.

Co-Authored-By: Claude Fable 5.1 <noreply@anthropic.com>
Claude-Session: https://claude.ai/code/session_012sQsmGULLFzjfa9SrQhDjc
</commit_message>
<xml_diff>
--- a/content/The-Sweet-Pick-Copy.docx
+++ b/content/The-Sweet-Pick-Copy.docx
@@ -1219,7 +1219,7 @@
                 <w:sz w:val="19"/>
                 <w:szCs w:val="19"/>
               </w:rPr>
-              <w:t xml:space="preserve">You plan to spend around ₹500</w:t>
+              <w:t xml:space="preserve">You plan to spend around ₹500 on a mithai box (set as label, amount, then "on a mithai box")</w:t>
             </w:r>
           </w:p>
         </w:tc>
@@ -1868,7 +1868,7 @@
           <w:sz w:val="20"/>
           <w:szCs w:val="20"/>
         </w:rPr>
-        <w:t xml:space="preserve">Compare the three cards, then make your Sweet Pick.</w:t>
+        <w:t xml:space="preserve">Compare the three mithai boxes on the cards, then make your Sweet Pick.</w:t>
       </w:r>
     </w:p>
     <w:p>

</xml_diff>

<commit_message>
Every card is named a Mithai Box, and the first deal fits its names properly
The eleven cards that said only "Box" now say "Mithai Box", as pick
3's already did: Classic, Celebration and Premium Mithai Box on
picks 1 and 4, Small, Medium and Large Mithai Box on pick 2, Mithai
Box A and B on pick 5. The card backs are unchanged. The deck's card
tables carry the new names.

The names are fitted to the card once more a frame after the round
is shown. On the first pick the page has only just appeared and the
fit measured before layout had settled, so the longer names were
left at full size, a pixel off the rule. Later picks were unaffected.

Co-Authored-By: Claude Fable 5.1 <noreply@anthropic.com>
Claude-Session: https://claude.ai/code/session_012sQsmGULLFzjfa9SrQhDjc
</commit_message>
<xml_diff>
--- a/content/The-Sweet-Pick-Copy.docx
+++ b/content/The-Sweet-Pick-Copy.docx
@@ -2785,7 +2785,7 @@
                 <w:sz w:val="19"/>
                 <w:szCs w:val="19"/>
               </w:rPr>
-              <w:t xml:space="preserve">Classic Box</w:t>
+              <w:t xml:space="preserve">Classic Mithai Box</w:t>
             </w:r>
           </w:p>
         </w:tc>
@@ -2903,7 +2903,7 @@
                 <w:sz w:val="19"/>
                 <w:szCs w:val="19"/>
               </w:rPr>
-              <w:t xml:space="preserve">Celebration Box</w:t>
+              <w:t xml:space="preserve">Celebration Mithai Box</w:t>
             </w:r>
           </w:p>
         </w:tc>
@@ -3021,7 +3021,7 @@
                 <w:sz w:val="19"/>
                 <w:szCs w:val="19"/>
               </w:rPr>
-              <w:t xml:space="preserve">Premium Box</w:t>
+              <w:t xml:space="preserve">Premium Mithai Box</w:t>
             </w:r>
           </w:p>
         </w:tc>
@@ -3994,7 +3994,7 @@
                 <w:sz w:val="19"/>
                 <w:szCs w:val="19"/>
               </w:rPr>
-              <w:t xml:space="preserve">Small Box</w:t>
+              <w:t xml:space="preserve">Small Mithai Box</w:t>
             </w:r>
           </w:p>
         </w:tc>
@@ -4112,7 +4112,7 @@
                 <w:sz w:val="19"/>
                 <w:szCs w:val="19"/>
               </w:rPr>
-              <w:t xml:space="preserve">Medium Box</w:t>
+              <w:t xml:space="preserve">Medium Mithai Box</w:t>
             </w:r>
           </w:p>
         </w:tc>
@@ -4230,7 +4230,7 @@
                 <w:sz w:val="19"/>
                 <w:szCs w:val="19"/>
               </w:rPr>
-              <w:t xml:space="preserve">Large Box</w:t>
+              <w:t xml:space="preserve">Large Mithai Box</w:t>
             </w:r>
           </w:p>
         </w:tc>
@@ -6412,7 +6412,7 @@
                 <w:sz w:val="19"/>
                 <w:szCs w:val="19"/>
               </w:rPr>
-              <w:t xml:space="preserve">Classic Box</w:t>
+              <w:t xml:space="preserve">Classic Mithai Box</w:t>
             </w:r>
           </w:p>
         </w:tc>
@@ -6530,7 +6530,7 @@
                 <w:sz w:val="19"/>
                 <w:szCs w:val="19"/>
               </w:rPr>
-              <w:t xml:space="preserve">Celebration Box</w:t>
+              <w:t xml:space="preserve">Celebration Mithai Box</w:t>
             </w:r>
           </w:p>
         </w:tc>
@@ -6648,7 +6648,7 @@
                 <w:sz w:val="19"/>
                 <w:szCs w:val="19"/>
               </w:rPr>
-              <w:t xml:space="preserve">Premium Box</w:t>
+              <w:t xml:space="preserve">Premium Mithai Box</w:t>
             </w:r>
           </w:p>
         </w:tc>
@@ -7621,7 +7621,7 @@
                 <w:sz w:val="19"/>
                 <w:szCs w:val="19"/>
               </w:rPr>
-              <w:t xml:space="preserve">Box A</w:t>
+              <w:t xml:space="preserve">Mithai Box A</w:t>
             </w:r>
           </w:p>
         </w:tc>
@@ -7739,7 +7739,7 @@
                 <w:sz w:val="19"/>
                 <w:szCs w:val="19"/>
               </w:rPr>
-              <w:t xml:space="preserve">Box B</w:t>
+              <w:t xml:space="preserve">Mithai Box B</w:t>
             </w:r>
           </w:p>
         </w:tc>

</xml_diff>